<commit_message>
Grobplanung Balladen: Lesetechniken in Woche 1, Herbstferien und Daten, Sportbezug nur wo passend
Co-Authored-By: Claude Opus 5.5 <noreply@anthropic.com>
Claude-Session: https://claude.ai/code/session_01KXvLXHMYPnCyEbMRgNaaYs
</commit_message>
<xml_diff>
--- a/Deutsch_7A/Balladen/Grobplanung_Balladen.docx
+++ b/Deutsch_7A/Balladen/Grobplanung_Balladen.docx
@@ -15,7 +15,7 @@
           <w:sz w:val="18"/>
           <w:szCs w:val="18"/>
         </w:rPr>
-        <w:t xml:space="preserve">GROBPLANUNG · DEUTSCH · KLASSE 7A · CA. 9 WOCHEN · 5 STUNDEN PRO WOCHE</w:t>
+        <w:t xml:space="preserve">GROBPLANUNG · DEUTSCH · KLASSE 7A · CA. 9 UNTERRICHTSWOCHEN · 5 STUNDEN PRO WOCHE · 43 STUNDEN</w:t>
       </w:r>
     </w:p>
     <w:p>
@@ -189,7 +189,7 @@
                 <w:sz w:val="19"/>
                 <w:szCs w:val="19"/>
               </w:rPr>
-              <w:t xml:space="preserve">Bewertung 1: Analyse der Merkmale (Std. 19) · Bewertung 2: Textüberarbeitung aus der Figurenperspektive (Std. 25) · Bewertung 3: Rezitation einer selbst gewählten Ballade (Std. 39–41)</w:t>
+              <w:t xml:space="preserve">Bewertung 1: Analyse der Merkmale (Std. 19, Woche 5) · Bewertung 2: Textüberarbeitung aus der Figurenperspektive (Std. 25, Woche 6) · Bewertung 3: Rezitation einer selbst gewählten Ballade (Std. 39–41, nach den Weihnachtsferien)</w:t>
             </w:r>
           </w:p>
         </w:tc>
@@ -261,7 +261,7 @@
                 <w:sz w:val="19"/>
                 <w:szCs w:val="19"/>
               </w:rPr>
-              <w:t xml:space="preserve">Jede Stunde nach AVIVA · Lernziel als „Ich kann …“ und Ablauf an der Tafel (Streichbares mit *) · alle Schüler in jeder Phase aktiv: erst allein oder zu zweit, dann Vergleich an der Tafel · am Ende „Heute habe ich gelernt, …“ · Bezüge zum Leistungssport, wo sie sich anbieten</w:t>
+              <w:t xml:space="preserve">Jede Stunde nach AVIVA · Lernziel als „Ich kann …“ und Ablauf an der Tafel (Streichbares mit *) · alle Schüler in jeder Phase aktiv: erst allein oder zu zweit, dann Vergleich an der Tafel · am Ende „Heute habe ich gelernt, …“ · Bezüge zum Leistungssport nur dort, wo sie sich anbieten</w:t>
             </w:r>
           </w:p>
         </w:tc>
@@ -301,7 +301,7 @@
                 <w:sz w:val="19"/>
                 <w:szCs w:val="19"/>
               </w:rPr>
-              <w:t xml:space="preserve">Noch offen</w:t>
+              <w:t xml:space="preserve">Termine / offen</w:t>
             </w:r>
           </w:p>
         </w:tc>
@@ -333,7 +333,7 @@
                 <w:sz w:val="19"/>
                 <w:szCs w:val="19"/>
               </w:rPr>
-              <w:t xml:space="preserve">KA 1 (Verben-Test) ist nicht eingeplant – Termin legt die Lehrkraft fest; ggf. Puffer nutzen und Woche 7 straffen. Ferien und Feiertage sind nicht berücksichtigt.</w:t>
+              <w:t xml:space="preserve">Herbstferien 16.10.–2.11. sind eingeplant (Woche 1: 4 Std., Woche 2: 4 Std., da 2.11. frei). Weihnachtsferien angenommen ab 21.12. – Woche 9 liegt danach, bitte prüfen. KA 1 (Verben-Test) ist noch nicht terminiert; dafür den Puffer nutzen.</w:t>
             </w:r>
           </w:p>
         </w:tc>
@@ -630,7 +630,7 @@
                 <w:sz w:val="21"/>
                 <w:szCs w:val="21"/>
               </w:rPr>
-              <w:t xml:space="preserve">Woche 1 · Was ist eine Ballade?</w:t>
+              <w:t xml:space="preserve">Woche 1 · 13.–15.10. · Was ist eine Ballade? – Lesetechniken</w:t>
             </w:r>
             <w:r>
               <w:rPr>
@@ -779,7 +779,7 @@
                 <w:sz w:val="19"/>
                 <w:szCs w:val="19"/>
               </w:rPr>
-              <w:t xml:space="preserve">Hörfassung „John Maynard“ (z. B. Achim Reichel). Hörauftrag für alle: Notizraster wer – wo – was passiert – wie endet es. Zweites Hören zu zweit ergänzen, dann Abgleich.</w:t>
+              <w:t xml:space="preserve">Hörfassung „John Maynard“ (z. B. Achim Reichel). Hörauftrag für alle: Notizraster wer – wo – was passiert – wie endet es. Zweites Hören: zu zweit ergänzen, dann Abgleich.</w:t>
             </w:r>
           </w:p>
         </w:tc>
@@ -919,7 +919,7 @@
                 <w:sz w:val="19"/>
                 <w:szCs w:val="19"/>
               </w:rPr>
-              <w:t xml:space="preserve">Eine Ballade gliedern</w:t>
+              <w:t xml:space="preserve">Lesetechniken</w:t>
             </w:r>
           </w:p>
         </w:tc>
@@ -953,7 +953,7 @@
                 <w:sz w:val="19"/>
                 <w:szCs w:val="19"/>
               </w:rPr>
-              <w:t xml:space="preserve">… eine Ballade in Abschnitte gliedern und Zwischenüberschriften formulieren.</w:t>
+              <w:t xml:space="preserve">… überfliegend, orientierend und genau lesen und die passende Technik zum Leseziel wählen.</w:t>
             </w:r>
           </w:p>
         </w:tc>
@@ -985,7 +985,7 @@
                 <w:sz w:val="19"/>
                 <w:szCs w:val="19"/>
               </w:rPr>
-              <w:t xml:space="preserve">Text lesen, in PA Abschnitte markieren und Zwischenüberschriften notieren; Vergleich an der Tafel (Streifen mit Überschriften ordnen – erst am Platz, dann Tafel).</w:t>
+              <w:t xml:space="preserve">Merksatz Lesetechniken (Wofür? Test). Drei Aufträge am Text, alle arbeiten allein mit Zeitvorgabe: überfliegen (Worum geht es? 1 Min.), orientieren (Wo steht …? Stelle finden), genau lesen mit Randnotizen; unbekannte Wörter aus dem Kontext erschließen. Vergleich in PA.</w:t>
             </w:r>
           </w:p>
         </w:tc>
@@ -1017,7 +1017,7 @@
                 <w:sz w:val="17"/>
                 <w:szCs w:val="17"/>
               </w:rPr>
-              <w:t xml:space="preserve">2.8 D</w:t>
+              <w:t xml:space="preserve">2.8 D/E · 2.12</w:t>
             </w:r>
           </w:p>
         </w:tc>
@@ -1125,7 +1125,7 @@
                 <w:sz w:val="19"/>
                 <w:szCs w:val="19"/>
               </w:rPr>
-              <w:t xml:space="preserve">Das „Ur-Ei“: episch, lyrisch, dramatisch</w:t>
+              <w:t xml:space="preserve">Eine Ballade gliedern</w:t>
             </w:r>
           </w:p>
         </w:tc>
@@ -1159,7 +1159,7 @@
                 <w:sz w:val="19"/>
                 <w:szCs w:val="19"/>
               </w:rPr>
-              <w:t xml:space="preserve">… an einer Ballade erzählende, lyrische und dramatische Elemente nachweisen.</w:t>
+              <w:t xml:space="preserve">… eine Ballade in Abschnitte gliedern und Zwischenüberschriften formulieren.</w:t>
             </w:r>
           </w:p>
         </w:tc>
@@ -1191,7 +1191,7 @@
                 <w:sz w:val="19"/>
                 <w:szCs w:val="19"/>
               </w:rPr>
-              <w:t xml:space="preserve">Merksatz Ballade (Goethe: „Ur-Ei“). Belegstellen in John Maynard in drei Farben markieren (allein), dann in PA vergleichen.</w:t>
+              <w:t xml:space="preserve">Genaues Lesen anwenden: in PA Abschnitte markieren und Zwischenüberschriften notieren; danach Vergleich an der Tafel.</w:t>
             </w:r>
           </w:p>
         </w:tc>
@@ -1223,7 +1223,7 @@
                 <w:sz w:val="17"/>
                 <w:szCs w:val="17"/>
               </w:rPr>
-              <w:t xml:space="preserve">2.9 D</w:t>
+              <w:t xml:space="preserve">2.8 D</w:t>
             </w:r>
           </w:p>
         </w:tc>
@@ -1331,7 +1331,7 @@
                 <w:sz w:val="19"/>
                 <w:szCs w:val="19"/>
               </w:rPr>
-              <w:t xml:space="preserve">Strophe, Vers, Reim</w:t>
+              <w:t xml:space="preserve">Das „Ur-Ei“: episch, lyrisch, dramatisch</w:t>
             </w:r>
           </w:p>
         </w:tc>
@@ -1365,7 +1365,7 @@
                 <w:sz w:val="19"/>
                 <w:szCs w:val="19"/>
               </w:rPr>
-              <w:t xml:space="preserve">… Strophe und Vers unterscheiden und Paarreim, Kreuzreim und umarmenden Reim bestimmen.</w:t>
+              <w:t xml:space="preserve">… an einer Ballade erzählende, lyrische und dramatische Elemente nachweisen.</w:t>
             </w:r>
           </w:p>
         </w:tc>
@@ -1397,7 +1397,7 @@
                 <w:sz w:val="19"/>
                 <w:szCs w:val="19"/>
               </w:rPr>
-              <w:t xml:space="preserve">Merksatz Reimformen; Reimschema an Strophen bestimmen (Schnipsel); Speed-Duell zu Reimformen.</w:t>
+              <w:t xml:space="preserve">Merksatz Ballade (Goethe: „Ur-Ei“). Belegstellen in John Maynard in drei Farben markieren (allein), dann in PA vergleichen.</w:t>
             </w:r>
           </w:p>
         </w:tc>
@@ -1482,7 +1482,7 @@
               <w:bottom w:val="single" w:color="B9C6E8" w:sz="6"/>
               <w:right w:val="single" w:color="B9C6E8" w:sz="6"/>
             </w:tcBorders>
-            <w:shd w:fill="1E2761" w:color="auto" w:val="clear"/>
+            <w:shd w:fill="9AA3B5" w:color="auto" w:val="clear"/>
             <w:tcMar>
               <w:top w:type="dxa" w:w="50"/>
               <w:left w:type="dxa" w:w="100"/>
@@ -1504,7 +1504,7 @@
                 <w:sz w:val="21"/>
                 <w:szCs w:val="21"/>
               </w:rPr>
-              <w:t xml:space="preserve">Woche 2 · Eine Ballade erschließen</w:t>
+              <w:t xml:space="preserve">Herbstferien 16.10.–2.11.</w:t>
             </w:r>
             <w:r>
               <w:rPr>
@@ -1513,7 +1513,7 @@
                 <w:sz w:val="18"/>
                 <w:szCs w:val="18"/>
               </w:rPr>
-              <w:t xml:space="preserve">   5 Stunden · John Maynard</w:t>
+              <w:t xml:space="preserve"/>
             </w:r>
           </w:p>
         </w:tc>
@@ -1524,202 +1524,46 @@
         </w:trPr>
         <w:tc>
           <w:tcPr>
-            <w:tcW w:type="dxa" w:w="700"/>
-            <w:tcBorders>
-              <w:top w:val="single" w:color="B9C6E8" w:sz="6"/>
-              <w:left w:val="single" w:color="B9C6E8" w:sz="6"/>
-              <w:bottom w:val="single" w:color="B9C6E8" w:sz="6"/>
-              <w:right w:val="single" w:color="B9C6E8" w:sz="6"/>
-            </w:tcBorders>
-            <w:shd w:fill="F4F7FD" w:color="auto" w:val="clear"/>
-            <w:tcMar>
-              <w:top w:type="dxa" w:w="50"/>
-              <w:left w:type="dxa" w:w="80"/>
-              <w:bottom w:type="dxa" w:w="50"/>
-              <w:right w:type="dxa" w:w="100"/>
-            </w:tcMar>
-            <w:vAlign w:val="top"/>
-          </w:tcPr>
-          <w:p>
-            <w:pPr>
-              <w:spacing w:after="0" w:before="0"/>
-            </w:pPr>
-            <w:r>
-              <w:rPr>
-                <w:rFonts w:ascii="Calibri" w:cs="Calibri" w:eastAsia="Calibri" w:hAnsi="Calibri"/>
-                <w:b/>
-                <w:bCs/>
-                <w:color w:val="D9534F"/>
-                <w:sz w:val="19"/>
-                <w:szCs w:val="19"/>
-              </w:rPr>
-              <w:t xml:space="preserve">5</w:t>
-            </w:r>
-          </w:p>
-        </w:tc>
-        <w:tc>
-          <w:tcPr>
-            <w:tcW w:type="dxa" w:w="2700"/>
-            <w:tcBorders>
-              <w:top w:val="single" w:color="B9C6E8" w:sz="6"/>
-              <w:left w:val="single" w:color="B9C6E8" w:sz="6"/>
-              <w:bottom w:val="single" w:color="B9C6E8" w:sz="6"/>
-              <w:right w:val="single" w:color="B9C6E8" w:sz="6"/>
-            </w:tcBorders>
-            <w:tcMar>
-              <w:top w:type="dxa" w:w="50"/>
-              <w:left w:type="dxa" w:w="80"/>
-              <w:bottom w:type="dxa" w:w="50"/>
-              <w:right w:type="dxa" w:w="100"/>
-            </w:tcMar>
-            <w:vAlign w:val="top"/>
-          </w:tcPr>
-          <w:p>
-            <w:pPr>
-              <w:spacing w:after="0" w:before="0"/>
-            </w:pPr>
-            <w:r>
-              <w:rPr>
-                <w:rFonts w:ascii="Calibri" w:cs="Calibri" w:eastAsia="Calibri" w:hAnsi="Calibri"/>
-                <w:b/>
-                <w:bCs/>
-                <w:color w:val="1E2761"/>
-                <w:sz w:val="19"/>
-                <w:szCs w:val="19"/>
-              </w:rPr>
-              <w:t xml:space="preserve">Unbekannte Wörter erschließen</w:t>
-            </w:r>
-          </w:p>
-        </w:tc>
-        <w:tc>
-          <w:tcPr>
-            <w:tcW w:type="dxa" w:w="3600"/>
-            <w:tcBorders>
-              <w:top w:val="single" w:color="B9C6E8" w:sz="6"/>
-              <w:left w:val="single" w:color="B9C6E8" w:sz="6"/>
-              <w:bottom w:val="single" w:color="B9C6E8" w:sz="6"/>
-              <w:right w:val="single" w:color="B9C6E8" w:sz="6"/>
-            </w:tcBorders>
-            <w:tcMar>
-              <w:top w:type="dxa" w:w="50"/>
-              <w:left w:type="dxa" w:w="80"/>
-              <w:bottom w:type="dxa" w:w="50"/>
-              <w:right w:type="dxa" w:w="100"/>
-            </w:tcMar>
-            <w:vAlign w:val="top"/>
-          </w:tcPr>
-          <w:p>
-            <w:pPr>
-              <w:spacing w:after="0" w:before="0"/>
-            </w:pPr>
-            <w:r>
-              <w:rPr>
-                <w:rFonts w:ascii="Calibri" w:cs="Calibri" w:eastAsia="Calibri" w:hAnsi="Calibri"/>
-                <w:i/>
-                <w:iCs/>
-                <w:color w:val="000000"/>
-                <w:sz w:val="19"/>
-                <w:szCs w:val="19"/>
-              </w:rPr>
-              <w:t xml:space="preserve">… unbekannte Wörter aus dem Kontext erschließen und Randnotizen anlegen.</w:t>
-            </w:r>
-          </w:p>
-        </w:tc>
-        <w:tc>
-          <w:tcPr>
-            <w:tcW w:type="dxa" w:w="5300"/>
-            <w:tcBorders>
-              <w:top w:val="single" w:color="B9C6E8" w:sz="6"/>
-              <w:left w:val="single" w:color="B9C6E8" w:sz="6"/>
-              <w:bottom w:val="single" w:color="B9C6E8" w:sz="6"/>
-              <w:right w:val="single" w:color="B9C6E8" w:sz="6"/>
-            </w:tcBorders>
-            <w:tcMar>
-              <w:top w:type="dxa" w:w="50"/>
-              <w:left w:type="dxa" w:w="80"/>
-              <w:bottom w:type="dxa" w:w="50"/>
-              <w:right w:type="dxa" w:w="100"/>
-            </w:tcMar>
-            <w:vAlign w:val="top"/>
-          </w:tcPr>
-          <w:p>
-            <w:pPr>
-              <w:spacing w:after="0" w:before="0"/>
-            </w:pPr>
-            <w:r>
-              <w:rPr>
-                <w:rFonts w:ascii="Calibri" w:cs="Calibri" w:eastAsia="Calibri" w:hAnsi="Calibri"/>
-                <w:color w:val="000000"/>
-                <w:sz w:val="19"/>
-                <w:szCs w:val="19"/>
-              </w:rPr>
-              <w:t xml:space="preserve">Wörter wie Steuermann, Bug, Qualm: erst aus dem Kontext raten, dann nachschlagen; Randnotizen-Technik einüben.</w:t>
-            </w:r>
-          </w:p>
-        </w:tc>
-        <w:tc>
-          <w:tcPr>
-            <w:tcW w:type="dxa" w:w="1238"/>
-            <w:tcBorders>
-              <w:top w:val="single" w:color="B9C6E8" w:sz="6"/>
-              <w:left w:val="single" w:color="B9C6E8" w:sz="6"/>
-              <w:bottom w:val="single" w:color="B9C6E8" w:sz="6"/>
-              <w:right w:val="single" w:color="B9C6E8" w:sz="6"/>
-            </w:tcBorders>
-            <w:tcMar>
-              <w:top w:type="dxa" w:w="50"/>
-              <w:left w:type="dxa" w:w="80"/>
-              <w:bottom w:type="dxa" w:w="50"/>
-              <w:right w:type="dxa" w:w="100"/>
-            </w:tcMar>
-            <w:vAlign w:val="top"/>
-          </w:tcPr>
-          <w:p>
-            <w:pPr>
-              <w:spacing w:after="0" w:before="0"/>
-            </w:pPr>
-            <w:r>
-              <w:rPr>
-                <w:rFonts w:ascii="Calibri" w:cs="Calibri" w:eastAsia="Calibri" w:hAnsi="Calibri"/>
-                <w:color w:val="5B6B8C"/>
-                <w:sz w:val="17"/>
-                <w:szCs w:val="17"/>
-              </w:rPr>
-              <w:t xml:space="preserve">2.8 E · 2.12</w:t>
-            </w:r>
-          </w:p>
-        </w:tc>
-        <w:tc>
-          <w:tcPr>
-            <w:tcW w:type="dxa" w:w="1900"/>
-            <w:tcBorders>
-              <w:top w:val="single" w:color="B9C6E8" w:sz="6"/>
-              <w:left w:val="single" w:color="B9C6E8" w:sz="6"/>
-              <w:bottom w:val="single" w:color="B9C6E8" w:sz="6"/>
-              <w:right w:val="single" w:color="B9C6E8" w:sz="6"/>
-            </w:tcBorders>
-            <w:tcMar>
-              <w:top w:type="dxa" w:w="50"/>
-              <w:left w:type="dxa" w:w="80"/>
-              <w:bottom w:type="dxa" w:w="50"/>
-              <w:right w:type="dxa" w:w="100"/>
-            </w:tcMar>
-            <w:vAlign w:val="top"/>
-          </w:tcPr>
-          <w:p>
-            <w:pPr>
-              <w:spacing w:after="0" w:before="0"/>
-            </w:pPr>
-            <w:r>
-              <w:rPr>
-                <w:rFonts w:ascii="Calibri" w:cs="Calibri" w:eastAsia="Calibri" w:hAnsi="Calibri"/>
-                <w:b/>
-                <w:bCs/>
-                <w:color w:val="C0392B"/>
-                <w:sz w:val="19"/>
-                <w:szCs w:val="19"/>
-              </w:rPr>
-              <w:t xml:space="preserve"/>
+            <w:tcW w:type="dxa" w:w="15438"/>
+            <w:gridSpan w:val="6"/>
+            <w:tcBorders>
+              <w:top w:val="single" w:color="B9C6E8" w:sz="6"/>
+              <w:left w:val="single" w:color="B9C6E8" w:sz="6"/>
+              <w:bottom w:val="single" w:color="B9C6E8" w:sz="6"/>
+              <w:right w:val="single" w:color="B9C6E8" w:sz="6"/>
+            </w:tcBorders>
+            <w:shd w:fill="1E2761" w:color="auto" w:val="clear"/>
+            <w:tcMar>
+              <w:top w:type="dxa" w:w="50"/>
+              <w:left w:type="dxa" w:w="100"/>
+              <w:bottom w:type="dxa" w:w="50"/>
+              <w:right w:type="dxa" w:w="100"/>
+            </w:tcMar>
+            <w:vAlign w:val="center"/>
+          </w:tcPr>
+          <w:p>
+            <w:pPr>
+              <w:spacing w:after="0" w:before="0"/>
+            </w:pPr>
+            <w:r>
+              <w:rPr>
+                <w:rFonts w:ascii="Cambria" w:cs="Cambria" w:eastAsia="Cambria" w:hAnsi="Cambria"/>
+                <w:b/>
+                <w:bCs/>
+                <w:color w:val="FFFFFF"/>
+                <w:sz w:val="21"/>
+                <w:szCs w:val="21"/>
+              </w:rPr>
+              <w:t xml:space="preserve">Woche 2 · 3.–6.11. · Eine Ballade erschließen</w:t>
+            </w:r>
+            <w:r>
+              <w:rPr>
+                <w:rFonts w:ascii="Calibri" w:cs="Calibri" w:eastAsia="Calibri" w:hAnsi="Calibri"/>
+                <w:color w:val="DCE3F2"/>
+                <w:sz w:val="18"/>
+                <w:szCs w:val="18"/>
+              </w:rPr>
+              <w:t xml:space="preserve">   4 Stunden · John Maynard</w:t>
             </w:r>
           </w:p>
         </w:tc>
@@ -1759,7 +1603,7 @@
                 <w:sz w:val="19"/>
                 <w:szCs w:val="19"/>
               </w:rPr>
-              <w:t xml:space="preserve">6</w:t>
+              <w:t xml:space="preserve">5</w:t>
             </w:r>
           </w:p>
         </w:tc>
@@ -1793,7 +1637,7 @@
                 <w:sz w:val="19"/>
                 <w:szCs w:val="19"/>
               </w:rPr>
-              <w:t xml:space="preserve">Der Spannungsbogen</w:t>
+              <w:t xml:space="preserve">Strophe, Vers, Reim</w:t>
             </w:r>
           </w:p>
         </w:tc>
@@ -1827,7 +1671,7 @@
                 <w:sz w:val="19"/>
                 <w:szCs w:val="19"/>
               </w:rPr>
-              <w:t xml:space="preserve">… den Handlungsverlauf einer Ballade als Spannungskurve darstellen und begründen.</w:t>
+              <w:t xml:space="preserve">… Strophe und Vers unterscheiden und Paarreim, Kreuzreim und umarmenden Reim bestimmen.</w:t>
             </w:r>
           </w:p>
         </w:tc>
@@ -1859,7 +1703,7 @@
                 <w:sz w:val="19"/>
                 <w:szCs w:val="19"/>
               </w:rPr>
-              <w:t xml:space="preserve">Spannungskurve zeichnen (allein), Höhepunkt mit Textstelle belegen; Vergleich in PA. Vergleich mit dem Spielverlauf eines knappen Wettkampfs.</w:t>
+              <w:t xml:space="preserve">Einstieg nach den Ferien: Wiederholung Lesetechniken und Ur-Ei. Merksatz Reimformen; Reimschema an Strophen bestimmen (Schnipsel); Speed-Duell zu Reimformen.</w:t>
             </w:r>
           </w:p>
         </w:tc>
@@ -1891,7 +1735,7 @@
                 <w:sz w:val="17"/>
                 <w:szCs w:val="17"/>
               </w:rPr>
-              <w:t xml:space="preserve">2.8 E · 2.9 F</w:t>
+              <w:t xml:space="preserve">2.9 D</w:t>
             </w:r>
           </w:p>
         </w:tc>
@@ -1965,7 +1809,7 @@
                 <w:sz w:val="19"/>
                 <w:szCs w:val="19"/>
               </w:rPr>
-              <w:t xml:space="preserve">7</w:t>
+              <w:t xml:space="preserve">6</w:t>
             </w:r>
           </w:p>
         </w:tc>
@@ -1999,7 +1843,7 @@
                 <w:sz w:val="19"/>
                 <w:szCs w:val="19"/>
               </w:rPr>
-              <w:t xml:space="preserve">Erzählzeit und erzählte Zeit</w:t>
+              <w:t xml:space="preserve">Der Spannungsbogen</w:t>
             </w:r>
           </w:p>
         </w:tc>
@@ -2033,7 +1877,7 @@
                 <w:sz w:val="19"/>
                 <w:szCs w:val="19"/>
               </w:rPr>
-              <w:t xml:space="preserve">… Erzählzeit und erzählte Zeit unterscheiden und ihre Wirkung erklären.</w:t>
+              <w:t xml:space="preserve">… den Handlungsverlauf einer Ballade als Spannungskurve darstellen und begründen.</w:t>
             </w:r>
           </w:p>
         </w:tc>
@@ -2065,7 +1909,7 @@
                 <w:sz w:val="19"/>
                 <w:szCs w:val="19"/>
               </w:rPr>
-              <w:t xml:space="preserve">Countdown „Noch zwanzig Minuten …“: Zeitangaben markieren, Zeitraffung/-dehnung erkennen, Wirkung auf die Spannung beschreiben.</w:t>
+              <w:t xml:space="preserve">Spannungskurve zeichnen (allein), Höhepunkt mit Textstelle belegen; Vergleich in PA.</w:t>
             </w:r>
           </w:p>
         </w:tc>
@@ -2097,7 +1941,7 @@
                 <w:sz w:val="17"/>
                 <w:szCs w:val="17"/>
               </w:rPr>
-              <w:t xml:space="preserve">2.9 F</w:t>
+              <w:t xml:space="preserve">2.8 E · 2.9 F</w:t>
             </w:r>
           </w:p>
         </w:tc>
@@ -2171,7 +2015,7 @@
                 <w:sz w:val="19"/>
                 <w:szCs w:val="19"/>
               </w:rPr>
-              <w:t xml:space="preserve">8</w:t>
+              <w:t xml:space="preserve">7</w:t>
             </w:r>
           </w:p>
         </w:tc>
@@ -2205,7 +2049,7 @@
                 <w:sz w:val="19"/>
                 <w:szCs w:val="19"/>
               </w:rPr>
-              <w:t xml:space="preserve">Fakten hinter der Ballade</w:t>
+              <w:t xml:space="preserve">Erzählzeit und erzählte Zeit</w:t>
             </w:r>
           </w:p>
         </w:tc>
@@ -2239,7 +2083,7 @@
                 <w:sz w:val="19"/>
                 <w:szCs w:val="19"/>
               </w:rPr>
-              <w:t xml:space="preserve">… einen Sachtext orientierend und genau lesen und Informationen auf Verlässlichkeit prüfen.</w:t>
+              <w:t xml:space="preserve">… Erzählzeit und erzählte Zeit unterscheiden und ihre Wirkung erklären.</w:t>
             </w:r>
           </w:p>
         </w:tc>
@@ -2271,7 +2115,7 @@
                 <w:sz w:val="19"/>
                 <w:szCs w:val="19"/>
               </w:rPr>
-              <w:t xml:space="preserve">Sachtext zum Unglück der „Erie“ (1841) und zu Fontane; Lesetechniken; zwei Quellen vergleichen: Was ist belegt, was erfunden?</w:t>
+              <w:t xml:space="preserve">Countdown „Noch zwanzig Minuten …“: Zeitangaben markieren, Zeitraffung und -dehnung erkennen, Wirkung auf die Spannung beschreiben.</w:t>
             </w:r>
           </w:p>
         </w:tc>
@@ -2303,7 +2147,7 @@
                 <w:sz w:val="17"/>
                 <w:szCs w:val="17"/>
               </w:rPr>
-              <w:t xml:space="preserve">2.8 D · 2.10 D/E</w:t>
+              <w:t xml:space="preserve">2.9 F</w:t>
             </w:r>
           </w:p>
         </w:tc>
@@ -2377,7 +2221,7 @@
                 <w:sz w:val="19"/>
                 <w:szCs w:val="19"/>
               </w:rPr>
-              <w:t xml:space="preserve">9</w:t>
+              <w:t xml:space="preserve">8</w:t>
             </w:r>
           </w:p>
         </w:tc>
@@ -2411,7 +2255,7 @@
                 <w:sz w:val="19"/>
                 <w:szCs w:val="19"/>
               </w:rPr>
-              <w:t xml:space="preserve">Ein Held? John Maynard</w:t>
+              <w:t xml:space="preserve">Fakten hinter der Ballade</w:t>
             </w:r>
           </w:p>
         </w:tc>
@@ -2445,7 +2289,7 @@
                 <w:sz w:val="19"/>
                 <w:szCs w:val="19"/>
               </w:rPr>
-              <w:t xml:space="preserve">… eine Figur beschreiben und meine Einschätzung am Text begründen.</w:t>
+              <w:t xml:space="preserve">… einen Sachtext mit der passenden Lesetechnik lesen und Informationen auf Verlässlichkeit prüfen.</w:t>
             </w:r>
           </w:p>
         </w:tc>
@@ -2477,7 +2321,7 @@
                 <w:sz w:val="19"/>
                 <w:szCs w:val="19"/>
               </w:rPr>
-              <w:t xml:space="preserve">Figurenbeschreibung mit Textbelegen; Positionslinie „Held oder Pflichterfüllung?“; Bezug Verantwortung im Team.</w:t>
+              <w:t xml:space="preserve">Sachtext zum Unglück der „Erie“ (1841) und zu Fontane; Lesetechniken gezielt wählen; zwei Quellen vergleichen: Was ist belegt, was erfunden?</w:t>
             </w:r>
           </w:p>
         </w:tc>
@@ -2509,7 +2353,7 @@
                 <w:sz w:val="17"/>
                 <w:szCs w:val="17"/>
               </w:rPr>
-              <w:t xml:space="preserve">2.8 D · 2.9 E</w:t>
+              <w:t xml:space="preserve">2.8 D/E · 2.10 D/E</w:t>
             </w:r>
           </w:p>
         </w:tc>
@@ -2584,7 +2428,7 @@
                 <w:sz w:val="21"/>
                 <w:szCs w:val="21"/>
               </w:rPr>
-              <w:t xml:space="preserve">Woche 3 · Figuren und Konflikte</w:t>
+              <w:t xml:space="preserve">Woche 3 · 9.–13.11. · Figuren und Konflikte</w:t>
             </w:r>
             <w:r>
               <w:rPr>
@@ -2593,7 +2437,7 @@
                 <w:sz w:val="18"/>
                 <w:szCs w:val="18"/>
               </w:rPr>
-              <w:t xml:space="preserve">   5 Stunden · Die Bürgschaft (Schiller)</w:t>
+              <w:t xml:space="preserve">   5 Stunden · John Maynard, Die Bürgschaft (Schiller)</w:t>
             </w:r>
           </w:p>
         </w:tc>
@@ -2633,7 +2477,7 @@
                 <w:sz w:val="19"/>
                 <w:szCs w:val="19"/>
               </w:rPr>
-              <w:t xml:space="preserve">10</w:t>
+              <w:t xml:space="preserve">9</w:t>
             </w:r>
           </w:p>
         </w:tc>
@@ -2667,7 +2511,7 @@
                 <w:sz w:val="19"/>
                 <w:szCs w:val="19"/>
               </w:rPr>
-              <w:t xml:space="preserve">Ein Konflikt beginnt</w:t>
+              <w:t xml:space="preserve">Ein Held? John Maynard</w:t>
             </w:r>
           </w:p>
         </w:tc>
@@ -2701,7 +2545,7 @@
                 <w:sz w:val="19"/>
                 <w:szCs w:val="19"/>
               </w:rPr>
-              <w:t xml:space="preserve">… den Ausgangskonflikt einer Ballade benennen und Vermutungen zum Verlauf begründen.</w:t>
+              <w:t xml:space="preserve">… eine Figur beschreiben und meine Einschätzung am Text begründen.</w:t>
             </w:r>
           </w:p>
         </w:tc>
@@ -2733,7 +2577,7 @@
                 <w:sz w:val="19"/>
                 <w:szCs w:val="19"/>
               </w:rPr>
-              <w:t xml:space="preserve">Strophen 1–7 lesen/hören; Konflikt Möros – Dionys herausarbeiten; Vermutungen schriftlich, dann Weiterlesen.</w:t>
+              <w:t xml:space="preserve">Figurenbeschreibung mit Textbelegen; Positionslinie „Held oder Pflichterfüllung?“</w:t>
             </w:r>
           </w:p>
         </w:tc>
@@ -2765,7 +2609,7 @@
                 <w:sz w:val="17"/>
                 <w:szCs w:val="17"/>
               </w:rPr>
-              <w:t xml:space="preserve">2.8 D · 2.9 F</w:t>
+              <w:t xml:space="preserve">2.8 D · 2.9 E</w:t>
             </w:r>
           </w:p>
         </w:tc>
@@ -2839,7 +2683,7 @@
                 <w:sz w:val="19"/>
                 <w:szCs w:val="19"/>
               </w:rPr>
-              <w:t xml:space="preserve">11</w:t>
+              <w:t xml:space="preserve">10</w:t>
             </w:r>
           </w:p>
         </w:tc>
@@ -2873,7 +2717,7 @@
                 <w:sz w:val="19"/>
                 <w:szCs w:val="19"/>
               </w:rPr>
-              <w:t xml:space="preserve">Ein Lauf gegen die Zeit</w:t>
+              <w:t xml:space="preserve">Ein Konflikt beginnt</w:t>
             </w:r>
           </w:p>
         </w:tc>
@@ -2907,7 +2751,7 @@
                 <w:sz w:val="19"/>
                 <w:szCs w:val="19"/>
               </w:rPr>
-              <w:t xml:space="preserve">… die Hindernisse der Handlung in einer Grafik darstellen.</w:t>
+              <w:t xml:space="preserve">… den Ausgangskonflikt einer Ballade benennen und Vermutungen zum Verlauf begründen.</w:t>
             </w:r>
           </w:p>
         </w:tc>
@@ -2939,7 +2783,7 @@
                 <w:sz w:val="19"/>
                 <w:szCs w:val="19"/>
               </w:rPr>
-              <w:t xml:space="preserve">Hindernisparcours als Grafik (Fluss, Räuber, Hitze); Parallele zum Ausdauerwettkampf: Was treibt Möros an?</w:t>
+              <w:t xml:space="preserve">Bürgschaft Strophen 1–7 lesen bzw. hören; Konflikt Möros – Dionys herausarbeiten; Vermutungen schriftlich, dann Weiterlesen.</w:t>
             </w:r>
           </w:p>
         </w:tc>
@@ -2971,7 +2815,7 @@
                 <w:sz w:val="17"/>
                 <w:szCs w:val="17"/>
               </w:rPr>
-              <w:t xml:space="preserve">2.8 E · 2.9 F</w:t>
+              <w:t xml:space="preserve">2.8 D · 2.9 F</w:t>
             </w:r>
           </w:p>
         </w:tc>
@@ -3045,7 +2889,7 @@
                 <w:sz w:val="19"/>
                 <w:szCs w:val="19"/>
               </w:rPr>
-              <w:t xml:space="preserve">12</w:t>
+              <w:t xml:space="preserve">11</w:t>
             </w:r>
           </w:p>
         </w:tc>
@@ -3079,7 +2923,7 @@
                 <w:sz w:val="19"/>
                 <w:szCs w:val="19"/>
               </w:rPr>
-              <w:t xml:space="preserve">Figurenkonstellation</w:t>
+              <w:t xml:space="preserve">Ein Lauf gegen die Zeit</w:t>
             </w:r>
           </w:p>
         </w:tc>
@@ -3113,7 +2957,7 @@
                 <w:sz w:val="19"/>
                 <w:szCs w:val="19"/>
               </w:rPr>
-              <w:t xml:space="preserve">… die Beziehungen der Figuren in einem Schaubild darstellen.</w:t>
+              <w:t xml:space="preserve">… die Hindernisse der Handlung in einer Grafik darstellen.</w:t>
             </w:r>
           </w:p>
         </w:tc>
@@ -3145,7 +2989,7 @@
                 <w:sz w:val="19"/>
                 <w:szCs w:val="19"/>
               </w:rPr>
-              <w:t xml:space="preserve">Schaubild (Dionys, Möros, Freund, Philostratus) allein, dann in PA ergänzen; Beziehungspfeile beschriften.</w:t>
+              <w:t xml:space="preserve">Hindernisse als Grafik (Fluss, Räuber, Hitze); Was treibt Möros an? (Bezug Ausdauer und Durchhalten bietet sich an.)</w:t>
             </w:r>
           </w:p>
         </w:tc>
@@ -3177,7 +3021,7 @@
                 <w:sz w:val="17"/>
                 <w:szCs w:val="17"/>
               </w:rPr>
-              <w:t xml:space="preserve">2.9 E</w:t>
+              <w:t xml:space="preserve">2.8 E · 2.9 F</w:t>
             </w:r>
           </w:p>
         </w:tc>
@@ -3251,7 +3095,7 @@
                 <w:sz w:val="19"/>
                 <w:szCs w:val="19"/>
               </w:rPr>
-              <w:t xml:space="preserve">13</w:t>
+              <w:t xml:space="preserve">12</w:t>
             </w:r>
           </w:p>
         </w:tc>
@@ -3285,7 +3129,7 @@
                 <w:sz w:val="19"/>
                 <w:szCs w:val="19"/>
               </w:rPr>
-              <w:t xml:space="preserve">Eine Figur verändert sich</w:t>
+              <w:t xml:space="preserve">Figurenkonstellation</w:t>
             </w:r>
           </w:p>
         </w:tc>
@@ -3319,7 +3163,7 @@
                 <w:sz w:val="19"/>
                 <w:szCs w:val="19"/>
               </w:rPr>
-              <w:t xml:space="preserve">… die Entwicklung einer Figur beschreiben und am Text belegen.</w:t>
+              <w:t xml:space="preserve">… die Beziehungen der Figuren in einem Schaubild darstellen.</w:t>
             </w:r>
           </w:p>
         </w:tc>
@@ -3351,7 +3195,7 @@
                 <w:sz w:val="19"/>
                 <w:szCs w:val="19"/>
               </w:rPr>
-              <w:t xml:space="preserve">Dionys am Anfang und am Ende: Zitate sammeln, Wandel begründen; einfache Zitiertechnik (Strophe/Vers).</w:t>
+              <w:t xml:space="preserve">Schaubild (Dionys, Möros, Freund, Philostratus) allein, dann in PA ergänzen; Beziehungspfeile beschriften.</w:t>
             </w:r>
           </w:p>
         </w:tc>
@@ -3383,7 +3227,7 @@
                 <w:sz w:val="17"/>
                 <w:szCs w:val="17"/>
               </w:rPr>
-              <w:t xml:space="preserve">2.9 E/F</w:t>
+              <w:t xml:space="preserve">2.9 E</w:t>
             </w:r>
           </w:p>
         </w:tc>
@@ -3457,7 +3301,7 @@
                 <w:sz w:val="19"/>
                 <w:szCs w:val="19"/>
               </w:rPr>
-              <w:t xml:space="preserve">14</w:t>
+              <w:t xml:space="preserve">13</w:t>
             </w:r>
           </w:p>
         </w:tc>
@@ -3491,7 +3335,7 @@
                 <w:sz w:val="19"/>
                 <w:szCs w:val="19"/>
               </w:rPr>
-              <w:t xml:space="preserve">Sprache und Wirkung</w:t>
+              <w:t xml:space="preserve">Eine Figur verändert sich</w:t>
             </w:r>
           </w:p>
         </w:tc>
@@ -3525,7 +3369,7 @@
                 <w:sz w:val="19"/>
                 <w:szCs w:val="19"/>
               </w:rPr>
-              <w:t xml:space="preserve">… sprachliche Mittel erkennen und ihre Wirkung fachsprachlich beschreiben.</w:t>
+              <w:t xml:space="preserve">… die Entwicklung einer Figur beschreiben und am Text belegen.</w:t>
             </w:r>
           </w:p>
         </w:tc>
@@ -3557,7 +3401,7 @@
                 <w:sz w:val="19"/>
                 <w:szCs w:val="19"/>
               </w:rPr>
-              <w:t xml:space="preserve">Wortwahl, Wiederholung, sprachliche Bilder in ausgewählten Strophen; Wirkung mit Formulierungshilfen beschreiben.</w:t>
+              <w:t xml:space="preserve">Dionys am Anfang und am Ende: Zitate sammeln, Wandel begründen; einfache Zitiertechnik (Strophe/Vers).</w:t>
             </w:r>
           </w:p>
         </w:tc>
@@ -3589,7 +3433,7 @@
                 <w:sz w:val="17"/>
                 <w:szCs w:val="17"/>
               </w:rPr>
-              <w:t xml:space="preserve">2.9 E</w:t>
+              <w:t xml:space="preserve">2.9 E/F</w:t>
             </w:r>
           </w:p>
         </w:tc>
@@ -3664,7 +3508,7 @@
                 <w:sz w:val="21"/>
                 <w:szCs w:val="21"/>
               </w:rPr>
-              <w:t xml:space="preserve">Woche 4 · Balladen analysieren</w:t>
+              <w:t xml:space="preserve">Woche 4 · 16.–20.11. · Balladen analysieren</w:t>
             </w:r>
             <w:r>
               <w:rPr>
@@ -3673,7 +3517,7 @@
                 <w:sz w:val="18"/>
                 <w:szCs w:val="18"/>
               </w:rPr>
-              <w:t xml:space="preserve">   5 Stunden · Der Handschuh (Schiller)</w:t>
+              <w:t xml:space="preserve">   5 Stunden · Die Bürgschaft, Der Handschuh (Schiller)</w:t>
             </w:r>
           </w:p>
         </w:tc>
@@ -3713,7 +3557,7 @@
                 <w:sz w:val="19"/>
                 <w:szCs w:val="19"/>
               </w:rPr>
-              <w:t xml:space="preserve">15</w:t>
+              <w:t xml:space="preserve">14</w:t>
             </w:r>
           </w:p>
         </w:tc>
@@ -3747,7 +3591,7 @@
                 <w:sz w:val="19"/>
                 <w:szCs w:val="19"/>
               </w:rPr>
-              <w:t xml:space="preserve">Der Handschuh</w:t>
+              <w:t xml:space="preserve">Sprache und Wirkung</w:t>
             </w:r>
           </w:p>
         </w:tc>
@@ -3781,7 +3625,7 @@
                 <w:sz w:val="19"/>
                 <w:szCs w:val="19"/>
               </w:rPr>
-              <w:t xml:space="preserve">… den Inhalt einer Ballade erfassen und gliedern (binnendifferenziert).</w:t>
+              <w:t xml:space="preserve">… sprachliche Mittel erkennen und ihre Wirkung fachsprachlich beschreiben.</w:t>
             </w:r>
           </w:p>
         </w:tc>
@@ -3813,7 +3657,7 @@
                 <w:sz w:val="19"/>
                 <w:szCs w:val="19"/>
               </w:rPr>
-              <w:t xml:space="preserve">Lesen mit gestuften Hilfen (Worterklärungen, Leitfragen); Gliederung mit Zwischenüberschriften.</w:t>
+              <w:t xml:space="preserve">Wortwahl, Wiederholung, sprachliche Bilder in ausgewählten Strophen der Bürgschaft; Wirkung mit Formulierungshilfen beschreiben.</w:t>
             </w:r>
           </w:p>
         </w:tc>
@@ -3845,7 +3689,7 @@
                 <w:sz w:val="17"/>
                 <w:szCs w:val="17"/>
               </w:rPr>
-              <w:t xml:space="preserve">2.8 D/E</w:t>
+              <w:t xml:space="preserve">2.9 E</w:t>
             </w:r>
           </w:p>
         </w:tc>
@@ -3919,7 +3763,7 @@
                 <w:sz w:val="19"/>
                 <w:szCs w:val="19"/>
               </w:rPr>
-              <w:t xml:space="preserve">16</w:t>
+              <w:t xml:space="preserve">15</w:t>
             </w:r>
           </w:p>
         </w:tc>
@@ -3953,7 +3797,7 @@
                 <w:sz w:val="19"/>
                 <w:szCs w:val="19"/>
               </w:rPr>
-              <w:t xml:space="preserve">Mutprobe oder Demütigung?</w:t>
+              <w:t xml:space="preserve">Der Handschuh</w:t>
             </w:r>
           </w:p>
         </w:tc>
@@ -3987,7 +3831,7 @@
                 <w:sz w:val="19"/>
                 <w:szCs w:val="19"/>
               </w:rPr>
-              <w:t xml:space="preserve">… das Verhalten zweier Figuren bewerten und meine Deutung am Text belegen.</w:t>
+              <w:t xml:space="preserve">… den Inhalt einer Ballade erfassen und gliedern (binnendifferenziert).</w:t>
             </w:r>
           </w:p>
         </w:tc>
@@ -4019,7 +3863,7 @@
                 <w:sz w:val="19"/>
                 <w:szCs w:val="19"/>
               </w:rPr>
-              <w:t xml:space="preserve">Kunigunde und Delorges: Positionen sammeln, mit Zitaten belegen; Bezug Mut, Risiko und Respekt.</w:t>
+              <w:t xml:space="preserve">Lesen mit gestuften Hilfen (Worterklärungen, Leitfragen); Gliederung mit Zwischenüberschriften.</w:t>
             </w:r>
           </w:p>
         </w:tc>
@@ -4051,7 +3895,7 @@
                 <w:sz w:val="17"/>
                 <w:szCs w:val="17"/>
               </w:rPr>
-              <w:t xml:space="preserve">2.9 E</w:t>
+              <w:t xml:space="preserve">2.8 D/E</w:t>
             </w:r>
           </w:p>
         </w:tc>
@@ -4125,7 +3969,7 @@
                 <w:sz w:val="19"/>
                 <w:szCs w:val="19"/>
               </w:rPr>
-              <w:t xml:space="preserve">17</w:t>
+              <w:t xml:space="preserve">16</w:t>
             </w:r>
           </w:p>
         </w:tc>
@@ -4159,7 +4003,7 @@
                 <w:sz w:val="19"/>
                 <w:szCs w:val="19"/>
               </w:rPr>
-              <w:t xml:space="preserve">Wie analysiere ich eine Ballade?</w:t>
+              <w:t xml:space="preserve">Mutprobe oder Demütigung?</w:t>
             </w:r>
           </w:p>
         </w:tc>
@@ -4193,7 +4037,7 @@
                 <w:sz w:val="19"/>
                 <w:szCs w:val="19"/>
               </w:rPr>
-              <w:t xml:space="preserve">… eine Ballade nach Inhalt, Form und Sprache untersuchen.</w:t>
+              <w:t xml:space="preserve">… das Verhalten zweier Figuren bewerten und meine Deutung am Text belegen.</w:t>
             </w:r>
           </w:p>
         </w:tc>
@@ -4225,7 +4069,7 @@
                 <w:sz w:val="19"/>
                 <w:szCs w:val="19"/>
               </w:rPr>
-              <w:t xml:space="preserve">Checkliste Inhalt – Form – Sprache gemeinsam erarbeiten; Musteranalyse einer Strophe; Formulierungshilfen.</w:t>
+              <w:t xml:space="preserve">Kunigunde und Delorges: Positionen sammeln und mit Zitaten belegen.</w:t>
             </w:r>
           </w:p>
         </w:tc>
@@ -4257,7 +4101,7 @@
                 <w:sz w:val="17"/>
                 <w:szCs w:val="17"/>
               </w:rPr>
-              <w:t xml:space="preserve">2.9 D/E</w:t>
+              <w:t xml:space="preserve">2.9 E</w:t>
             </w:r>
           </w:p>
         </w:tc>
@@ -4331,7 +4175,7 @@
                 <w:sz w:val="19"/>
                 <w:szCs w:val="19"/>
               </w:rPr>
-              <w:t xml:space="preserve">18</w:t>
+              <w:t xml:space="preserve">17</w:t>
             </w:r>
           </w:p>
         </w:tc>
@@ -4365,7 +4209,7 @@
                 <w:sz w:val="19"/>
                 <w:szCs w:val="19"/>
               </w:rPr>
-              <w:t xml:space="preserve">Analyse üben</w:t>
+              <w:t xml:space="preserve">Wie analysiere ich eine Ballade?</w:t>
             </w:r>
           </w:p>
         </w:tc>
@@ -4399,7 +4243,7 @@
                 <w:sz w:val="19"/>
                 <w:szCs w:val="19"/>
               </w:rPr>
-              <w:t xml:space="preserve">… eine Ballade mithilfe der Checkliste analysieren und überprüfen.</w:t>
+              <w:t xml:space="preserve">… eine Ballade nach Inhalt, Form und Sprache untersuchen.</w:t>
             </w:r>
           </w:p>
         </w:tc>
@@ -4431,7 +4275,7 @@
                 <w:sz w:val="19"/>
                 <w:szCs w:val="19"/>
               </w:rPr>
-              <w:t xml:space="preserve">Analyse allein schreiben, in PA mit Checkliste prüfen, mit Grün verbessern.</w:t>
+              <w:t xml:space="preserve">Checkliste Inhalt – Form – Sprache gemeinsam erarbeiten; Musteranalyse einer Strophe; Formulierungshilfen.</w:t>
             </w:r>
           </w:p>
         </w:tc>
@@ -4537,7 +4381,7 @@
                 <w:sz w:val="19"/>
                 <w:szCs w:val="19"/>
               </w:rPr>
-              <w:t xml:space="preserve">19</w:t>
+              <w:t xml:space="preserve">18</w:t>
             </w:r>
           </w:p>
         </w:tc>
@@ -4571,7 +4415,7 @@
                 <w:sz w:val="19"/>
                 <w:szCs w:val="19"/>
               </w:rPr>
-              <w:t xml:space="preserve">Leistung: Analyse</w:t>
+              <w:t xml:space="preserve">Analyse üben</w:t>
             </w:r>
           </w:p>
         </w:tc>
@@ -4605,7 +4449,7 @@
                 <w:sz w:val="19"/>
                 <w:szCs w:val="19"/>
               </w:rPr>
-              <w:t xml:space="preserve">… eine Ballade hinsichtlich ihrer Merkmale analysieren.</w:t>
+              <w:t xml:space="preserve">… eine Ballade mithilfe der Checkliste analysieren und überprüfen.</w:t>
             </w:r>
           </w:p>
         </w:tc>
@@ -4637,7 +4481,7 @@
                 <w:sz w:val="19"/>
                 <w:szCs w:val="19"/>
               </w:rPr>
-              <w:t xml:space="preserve">Schriftliche Analyse (behandelte Ballade oder kurze neue Strophenfolge).</w:t>
+              <w:t xml:space="preserve">Analyse allein schreiben, in PA mit Checkliste prüfen, mit Grün verbessern.</w:t>
             </w:r>
           </w:p>
         </w:tc>
@@ -4669,7 +4513,7 @@
                 <w:sz w:val="17"/>
                 <w:szCs w:val="17"/>
               </w:rPr>
-              <w:t xml:space="preserve">2.9</w:t>
+              <w:t xml:space="preserve">2.9 D/E</w:t>
             </w:r>
           </w:p>
         </w:tc>
@@ -4703,7 +4547,7 @@
                 <w:sz w:val="19"/>
                 <w:szCs w:val="19"/>
               </w:rPr>
-              <w:t xml:space="preserve">Bewertung 1: Analyse</w:t>
+              <w:t xml:space="preserve"/>
             </w:r>
           </w:p>
         </w:tc>
@@ -4744,7 +4588,7 @@
                 <w:sz w:val="21"/>
                 <w:szCs w:val="21"/>
               </w:rPr>
-              <w:t xml:space="preserve">Woche 5 · Aus der Sicht einer Figur schreiben</w:t>
+              <w:t xml:space="preserve">Woche 5 · 23.–27.11. · Aus der Sicht einer Figur schreiben</w:t>
             </w:r>
             <w:r>
               <w:rPr>
@@ -4793,7 +4637,7 @@
                 <w:sz w:val="19"/>
                 <w:szCs w:val="19"/>
               </w:rPr>
-              <w:t xml:space="preserve">20</w:t>
+              <w:t xml:space="preserve">19</w:t>
             </w:r>
           </w:p>
         </w:tc>
@@ -4827,7 +4671,7 @@
                 <w:sz w:val="19"/>
                 <w:szCs w:val="19"/>
               </w:rPr>
-              <w:t xml:space="preserve">Perspektive wechseln</w:t>
+              <w:t xml:space="preserve">Leistung: Analyse</w:t>
             </w:r>
           </w:p>
         </w:tc>
@@ -4861,7 +4705,7 @@
                 <w:sz w:val="19"/>
                 <w:szCs w:val="19"/>
               </w:rPr>
-              <w:t xml:space="preserve">… Erzähler und Figur unterscheiden und Gefühle einer Figur aus dem Text erschließen.</w:t>
+              <w:t xml:space="preserve">… eine Ballade hinsichtlich ihrer Merkmale analysieren.</w:t>
             </w:r>
           </w:p>
         </w:tc>
@@ -4893,7 +4737,7 @@
                 <w:sz w:val="19"/>
                 <w:szCs w:val="19"/>
               </w:rPr>
-              <w:t xml:space="preserve">Erzählperspektive bestimmen; Gefühlskurve einer Figur (z. B. der Freund als Bürge) mit Textbelegen.</w:t>
+              <w:t xml:space="preserve">Schriftliche Analyse (behandelte Ballade oder kurze neue Strophenfolge).</w:t>
             </w:r>
           </w:p>
         </w:tc>
@@ -4925,7 +4769,7 @@
                 <w:sz w:val="17"/>
                 <w:szCs w:val="17"/>
               </w:rPr>
-              <w:t xml:space="preserve">2.9 E</w:t>
+              <w:t xml:space="preserve">2.9</w:t>
             </w:r>
           </w:p>
         </w:tc>
@@ -4959,7 +4803,7 @@
                 <w:sz w:val="19"/>
                 <w:szCs w:val="19"/>
               </w:rPr>
-              <w:t xml:space="preserve"/>
+              <w:t xml:space="preserve">Bewertung 1: Analyse</w:t>
             </w:r>
           </w:p>
         </w:tc>
@@ -4999,7 +4843,7 @@
                 <w:sz w:val="19"/>
                 <w:szCs w:val="19"/>
               </w:rPr>
-              <w:t xml:space="preserve">21</w:t>
+              <w:t xml:space="preserve">20</w:t>
             </w:r>
           </w:p>
         </w:tc>
@@ -5033,7 +4877,7 @@
                 <w:sz w:val="19"/>
                 <w:szCs w:val="19"/>
               </w:rPr>
-              <w:t xml:space="preserve">Textformen und Schreibplan</w:t>
+              <w:t xml:space="preserve">Perspektive wechseln</w:t>
             </w:r>
           </w:p>
         </w:tc>
@@ -5067,7 +4911,7 @@
                 <w:sz w:val="19"/>
                 <w:szCs w:val="19"/>
               </w:rPr>
-              <w:t xml:space="preserve">… Merkmale von Tagebuch, Brief und Chatverlauf nennen und einen Schreibplan anlegen.</w:t>
+              <w:t xml:space="preserve">… Erzähler und Figur unterscheiden und Gefühle einer Figur aus dem Text erschließen.</w:t>
             </w:r>
           </w:p>
         </w:tc>
@@ -5099,7 +4943,7 @@
                 <w:sz w:val="19"/>
                 <w:szCs w:val="19"/>
               </w:rPr>
-              <w:t xml:space="preserve">Merkmale vergleichen; Figur und Textform wählen; Schreibplan (Cluster/Stichpunkte).</w:t>
+              <w:t xml:space="preserve">Erzählperspektive bestimmen; Gefühlskurve einer Figur (z. B. der Freund als Bürge) mit Textbelegen.</w:t>
             </w:r>
           </w:p>
         </w:tc>
@@ -5131,7 +4975,7 @@
                 <w:sz w:val="17"/>
                 <w:szCs w:val="17"/>
               </w:rPr>
-              <w:t xml:space="preserve">2.6 D/F</w:t>
+              <w:t xml:space="preserve">2.9 E</w:t>
             </w:r>
           </w:p>
         </w:tc>
@@ -5205,7 +5049,7 @@
                 <w:sz w:val="19"/>
                 <w:szCs w:val="19"/>
               </w:rPr>
-              <w:t xml:space="preserve">22</w:t>
+              <w:t xml:space="preserve">21</w:t>
             </w:r>
           </w:p>
         </w:tc>
@@ -5239,7 +5083,7 @@
                 <w:sz w:val="19"/>
                 <w:szCs w:val="19"/>
               </w:rPr>
-              <w:t xml:space="preserve">Entwurf schreiben</w:t>
+              <w:t xml:space="preserve">Textformen und Schreibplan</w:t>
             </w:r>
           </w:p>
         </w:tc>
@@ -5273,7 +5117,7 @@
                 <w:sz w:val="19"/>
                 <w:szCs w:val="19"/>
               </w:rPr>
-              <w:t xml:space="preserve">… einen Text aus der Sicht einer Figur schreiben.</w:t>
+              <w:t xml:space="preserve">… Merkmale von Tagebuch, Brief und Chatverlauf nennen und einen Schreibplan anlegen.</w:t>
             </w:r>
           </w:p>
         </w:tc>
@@ -5305,7 +5149,7 @@
                 <w:sz w:val="19"/>
                 <w:szCs w:val="19"/>
               </w:rPr>
-              <w:t xml:space="preserve">Entwurf mit Satzanfängen als Formulierungshilfe (keine fertigen Sätze).</w:t>
+              <w:t xml:space="preserve">Merkmale vergleichen; Figur und Textform wählen; Schreibplan (Cluster/Stichpunkte).</w:t>
             </w:r>
           </w:p>
         </w:tc>
@@ -5337,7 +5181,7 @@
                 <w:sz w:val="17"/>
                 <w:szCs w:val="17"/>
               </w:rPr>
-              <w:t xml:space="preserve">2.6 F</w:t>
+              <w:t xml:space="preserve">2.6 D/F</w:t>
             </w:r>
           </w:p>
         </w:tc>
@@ -5411,7 +5255,7 @@
                 <w:sz w:val="19"/>
                 <w:szCs w:val="19"/>
               </w:rPr>
-              <w:t xml:space="preserve">23</w:t>
+              <w:t xml:space="preserve">22</w:t>
             </w:r>
           </w:p>
         </w:tc>
@@ -5445,7 +5289,7 @@
                 <w:sz w:val="19"/>
                 <w:szCs w:val="19"/>
               </w:rPr>
-              <w:t xml:space="preserve">Schreibkonferenz</w:t>
+              <w:t xml:space="preserve">Entwurf schreiben</w:t>
             </w:r>
           </w:p>
         </w:tc>
@@ -5479,7 +5323,7 @@
                 <w:sz w:val="19"/>
                 <w:szCs w:val="19"/>
               </w:rPr>
-              <w:t xml:space="preserve">… einen fremden Text nach Kriterien einschätzen und Verbesserungsvorschläge machen.</w:t>
+              <w:t xml:space="preserve">… einen Text aus der Sicht einer Figur schreiben.</w:t>
             </w:r>
           </w:p>
         </w:tc>
@@ -5511,7 +5355,7 @@
                 <w:sz w:val="19"/>
                 <w:szCs w:val="19"/>
               </w:rPr>
-              <w:t xml:space="preserve">Kriterienbogen; Schreibkonferenz in Dreiergruppen mit festen Rollen.</w:t>
+              <w:t xml:space="preserve">Entwurf mit Satzanfängen als Formulierungshilfe (keine fertigen Sätze).</w:t>
             </w:r>
           </w:p>
         </w:tc>
@@ -5543,7 +5387,7 @@
                 <w:sz w:val="17"/>
                 <w:szCs w:val="17"/>
               </w:rPr>
-              <w:t xml:space="preserve">2.6 D · 2.3</w:t>
+              <w:t xml:space="preserve">2.6 F</w:t>
             </w:r>
           </w:p>
         </w:tc>
@@ -5617,7 +5461,7 @@
                 <w:sz w:val="19"/>
                 <w:szCs w:val="19"/>
               </w:rPr>
-              <w:t xml:space="preserve">24</w:t>
+              <w:t xml:space="preserve">23</w:t>
             </w:r>
           </w:p>
         </w:tc>
@@ -5651,7 +5495,7 @@
                 <w:sz w:val="19"/>
                 <w:szCs w:val="19"/>
               </w:rPr>
-              <w:t xml:space="preserve">Überarbeiten</w:t>
+              <w:t xml:space="preserve">Schreibkonferenz</w:t>
             </w:r>
           </w:p>
         </w:tc>
@@ -5685,7 +5529,7 @@
                 <w:sz w:val="19"/>
                 <w:szCs w:val="19"/>
               </w:rPr>
-              <w:t xml:space="preserve">… meinen Text nach Kriterien und eigenen Schwerpunkten überarbeiten.</w:t>
+              <w:t xml:space="preserve">… einen fremden Text nach Kriterien einschätzen und Verbesserungsvorschläge machen.</w:t>
             </w:r>
           </w:p>
         </w:tc>
@@ -5717,7 +5561,7 @@
                 <w:sz w:val="19"/>
                 <w:szCs w:val="19"/>
               </w:rPr>
-              <w:t xml:space="preserve">Überarbeitung mit Grün; eigene Überarbeitungsschwerpunkte notieren.</w:t>
+              <w:t xml:space="preserve">Kriterienbogen; Schreibkonferenz in Dreiergruppen mit festen Rollen.</w:t>
             </w:r>
           </w:p>
         </w:tc>
@@ -5749,7 +5593,7 @@
                 <w:sz w:val="17"/>
                 <w:szCs w:val="17"/>
               </w:rPr>
-              <w:t xml:space="preserve">2.6 D/E</w:t>
+              <w:t xml:space="preserve">2.6 D · 2.3</w:t>
             </w:r>
           </w:p>
         </w:tc>
@@ -5824,7 +5668,7 @@
                 <w:sz w:val="21"/>
                 <w:szCs w:val="21"/>
               </w:rPr>
-              <w:t xml:space="preserve">Woche 6 · Balladen in Ton und Musik</w:t>
+              <w:t xml:space="preserve">Woche 6 · 30.11.–4.12. · Balladen in Ton und Musik</w:t>
             </w:r>
             <w:r>
               <w:rPr>
@@ -5873,7 +5717,7 @@
                 <w:sz w:val="19"/>
                 <w:szCs w:val="19"/>
               </w:rPr>
-              <w:t xml:space="preserve">25</w:t>
+              <w:t xml:space="preserve">24</w:t>
             </w:r>
           </w:p>
         </w:tc>
@@ -5907,7 +5751,7 @@
                 <w:sz w:val="19"/>
                 <w:szCs w:val="19"/>
               </w:rPr>
-              <w:t xml:space="preserve">Leistung: Textüberarbeitung</w:t>
+              <w:t xml:space="preserve">Überarbeiten</w:t>
             </w:r>
           </w:p>
         </w:tc>
@@ -5941,7 +5785,7 @@
                 <w:sz w:val="19"/>
                 <w:szCs w:val="19"/>
               </w:rPr>
-              <w:t xml:space="preserve">… einen Text aus der Figurenperspektive kriteriengeleitet überarbeiten.</w:t>
+              <w:t xml:space="preserve">… meinen Text nach Kriterien und eigenen Schwerpunkten überarbeiten.</w:t>
             </w:r>
           </w:p>
         </w:tc>
@@ -5973,7 +5817,7 @@
                 <w:sz w:val="19"/>
                 <w:szCs w:val="19"/>
               </w:rPr>
-              <w:t xml:space="preserve">Überarbeitung und Abgabe (Bewertung).</w:t>
+              <w:t xml:space="preserve">Überarbeitung mit Grün; eigene Überarbeitungsschwerpunkte notieren.</w:t>
             </w:r>
           </w:p>
         </w:tc>
@@ -6005,7 +5849,7 @@
                 <w:sz w:val="17"/>
                 <w:szCs w:val="17"/>
               </w:rPr>
-              <w:t xml:space="preserve">2.6</w:t>
+              <w:t xml:space="preserve">2.6 D/E</w:t>
             </w:r>
           </w:p>
         </w:tc>
@@ -6039,7 +5883,7 @@
                 <w:sz w:val="19"/>
                 <w:szCs w:val="19"/>
               </w:rPr>
-              <w:t xml:space="preserve">Bewertung 2: Textüberarbeitung</w:t>
+              <w:t xml:space="preserve"/>
             </w:r>
           </w:p>
         </w:tc>
@@ -6079,7 +5923,7 @@
                 <w:sz w:val="19"/>
                 <w:szCs w:val="19"/>
               </w:rPr>
-              <w:t xml:space="preserve">26</w:t>
+              <w:t xml:space="preserve">25</w:t>
             </w:r>
           </w:p>
         </w:tc>
@@ -6113,7 +5957,7 @@
                 <w:sz w:val="19"/>
                 <w:szCs w:val="19"/>
               </w:rPr>
-              <w:t xml:space="preserve">Wer spricht im Erlkönig?</w:t>
+              <w:t xml:space="preserve">Leistung: Textüberarbeitung</w:t>
             </w:r>
           </w:p>
         </w:tc>
@@ -6147,7 +5991,7 @@
                 <w:sz w:val="19"/>
                 <w:szCs w:val="19"/>
               </w:rPr>
-              <w:t xml:space="preserve">… die Sprecher einer Ballade unterscheiden und den Dialog als dramatisches Element erklären.</w:t>
+              <w:t xml:space="preserve">… einen Text aus der Figurenperspektive kriteriengeleitet überarbeiten.</w:t>
             </w:r>
           </w:p>
         </w:tc>
@@ -6179,7 +6023,7 @@
                 <w:sz w:val="19"/>
                 <w:szCs w:val="19"/>
               </w:rPr>
-              <w:t xml:space="preserve">Sprecher farbig markieren (Erzähler, Vater, Sohn, Erlkönig); mit verteilten Rollen lesen.</w:t>
+              <w:t xml:space="preserve">Überarbeitung und Abgabe (Bewertung).</w:t>
             </w:r>
           </w:p>
         </w:tc>
@@ -6211,7 +6055,7 @@
                 <w:sz w:val="17"/>
                 <w:szCs w:val="17"/>
               </w:rPr>
-              <w:t xml:space="preserve">2.9 D</w:t>
+              <w:t xml:space="preserve">2.6</w:t>
             </w:r>
           </w:p>
         </w:tc>
@@ -6245,7 +6089,7 @@
                 <w:sz w:val="19"/>
                 <w:szCs w:val="19"/>
               </w:rPr>
-              <w:t xml:space="preserve"/>
+              <w:t xml:space="preserve">Bewertung 2: Textüberarbeitung</w:t>
             </w:r>
           </w:p>
         </w:tc>
@@ -6285,7 +6129,7 @@
                 <w:sz w:val="19"/>
                 <w:szCs w:val="19"/>
               </w:rPr>
-              <w:t xml:space="preserve">27</w:t>
+              <w:t xml:space="preserve">26</w:t>
             </w:r>
           </w:p>
         </w:tc>
@@ -6319,7 +6163,7 @@
                 <w:sz w:val="19"/>
                 <w:szCs w:val="19"/>
               </w:rPr>
-              <w:t xml:space="preserve">Wie entsteht das Unheimliche?</w:t>
+              <w:t xml:space="preserve">Wer spricht im Erlkönig?</w:t>
             </w:r>
           </w:p>
         </w:tc>
@@ -6353,7 +6197,7 @@
                 <w:sz w:val="19"/>
                 <w:szCs w:val="19"/>
               </w:rPr>
-              <w:t xml:space="preserve">… beschreiben, wie Sprache und Aufbau Spannung erzeugen.</w:t>
+              <w:t xml:space="preserve">… die Sprecher einer Ballade unterscheiden und den Dialog als dramatisches Element erklären.</w:t>
             </w:r>
           </w:p>
         </w:tc>
@@ -6385,7 +6229,7 @@
                 <w:sz w:val="19"/>
                 <w:szCs w:val="19"/>
               </w:rPr>
-              <w:t xml:space="preserve">Steigerung von Strophe zu Strophe; Wortwahl des Erlkönigs; Wirkung belegen.</w:t>
+              <w:t xml:space="preserve">Sprecher farbig markieren (Erzähler, Vater, Sohn, Erlkönig); mit verteilten Rollen lesen.</w:t>
             </w:r>
           </w:p>
         </w:tc>
@@ -6417,7 +6261,7 @@
                 <w:sz w:val="17"/>
                 <w:szCs w:val="17"/>
               </w:rPr>
-              <w:t xml:space="preserve">2.9 E</w:t>
+              <w:t xml:space="preserve">2.9 D</w:t>
             </w:r>
           </w:p>
         </w:tc>
@@ -6491,7 +6335,7 @@
                 <w:sz w:val="19"/>
                 <w:szCs w:val="19"/>
               </w:rPr>
-              <w:t xml:space="preserve">28</w:t>
+              <w:t xml:space="preserve">27</w:t>
             </w:r>
           </w:p>
         </w:tc>
@@ -6525,7 +6369,7 @@
                 <w:sz w:val="19"/>
                 <w:szCs w:val="19"/>
               </w:rPr>
-              <w:t xml:space="preserve">Schuberts Erlkönig</w:t>
+              <w:t xml:space="preserve">Wie entsteht das Unheimliche?</w:t>
             </w:r>
           </w:p>
         </w:tc>
@@ -6559,7 +6403,7 @@
                 <w:sz w:val="19"/>
                 <w:szCs w:val="19"/>
               </w:rPr>
-              <w:t xml:space="preserve">… mediale Gestaltungsmittel einer Vertonung beschreiben.</w:t>
+              <w:t xml:space="preserve">… beschreiben, wie Sprache und Aufbau Spannung erzeugen.</w:t>
             </w:r>
           </w:p>
         </w:tc>
@@ -6591,7 +6435,7 @@
                 <w:sz w:val="19"/>
                 <w:szCs w:val="19"/>
               </w:rPr>
-              <w:t xml:space="preserve">Hören: Galopp im Klavier, Stimmlagen der Figuren; Höraufträge für alle, Notizraster.</w:t>
+              <w:t xml:space="preserve">Steigerung von Strophe zu Strophe; Wortwahl des Erlkönigs; Wirkung belegen.</w:t>
             </w:r>
           </w:p>
         </w:tc>
@@ -6623,7 +6467,7 @@
                 <w:sz w:val="17"/>
                 <w:szCs w:val="17"/>
               </w:rPr>
-              <w:t xml:space="preserve">2.11 D · 2.3</w:t>
+              <w:t xml:space="preserve">2.9 E</w:t>
             </w:r>
           </w:p>
         </w:tc>
@@ -6697,7 +6541,7 @@
                 <w:sz w:val="19"/>
                 <w:szCs w:val="19"/>
               </w:rPr>
-              <w:t xml:space="preserve">29</w:t>
+              <w:t xml:space="preserve">28</w:t>
             </w:r>
           </w:p>
         </w:tc>
@@ -6731,7 +6575,7 @@
                 <w:sz w:val="19"/>
                 <w:szCs w:val="19"/>
               </w:rPr>
-              <w:t xml:space="preserve">Moderne Fassungen</w:t>
+              <w:t xml:space="preserve">Schuberts Erlkönig</w:t>
             </w:r>
           </w:p>
         </w:tc>
@@ -6765,7 +6609,7 @@
                 <w:sz w:val="19"/>
                 <w:szCs w:val="19"/>
               </w:rPr>
-              <w:t xml:space="preserve">… zwei Fassungen vergleichen und ihre Wirkung auf mich begründen.</w:t>
+              <w:t xml:space="preserve">… mediale Gestaltungsmittel einer Vertonung beschreiben.</w:t>
             </w:r>
           </w:p>
         </w:tc>
@@ -6797,7 +6641,7 @@
                 <w:sz w:val="19"/>
                 <w:szCs w:val="19"/>
               </w:rPr>
-              <w:t xml:space="preserve">Rap-/Popversion vs. Schubert; eigene Medienerfahrung austauschen.</w:t>
+              <w:t xml:space="preserve">Hören: Galopp im Klavier, Stimmlagen der Figuren; Höraufträge für alle, Notizraster.</w:t>
             </w:r>
           </w:p>
         </w:tc>
@@ -6829,7 +6673,7 @@
                 <w:sz w:val="17"/>
                 <w:szCs w:val="17"/>
               </w:rPr>
-              <w:t xml:space="preserve">2.11 F · C/D</w:t>
+              <w:t xml:space="preserve">2.11 D · 2.3</w:t>
             </w:r>
           </w:p>
         </w:tc>
@@ -6904,7 +6748,7 @@
                 <w:sz w:val="21"/>
                 <w:szCs w:val="21"/>
               </w:rPr>
-              <w:t xml:space="preserve">Woche 7 · Vom Text zum Bild – und zur Bühne</w:t>
+              <w:t xml:space="preserve">Woche 7 · 7.–11.12. · Vom Text zu Film und Bild</w:t>
             </w:r>
             <w:r>
               <w:rPr>
@@ -6913,7 +6757,7 @@
                 <w:sz w:val="18"/>
                 <w:szCs w:val="18"/>
               </w:rPr>
-              <w:t xml:space="preserve">   5 Stunden · Der Zauberlehrling (Goethe)</w:t>
+              <w:t xml:space="preserve">   5 Stunden · Erlkönig, Der Zauberlehrling (Goethe)</w:t>
             </w:r>
           </w:p>
         </w:tc>
@@ -6953,7 +6797,7 @@
                 <w:sz w:val="19"/>
                 <w:szCs w:val="19"/>
               </w:rPr>
-              <w:t xml:space="preserve">30</w:t>
+              <w:t xml:space="preserve">29</w:t>
             </w:r>
           </w:p>
         </w:tc>
@@ -6987,7 +6831,7 @@
                 <w:sz w:val="19"/>
                 <w:szCs w:val="19"/>
               </w:rPr>
-              <w:t xml:space="preserve">Der Zauberlehrling</w:t>
+              <w:t xml:space="preserve">Moderne Fassungen</w:t>
             </w:r>
           </w:p>
         </w:tc>
@@ -7021,7 +6865,7 @@
                 <w:sz w:val="19"/>
                 <w:szCs w:val="19"/>
               </w:rPr>
-              <w:t xml:space="preserve">… Aufbau und Kehrreim einer Ballade beschreiben und ihre Wirkung erklären.</w:t>
+              <w:t xml:space="preserve">… zwei Fassungen vergleichen und ihre Wirkung auf mich begründen.</w:t>
             </w:r>
           </w:p>
         </w:tc>
@@ -7053,7 +6897,7 @@
                 <w:sz w:val="19"/>
                 <w:szCs w:val="19"/>
               </w:rPr>
-              <w:t xml:space="preserve">Lesen, Kehrreim markieren; Bezug: Was passiert, wenn man eine Technik einsetzt, die man noch nicht beherrscht?</w:t>
+              <w:t xml:space="preserve">Rap- oder Popversion vs. Schubert; eigene Medienerfahrung austauschen.</w:t>
             </w:r>
           </w:p>
         </w:tc>
@@ -7085,7 +6929,7 @@
                 <w:sz w:val="17"/>
                 <w:szCs w:val="17"/>
               </w:rPr>
-              <w:t xml:space="preserve">2.9 D/E</w:t>
+              <w:t xml:space="preserve">2.11 F · C/D</w:t>
             </w:r>
           </w:p>
         </w:tc>
@@ -7159,7 +7003,7 @@
                 <w:sz w:val="19"/>
                 <w:szCs w:val="19"/>
               </w:rPr>
-              <w:t xml:space="preserve">31</w:t>
+              <w:t xml:space="preserve">30</w:t>
             </w:r>
           </w:p>
         </w:tc>
@@ -7193,7 +7037,7 @@
                 <w:sz w:val="19"/>
                 <w:szCs w:val="19"/>
               </w:rPr>
-              <w:t xml:space="preserve">Ballade und Film</w:t>
+              <w:t xml:space="preserve">Der Zauberlehrling</w:t>
             </w:r>
           </w:p>
         </w:tc>
@@ -7227,7 +7071,7 @@
                 <w:sz w:val="19"/>
                 <w:szCs w:val="19"/>
               </w:rPr>
-              <w:t xml:space="preserve">… Text und Verfilmung vergleichen.</w:t>
+              <w:t xml:space="preserve">… Aufbau und Kehrreim einer Ballade beschreiben und ihre Wirkung erklären.</w:t>
             </w:r>
           </w:p>
         </w:tc>
@@ -7259,7 +7103,7 @@
                 <w:sz w:val="19"/>
                 <w:szCs w:val="19"/>
               </w:rPr>
-              <w:t xml:space="preserve">Micky-Maus-Fassung (Fantasia): Was übernimmt der Film, was verändert er? Vergleichsraster allein, dann PA.</w:t>
+              <w:t xml:space="preserve">Lesen, Kehrreim markieren, Wirkung der Wiederholung beschreiben.</w:t>
             </w:r>
           </w:p>
         </w:tc>
@@ -7291,7 +7135,7 @@
                 <w:sz w:val="17"/>
                 <w:szCs w:val="17"/>
               </w:rPr>
-              <w:t xml:space="preserve">2.11 D</w:t>
+              <w:t xml:space="preserve">2.9 D/E</w:t>
             </w:r>
           </w:p>
         </w:tc>
@@ -7365,7 +7209,7 @@
                 <w:sz w:val="19"/>
                 <w:szCs w:val="19"/>
               </w:rPr>
-              <w:t xml:space="preserve">32</w:t>
+              <w:t xml:space="preserve">31</w:t>
             </w:r>
           </w:p>
         </w:tc>
@@ -7399,7 +7243,7 @@
                 <w:sz w:val="19"/>
                 <w:szCs w:val="19"/>
               </w:rPr>
-              <w:t xml:space="preserve">Ballade als Graphic Novel</w:t>
+              <w:t xml:space="preserve">Ballade und Film</w:t>
             </w:r>
           </w:p>
         </w:tc>
@@ -7433,7 +7277,7 @@
                 <w:sz w:val="19"/>
                 <w:szCs w:val="19"/>
               </w:rPr>
-              <w:t xml:space="preserve">… mein Textverständnis in einer anderen Darstellungsform ausdrücken.</w:t>
+              <w:t xml:space="preserve">… Text und Verfilmung vergleichen.</w:t>
             </w:r>
           </w:p>
         </w:tc>
@@ -7465,7 +7309,7 @@
                 <w:sz w:val="19"/>
                 <w:szCs w:val="19"/>
               </w:rPr>
-              <w:t xml:space="preserve">Eine Strophe als Comic-Panel mit Sprechblase gestalten; Galeriegang mit Kurzbegründung.</w:t>
+              <w:t xml:space="preserve">Micky-Maus-Fassung (Fantasia): Was übernimmt der Film, was verändert er? Vergleichsraster allein, dann PA.</w:t>
             </w:r>
           </w:p>
         </w:tc>
@@ -7497,7 +7341,7 @@
                 <w:sz w:val="17"/>
                 <w:szCs w:val="17"/>
               </w:rPr>
-              <w:t xml:space="preserve">2.8 E</w:t>
+              <w:t xml:space="preserve">2.11 D</w:t>
             </w:r>
           </w:p>
         </w:tc>
@@ -7571,7 +7415,7 @@
                 <w:sz w:val="19"/>
                 <w:szCs w:val="19"/>
               </w:rPr>
-              <w:t xml:space="preserve">33</w:t>
+              <w:t xml:space="preserve">32</w:t>
             </w:r>
           </w:p>
         </w:tc>
@@ -7605,7 +7449,7 @@
                 <w:sz w:val="19"/>
                 <w:szCs w:val="19"/>
               </w:rPr>
-              <w:t xml:space="preserve">Was macht einen guten Vortrag aus?</w:t>
+              <w:t xml:space="preserve">Ballade als Graphic Novel</w:t>
             </w:r>
           </w:p>
         </w:tc>
@@ -7639,7 +7483,7 @@
                 <w:sz w:val="19"/>
                 <w:szCs w:val="19"/>
               </w:rPr>
-              <w:t xml:space="preserve">… Kriterien für einen gelungenen Balladenvortrag nennen.</w:t>
+              <w:t xml:space="preserve">… mein Textverständnis in einer anderen Darstellungsform ausdrücken.</w:t>
             </w:r>
           </w:p>
         </w:tc>
@@ -7671,7 +7515,7 @@
                 <w:sz w:val="19"/>
                 <w:szCs w:val="19"/>
               </w:rPr>
-              <w:t xml:space="preserve">Zwei Vorträge derselben Strophe vergleichen; Kriterien sammeln (Tempo, Pausen, Betonung, Lautstärke, Mimik, Gestik, Blickkontakt).</w:t>
+              <w:t xml:space="preserve">Eine Strophe als Comic-Panel mit Sprechblase gestalten; Galeriegang mit Kurzbegründung.</w:t>
             </w:r>
           </w:p>
         </w:tc>
@@ -7703,7 +7547,7 @@
                 <w:sz w:val="17"/>
                 <w:szCs w:val="17"/>
               </w:rPr>
-              <w:t xml:space="preserve">2.7 D · 2.3</w:t>
+              <w:t xml:space="preserve">2.8 E</w:t>
             </w:r>
           </w:p>
         </w:tc>
@@ -7777,7 +7621,7 @@
                 <w:sz w:val="19"/>
                 <w:szCs w:val="19"/>
               </w:rPr>
-              <w:t xml:space="preserve">34</w:t>
+              <w:t xml:space="preserve">33</w:t>
             </w:r>
           </w:p>
         </w:tc>
@@ -7811,7 +7655,7 @@
                 <w:sz w:val="19"/>
                 <w:szCs w:val="19"/>
               </w:rPr>
-              <w:t xml:space="preserve">Vortragszeichen setzen</w:t>
+              <w:t xml:space="preserve">Was macht einen guten Vortrag aus?</w:t>
             </w:r>
           </w:p>
         </w:tc>
@@ -7845,7 +7689,7 @@
                 <w:sz w:val="19"/>
                 <w:szCs w:val="19"/>
               </w:rPr>
-              <w:t xml:space="preserve">… einen Text mit Vortragszeichen für meinen Vortrag vorbereiten.</w:t>
+              <w:t xml:space="preserve">… Kriterien für einen gelungenen Balladenvortrag nennen.</w:t>
             </w:r>
           </w:p>
         </w:tc>
@@ -7877,7 +7721,7 @@
                 <w:sz w:val="19"/>
                 <w:szCs w:val="19"/>
               </w:rPr>
-              <w:t xml:space="preserve">Vortragszeichen an einer Strophe; Ballade für die Rezitation wählen.</w:t>
+              <w:t xml:space="preserve">Zwei Vorträge derselben Strophe vergleichen; Kriterien sammeln (Tempo, Pausen, Betonung, Lautstärke, Mimik, Gestik, Blickkontakt). Ballade für die Rezitation wählen.</w:t>
             </w:r>
           </w:p>
         </w:tc>
@@ -7909,7 +7753,7 @@
                 <w:sz w:val="17"/>
                 <w:szCs w:val="17"/>
               </w:rPr>
-              <w:t xml:space="preserve">2.7 D</w:t>
+              <w:t xml:space="preserve">2.7 D · 2.3</w:t>
             </w:r>
           </w:p>
         </w:tc>
@@ -7984,7 +7828,7 @@
                 <w:sz w:val="21"/>
                 <w:szCs w:val="21"/>
               </w:rPr>
-              <w:t xml:space="preserve">Woche 8 · Rezitation vorbereiten und vortragen</w:t>
+              <w:t xml:space="preserve">Woche 8 · 14.–18.12. · Rezitation vorbereiten</w:t>
             </w:r>
             <w:r>
               <w:rPr>
@@ -8033,7 +7877,7 @@
                 <w:sz w:val="19"/>
                 <w:szCs w:val="19"/>
               </w:rPr>
-              <w:t xml:space="preserve">35</w:t>
+              <w:t xml:space="preserve">34</w:t>
             </w:r>
           </w:p>
         </w:tc>
@@ -8067,7 +7911,7 @@
                 <w:sz w:val="19"/>
                 <w:szCs w:val="19"/>
               </w:rPr>
-              <w:t xml:space="preserve">Auswendig lernen</w:t>
+              <w:t xml:space="preserve">Vortragszeichen setzen</w:t>
             </w:r>
           </w:p>
         </w:tc>
@@ -8101,7 +7945,7 @@
                 <w:sz w:val="19"/>
                 <w:szCs w:val="19"/>
               </w:rPr>
-              <w:t xml:space="preserve">… Strategien zum Auswendiglernen anwenden.</w:t>
+              <w:t xml:space="preserve">… einen Text mit Vortragszeichen für meinen Vortrag vorbereiten.</w:t>
             </w:r>
           </w:p>
         </w:tc>
@@ -8133,7 +7977,7 @@
                 <w:sz w:val="19"/>
                 <w:szCs w:val="19"/>
               </w:rPr>
-              <w:t xml:space="preserve">Strophenweise lernen (Training in Etappen), Stichwortkarten, Partnerabfrage.</w:t>
+              <w:t xml:space="preserve">Vortragszeichen an einer Strophe, dann an der eigenen Ballade.</w:t>
             </w:r>
           </w:p>
         </w:tc>
@@ -8165,7 +8009,7 @@
                 <w:sz w:val="17"/>
                 <w:szCs w:val="17"/>
               </w:rPr>
-              <w:t xml:space="preserve">2.7</w:t>
+              <w:t xml:space="preserve">2.7 D</w:t>
             </w:r>
           </w:p>
         </w:tc>
@@ -8239,7 +8083,7 @@
                 <w:sz w:val="19"/>
                 <w:szCs w:val="19"/>
               </w:rPr>
-              <w:t xml:space="preserve">36</w:t>
+              <w:t xml:space="preserve">35</w:t>
             </w:r>
           </w:p>
         </w:tc>
@@ -8273,7 +8117,7 @@
                 <w:sz w:val="19"/>
                 <w:szCs w:val="19"/>
               </w:rPr>
-              <w:t xml:space="preserve">Mimik, Gestik, Stimme</w:t>
+              <w:t xml:space="preserve">Auswendig lernen</w:t>
             </w:r>
           </w:p>
         </w:tc>
@@ -8307,7 +8151,7 @@
                 <w:sz w:val="19"/>
                 <w:szCs w:val="19"/>
               </w:rPr>
-              <w:t xml:space="preserve">… nonverbale Mittel und Intonation gezielt einsetzen.</w:t>
+              <w:t xml:space="preserve">… Strategien zum Auswendiglernen anwenden.</w:t>
             </w:r>
           </w:p>
         </w:tc>
@@ -8339,7 +8183,7 @@
                 <w:sz w:val="19"/>
                 <w:szCs w:val="19"/>
               </w:rPr>
-              <w:t xml:space="preserve">Übungen zu Stimme und Haltung; eine Strophe mit unterschiedlicher Wirkung sprechen.</w:t>
+              <w:t xml:space="preserve">Strophenweise lernen, Stichwortkarten, Partnerabfrage.</w:t>
             </w:r>
           </w:p>
         </w:tc>
@@ -8371,7 +8215,7 @@
                 <w:sz w:val="17"/>
                 <w:szCs w:val="17"/>
               </w:rPr>
-              <w:t xml:space="preserve">2.1 · 2.7 E/F</w:t>
+              <w:t xml:space="preserve">2.7</w:t>
             </w:r>
           </w:p>
         </w:tc>
@@ -8445,7 +8289,7 @@
                 <w:sz w:val="19"/>
                 <w:szCs w:val="19"/>
               </w:rPr>
-              <w:t xml:space="preserve">37</w:t>
+              <w:t xml:space="preserve">36</w:t>
             </w:r>
           </w:p>
         </w:tc>
@@ -8479,7 +8323,7 @@
                 <w:sz w:val="19"/>
                 <w:szCs w:val="19"/>
               </w:rPr>
-              <w:t xml:space="preserve">Üben mit Feedback</w:t>
+              <w:t xml:space="preserve">Mimik, Gestik, Stimme</w:t>
             </w:r>
           </w:p>
         </w:tc>
@@ -8513,7 +8357,7 @@
                 <w:sz w:val="19"/>
                 <w:szCs w:val="19"/>
               </w:rPr>
-              <w:t xml:space="preserve">… einen Vortrag nach Kriterien einschätzen und Feedback geben.</w:t>
+              <w:t xml:space="preserve">… nonverbale Mittel und Intonation gezielt einsetzen.</w:t>
             </w:r>
           </w:p>
         </w:tc>
@@ -8545,7 +8389,7 @@
                 <w:sz w:val="19"/>
                 <w:szCs w:val="19"/>
               </w:rPr>
-              <w:t xml:space="preserve">PA: Vortrag – Feedbackbogen mit Notizen beim Zuhören – zweiter Durchgang.</w:t>
+              <w:t xml:space="preserve">Übungen zu Stimme und Haltung; eine Strophe mit unterschiedlicher Wirkung sprechen.</w:t>
             </w:r>
           </w:p>
         </w:tc>
@@ -8577,7 +8421,7 @@
                 <w:sz w:val="17"/>
                 <w:szCs w:val="17"/>
               </w:rPr>
-              <w:t xml:space="preserve">2.7 D · 2.3</w:t>
+              <w:t xml:space="preserve">2.1 · 2.7 E/F</w:t>
             </w:r>
           </w:p>
         </w:tc>
@@ -8651,7 +8495,7 @@
                 <w:sz w:val="19"/>
                 <w:szCs w:val="19"/>
               </w:rPr>
-              <w:t xml:space="preserve">38</w:t>
+              <w:t xml:space="preserve">37</w:t>
             </w:r>
           </w:p>
         </w:tc>
@@ -8685,7 +8529,7 @@
                 <w:sz w:val="19"/>
                 <w:szCs w:val="19"/>
               </w:rPr>
-              <w:t xml:space="preserve">Generalprobe</w:t>
+              <w:t xml:space="preserve">Üben mit Feedback</w:t>
             </w:r>
           </w:p>
         </w:tc>
@@ -8719,7 +8563,7 @@
                 <w:sz w:val="19"/>
                 <w:szCs w:val="19"/>
               </w:rPr>
-              <w:t xml:space="preserve">… meinen Vortrag im geschützten Rahmen halten und verbessern.</w:t>
+              <w:t xml:space="preserve">… einen Vortrag nach Kriterien einschätzen und Feedback geben.</w:t>
             </w:r>
           </w:p>
         </w:tc>
@@ -8751,7 +8595,7 @@
                 <w:sz w:val="19"/>
                 <w:szCs w:val="19"/>
               </w:rPr>
-              <w:t xml:space="preserve">Kleingruppen; Selbst- und Fremdeinschätzung.</w:t>
+              <w:t xml:space="preserve">PA: Vortrag – Feedbackbogen mit Notizen beim Zuhören – zweiter Durchgang.</w:t>
             </w:r>
           </w:p>
         </w:tc>
@@ -8783,7 +8627,7 @@
                 <w:sz w:val="17"/>
                 <w:szCs w:val="17"/>
               </w:rPr>
-              <w:t xml:space="preserve">2.7</w:t>
+              <w:t xml:space="preserve">2.7 D · 2.3</w:t>
             </w:r>
           </w:p>
         </w:tc>
@@ -8857,7 +8701,7 @@
                 <w:sz w:val="19"/>
                 <w:szCs w:val="19"/>
               </w:rPr>
-              <w:t xml:space="preserve">39</w:t>
+              <w:t xml:space="preserve">38</w:t>
             </w:r>
           </w:p>
         </w:tc>
@@ -8891,7 +8735,7 @@
                 <w:sz w:val="19"/>
                 <w:szCs w:val="19"/>
               </w:rPr>
-              <w:t xml:space="preserve">Rezitation I</w:t>
+              <w:t xml:space="preserve">Generalprobe</w:t>
             </w:r>
           </w:p>
         </w:tc>
@@ -8925,7 +8769,7 @@
                 <w:sz w:val="19"/>
                 <w:szCs w:val="19"/>
               </w:rPr>
-              <w:t xml:space="preserve">… eine Ballade kriterienorientiert vortragen.</w:t>
+              <w:t xml:space="preserve">… meinen Vortrag im geschützten Rahmen halten und verbessern.</w:t>
             </w:r>
           </w:p>
         </w:tc>
@@ -8957,7 +8801,7 @@
                 <w:sz w:val="19"/>
                 <w:szCs w:val="19"/>
               </w:rPr>
-              <w:t xml:space="preserve">Vorträge; Zuhörer notieren Feedback.</w:t>
+              <w:t xml:space="preserve">Kleingruppen; Selbst- und Fremdeinschätzung. Über die Ferien weiter auswendig lernen.</w:t>
             </w:r>
           </w:p>
         </w:tc>
@@ -8989,7 +8833,7 @@
                 <w:sz w:val="17"/>
                 <w:szCs w:val="17"/>
               </w:rPr>
-              <w:t xml:space="preserve">2.7 · 2.3</w:t>
+              <w:t xml:space="preserve">2.7</w:t>
             </w:r>
           </w:p>
         </w:tc>
@@ -9023,7 +8867,7 @@
                 <w:sz w:val="19"/>
                 <w:szCs w:val="19"/>
               </w:rPr>
-              <w:t xml:space="preserve">Bewertung 3: Rezitation</w:t>
+              <w:t xml:space="preserve"/>
             </w:r>
           </w:p>
         </w:tc>
@@ -9042,7 +8886,7 @@
               <w:bottom w:val="single" w:color="B9C6E8" w:sz="6"/>
               <w:right w:val="single" w:color="B9C6E8" w:sz="6"/>
             </w:tcBorders>
-            <w:shd w:fill="1E2761" w:color="auto" w:val="clear"/>
+            <w:shd w:fill="9AA3B5" w:color="auto" w:val="clear"/>
             <w:tcMar>
               <w:top w:type="dxa" w:w="50"/>
               <w:left w:type="dxa" w:w="100"/>
@@ -9064,7 +8908,7 @@
                 <w:sz w:val="21"/>
                 <w:szCs w:val="21"/>
               </w:rPr>
-              <w:t xml:space="preserve">Woche 9 · Abschluss</w:t>
+              <w:t xml:space="preserve">Woche 9 · nach den Weihnachtsferien (Termin prüfen) · Rezitation und Abschluss</w:t>
             </w:r>
             <w:r>
               <w:rPr>
@@ -9113,7 +8957,7 @@
                 <w:sz w:val="19"/>
                 <w:szCs w:val="19"/>
               </w:rPr>
-              <w:t xml:space="preserve">40</w:t>
+              <w:t xml:space="preserve">39</w:t>
             </w:r>
           </w:p>
         </w:tc>
@@ -9147,7 +8991,7 @@
                 <w:sz w:val="19"/>
                 <w:szCs w:val="19"/>
               </w:rPr>
-              <w:t xml:space="preserve">Rezitation II</w:t>
+              <w:t xml:space="preserve">Rezitation I</w:t>
             </w:r>
           </w:p>
         </w:tc>
@@ -9213,7 +9057,7 @@
                 <w:sz w:val="19"/>
                 <w:szCs w:val="19"/>
               </w:rPr>
-              <w:t xml:space="preserve">Vorträge; Zuhörer notieren Feedback.</w:t>
+              <w:t xml:space="preserve">Kurze Auffrischung, dann Vorträge; Zuhörer notieren Feedback.</w:t>
             </w:r>
           </w:p>
         </w:tc>
@@ -9319,7 +9163,7 @@
                 <w:sz w:val="19"/>
                 <w:szCs w:val="19"/>
               </w:rPr>
-              <w:t xml:space="preserve">41</w:t>
+              <w:t xml:space="preserve">40</w:t>
             </w:r>
           </w:p>
         </w:tc>
@@ -9353,7 +9197,7 @@
                 <w:sz w:val="19"/>
                 <w:szCs w:val="19"/>
               </w:rPr>
-              <w:t xml:space="preserve">Rezitation III</w:t>
+              <w:t xml:space="preserve">Rezitation II</w:t>
             </w:r>
           </w:p>
         </w:tc>
@@ -9419,7 +9263,7 @@
                 <w:sz w:val="19"/>
                 <w:szCs w:val="19"/>
               </w:rPr>
-              <w:t xml:space="preserve">Restliche Vorträge (ggf. im geschützten Raum).</w:t>
+              <w:t xml:space="preserve">Vorträge; Zuhörer notieren Feedback.</w:t>
             </w:r>
           </w:p>
         </w:tc>
@@ -9451,7 +9295,7 @@
                 <w:sz w:val="17"/>
                 <w:szCs w:val="17"/>
               </w:rPr>
-              <w:t xml:space="preserve">2.7</w:t>
+              <w:t xml:space="preserve">2.7 · 2.3</w:t>
             </w:r>
           </w:p>
         </w:tc>
@@ -9525,7 +9369,7 @@
                 <w:sz w:val="19"/>
                 <w:szCs w:val="19"/>
               </w:rPr>
-              <w:t xml:space="preserve">42</w:t>
+              <w:t xml:space="preserve">41</w:t>
             </w:r>
           </w:p>
         </w:tc>
@@ -9559,7 +9403,7 @@
                 <w:sz w:val="19"/>
                 <w:szCs w:val="19"/>
               </w:rPr>
-              <w:t xml:space="preserve">Feedback und Selbsteinschätzung</w:t>
+              <w:t xml:space="preserve">Rezitation III</w:t>
             </w:r>
           </w:p>
         </w:tc>
@@ -9593,7 +9437,7 @@
                 <w:sz w:val="19"/>
                 <w:szCs w:val="19"/>
               </w:rPr>
-              <w:t xml:space="preserve">… meinen Lernstand in der Einheit einschätzen.</w:t>
+              <w:t xml:space="preserve">… eine Ballade kriterienorientiert vortragen.</w:t>
             </w:r>
           </w:p>
         </w:tc>
@@ -9625,7 +9469,7 @@
                 <w:sz w:val="19"/>
                 <w:szCs w:val="19"/>
               </w:rPr>
-              <w:t xml:space="preserve">Selbsteinschätzungsbogen; Rückmeldung zu den drei Bewertungen.</w:t>
+              <w:t xml:space="preserve">Restliche Vorträge (ggf. im geschützten Raum).</w:t>
             </w:r>
           </w:p>
         </w:tc>
@@ -9657,7 +9501,7 @@
                 <w:sz w:val="17"/>
                 <w:szCs w:val="17"/>
               </w:rPr>
-              <w:t xml:space="preserve">2.7 D</w:t>
+              <w:t xml:space="preserve">2.7</w:t>
             </w:r>
           </w:p>
         </w:tc>
@@ -9691,7 +9535,7 @@
                 <w:sz w:val="19"/>
                 <w:szCs w:val="19"/>
               </w:rPr>
-              <w:t xml:space="preserve"/>
+              <w:t xml:space="preserve">Bewertung 3: Rezitation</w:t>
             </w:r>
           </w:p>
         </w:tc>
@@ -9731,7 +9575,7 @@
                 <w:sz w:val="19"/>
                 <w:szCs w:val="19"/>
               </w:rPr>
-              <w:t xml:space="preserve">43</w:t>
+              <w:t xml:space="preserve">42</w:t>
             </w:r>
           </w:p>
         </w:tc>
@@ -9765,7 +9609,7 @@
                 <w:sz w:val="19"/>
                 <w:szCs w:val="19"/>
               </w:rPr>
-              <w:t xml:space="preserve">Meine Ballade</w:t>
+              <w:t xml:space="preserve">Rückblick: meine Ballade</w:t>
             </w:r>
           </w:p>
         </w:tc>
@@ -9799,7 +9643,7 @@
                 <w:sz w:val="19"/>
                 <w:szCs w:val="19"/>
               </w:rPr>
-              <w:t xml:space="preserve">… begründen, welche Ballade mich am meisten überzeugt.</w:t>
+              <w:t xml:space="preserve">… meinen Lernstand einschätzen und begründen, welche Ballade mich am meisten überzeugt.</w:t>
             </w:r>
           </w:p>
         </w:tc>
@@ -9831,7 +9675,7 @@
                 <w:sz w:val="19"/>
                 <w:szCs w:val="19"/>
               </w:rPr>
-              <w:t xml:space="preserve">Kurze begründete Stellungnahme; Austausch in PA, dann Plenum.</w:t>
+              <w:t xml:space="preserve">Selbsteinschätzungsbogen; kurze begründete Stellungnahme; Austausch in PA, dann Plenum.</w:t>
             </w:r>
           </w:p>
         </w:tc>
@@ -9863,7 +9707,7 @@
                 <w:sz w:val="17"/>
                 <w:szCs w:val="17"/>
               </w:rPr>
-              <w:t xml:space="preserve">2.8 D · 2.11 C/D</w:t>
+              <w:t xml:space="preserve">2.7 D · 2.8 D · 2.11 C/D</w:t>
             </w:r>
           </w:p>
         </w:tc>
@@ -9937,7 +9781,7 @@
                 <w:sz w:val="19"/>
                 <w:szCs w:val="19"/>
               </w:rPr>
-              <w:t xml:space="preserve">44</w:t>
+              <w:t xml:space="preserve">43</w:t>
             </w:r>
           </w:p>
         </w:tc>
@@ -10037,7 +9881,7 @@
                 <w:sz w:val="19"/>
                 <w:szCs w:val="19"/>
               </w:rPr>
-              <w:t xml:space="preserve">Reserve für Verschiebungen.</w:t>
+              <w:t xml:space="preserve">Reserve für Verschiebungen (z. B. KA 1).</w:t>
             </w:r>
           </w:p>
         </w:tc>

</xml_diff>

<commit_message>
Grobplanung Balladen: KA 1 am 15.10., Mitarbeit-Selbsteinschätzung, Weihnachtsferien ab 23.12.; Bogen Mitarbeit
Co-Authored-By: Claude Opus 5.5 <noreply@anthropic.com>
Claude-Session: https://claude.ai/code/session_01KXvLXHMYPnCyEbMRgNaaYs
</commit_message>
<xml_diff>
--- a/Deutsch_7A/Balladen/Grobplanung_Balladen.docx
+++ b/Deutsch_7A/Balladen/Grobplanung_Balladen.docx
@@ -15,7 +15,7 @@
           <w:sz w:val="18"/>
           <w:szCs w:val="18"/>
         </w:rPr>
-        <w:t xml:space="preserve">GROBPLANUNG · DEUTSCH · KLASSE 7A · CA. 9 UNTERRICHTSWOCHEN · 5 STUNDEN PRO WOCHE · 43 STUNDEN</w:t>
+        <w:t xml:space="preserve">GROBPLANUNG · DEUTSCH · KLASSE 7A · CA. 9 UNTERRICHTSWOCHEN · 5 STUNDEN PRO WOCHE · 39 STUNDEN BALLADEN</w:t>
       </w:r>
     </w:p>
     <w:p>
@@ -189,7 +189,7 @@
                 <w:sz w:val="19"/>
                 <w:szCs w:val="19"/>
               </w:rPr>
-              <w:t xml:space="preserve">Bewertung 1: Analyse der Merkmale (Std. 19, Woche 5) · Bewertung 2: Textüberarbeitung aus der Figurenperspektive (Std. 25, Woche 6) · Bewertung 3: Rezitation einer selbst gewählten Ballade (Std. 39–41, nach den Weihnachtsferien)</w:t>
+              <w:t xml:space="preserve">Bewertung 1: Analyse der Merkmale (Std. 19, Woche 5) · Bewertung 2: Textüberarbeitung aus der Figurenperspektive (Std. 25, Woche 6) · Bewertung 3: Rezitation einer selbst gewählten Ballade (Std. 36–38, Woche 8–9, vor den Weihnachtsferien)</w:t>
             </w:r>
           </w:p>
         </w:tc>
@@ -301,7 +301,7 @@
                 <w:sz w:val="19"/>
                 <w:szCs w:val="19"/>
               </w:rPr>
-              <w:t xml:space="preserve">Termine / offen</w:t>
+              <w:t xml:space="preserve">Termine</w:t>
             </w:r>
           </w:p>
         </w:tc>
@@ -333,7 +333,7 @@
                 <w:sz w:val="19"/>
                 <w:szCs w:val="19"/>
               </w:rPr>
-              <w:t xml:space="preserve">Herbstferien 16.10.–2.11. sind eingeplant (Woche 1: 4 Std., Woche 2: 4 Std., da 2.11. frei). Weihnachtsferien angenommen ab 21.12. – Woche 9 liegt danach, bitte prüfen. KA 1 (Verben-Test) ist noch nicht terminiert; dafür den Puffer nutzen.</w:t>
+              <w:t xml:space="preserve">KA 1 (Verben) am Do 15.10. · Mitarbeit: Selbsteinschätzung Di 13.10. (20 Min.), Rückgabe mit Note Fr 16.10. · Herbstferien 17.10.–2.11. · Weihnachtsferien ab 23.12. · Woche 2: 4 Std. (2.11. frei), Woche 9: 21.–22.12. (Stundenzahl prüfen) · Kein eigener Puffer mehr: Std. 39 und die mit * markierten Teile können entfallen.</w:t>
             </w:r>
           </w:p>
         </w:tc>
@@ -630,7 +630,7 @@
                 <w:sz w:val="21"/>
                 <w:szCs w:val="21"/>
               </w:rPr>
-              <w:t xml:space="preserve">Woche 1 · 13.–15.10. · Was ist eine Ballade? – Lesetechniken</w:t>
+              <w:t xml:space="preserve">Woche 1 · 13.–16.10. · Was ist eine Ballade? – Lesetechniken</w:t>
             </w:r>
             <w:r>
               <w:rPr>
@@ -639,7 +639,7 @@
                 <w:sz w:val="18"/>
                 <w:szCs w:val="18"/>
               </w:rPr>
-              <w:t xml:space="preserve">   4 Stunden · John Maynard (Fontane)</w:t>
+              <w:t xml:space="preserve">   4 Stunden · John Maynard (Fontane) · KA 1 · Mitarbeit</w:t>
             </w:r>
           </w:p>
         </w:tc>
@@ -713,7 +713,7 @@
                 <w:sz w:val="19"/>
                 <w:szCs w:val="19"/>
               </w:rPr>
-              <w:t xml:space="preserve">Eine Ballade hören</w:t>
+              <w:t xml:space="preserve">Mitarbeit einschätzen (20′) · Eine Ballade hören (25′)</w:t>
             </w:r>
           </w:p>
         </w:tc>
@@ -747,7 +747,7 @@
                 <w:sz w:val="19"/>
                 <w:szCs w:val="19"/>
               </w:rPr>
-              <w:t xml:space="preserve">… beim Zuhören Notizen zu Figuren, Ort und Handlung machen.</w:t>
+              <w:t xml:space="preserve">… meine Mitarbeit nach Kriterien einschätzen. / … beim Zuhören Notizen zu Figuren, Ort und Handlung machen.</w:t>
             </w:r>
           </w:p>
         </w:tc>
@@ -779,7 +779,7 @@
                 <w:sz w:val="19"/>
                 <w:szCs w:val="19"/>
               </w:rPr>
-              <w:t xml:space="preserve">Hörfassung „John Maynard“ (z. B. Achim Reichel). Hörauftrag für alle: Notizraster wer – wo – was passiert – wie endet es. Zweites Hören: zu zweit ergänzen, dann Abgleich.</w:t>
+              <w:t xml:space="preserve">Selbsteinschätzungsbogen Mitarbeit ausfüllen, Lehrkraft sammelt ein. Danach Hörfassung „John Maynard“ (z. B. Achim Reichel) mit Notizraster wer – wo – was passiert – wie endet es; Abgleich zu zweit.</w:t>
             </w:r>
           </w:p>
         </w:tc>
@@ -985,7 +985,7 @@
                 <w:sz w:val="19"/>
                 <w:szCs w:val="19"/>
               </w:rPr>
-              <w:t xml:space="preserve">Merksatz Lesetechniken (Wofür? Test). Drei Aufträge am Text, alle arbeiten allein mit Zeitvorgabe: überfliegen (Worum geht es? 1 Min.), orientieren (Wo steht …? Stelle finden), genau lesen mit Randnotizen; unbekannte Wörter aus dem Kontext erschließen. Vergleich in PA.</w:t>
+              <w:t xml:space="preserve">Merksatz Lesetechniken (Wofür? Test). Drei Aufträge am Text, alle arbeiten allein mit Zeitvorgabe: überfliegen (Worum geht es? 1 Min.), orientieren (Wo steht …?), genau lesen mit Randnotizen; unbekannte Wörter aus dem Kontext erschließen. Vergleich in PA.</w:t>
             </w:r>
           </w:p>
         </w:tc>
@@ -1091,7 +1091,7 @@
                 <w:sz w:val="19"/>
                 <w:szCs w:val="19"/>
               </w:rPr>
-              <w:t xml:space="preserve">3</w:t>
+              <w:t xml:space="preserve">KA</w:t>
             </w:r>
           </w:p>
         </w:tc>
@@ -1125,7 +1125,7 @@
                 <w:sz w:val="19"/>
                 <w:szCs w:val="19"/>
               </w:rPr>
-              <w:t xml:space="preserve">Eine Ballade gliedern</w:t>
+              <w:t xml:space="preserve">KA 1: Verben und Zeitformen (Do 15.10.)</w:t>
             </w:r>
           </w:p>
         </w:tc>
@@ -1159,7 +1159,7 @@
                 <w:sz w:val="19"/>
                 <w:szCs w:val="19"/>
               </w:rPr>
-              <w:t xml:space="preserve">… eine Ballade in Abschnitte gliedern und Zwischenüberschriften formulieren.</w:t>
+              <w:t xml:space="preserve"/>
             </w:r>
           </w:p>
         </w:tc>
@@ -1191,7 +1191,7 @@
                 <w:sz w:val="19"/>
                 <w:szCs w:val="19"/>
               </w:rPr>
-              <w:t xml:space="preserve">Genaues Lesen anwenden: in PA Abschnitte markieren und Zwischenüberschriften notieren; danach Vergleich an der Tafel.</w:t>
+              <w:t xml:space="preserve">Klassenarbeit.</w:t>
             </w:r>
           </w:p>
         </w:tc>
@@ -1223,7 +1223,7 @@
                 <w:sz w:val="17"/>
                 <w:szCs w:val="17"/>
               </w:rPr>
-              <w:t xml:space="preserve">2.8 D</w:t>
+              <w:t xml:space="preserve"/>
             </w:r>
           </w:p>
         </w:tc>
@@ -1257,7 +1257,7 @@
                 <w:sz w:val="19"/>
                 <w:szCs w:val="19"/>
               </w:rPr>
-              <w:t xml:space="preserve"/>
+              <w:t xml:space="preserve">KA 1</w:t>
             </w:r>
           </w:p>
         </w:tc>
@@ -1297,7 +1297,7 @@
                 <w:sz w:val="19"/>
                 <w:szCs w:val="19"/>
               </w:rPr>
-              <w:t xml:space="preserve">4</w:t>
+              <w:t xml:space="preserve">3</w:t>
             </w:r>
           </w:p>
         </w:tc>
@@ -1331,7 +1331,7 @@
                 <w:sz w:val="19"/>
                 <w:szCs w:val="19"/>
               </w:rPr>
-              <w:t xml:space="preserve">Das „Ur-Ei“: episch, lyrisch, dramatisch</w:t>
+              <w:t xml:space="preserve">Rückgabe Mitarbeit (10′) · Eine Ballade gliedern (35′)</w:t>
             </w:r>
           </w:p>
         </w:tc>
@@ -1365,7 +1365,7 @@
                 <w:sz w:val="19"/>
                 <w:szCs w:val="19"/>
               </w:rPr>
-              <w:t xml:space="preserve">… an einer Ballade erzählende, lyrische und dramatische Elemente nachweisen.</w:t>
+              <w:t xml:space="preserve">… eine Ballade in Abschnitte gliedern und Zwischenüberschriften formulieren.</w:t>
             </w:r>
           </w:p>
         </w:tc>
@@ -1397,7 +1397,7 @@
                 <w:sz w:val="19"/>
                 <w:szCs w:val="19"/>
               </w:rPr>
-              <w:t xml:space="preserve">Merksatz Ballade (Goethe: „Ur-Ei“). Belegstellen in John Maynard in drei Farben markieren (allein), dann in PA vergleichen.</w:t>
+              <w:t xml:space="preserve">Bögen mit Einschätzung und Note der Lehrkraft zurück, kurze Einzelgespräche während der Arbeitsphase. Genaues Lesen anwenden: in PA Abschnitte markieren und Zwischenüberschriften notieren; Vergleich an der Tafel.</w:t>
             </w:r>
           </w:p>
         </w:tc>
@@ -1429,7 +1429,7 @@
                 <w:sz w:val="17"/>
                 <w:szCs w:val="17"/>
               </w:rPr>
-              <w:t xml:space="preserve">2.9 D</w:t>
+              <w:t xml:space="preserve">2.8 D</w:t>
             </w:r>
           </w:p>
         </w:tc>
@@ -1504,7 +1504,7 @@
                 <w:sz w:val="21"/>
                 <w:szCs w:val="21"/>
               </w:rPr>
-              <w:t xml:space="preserve">Herbstferien 16.10.–2.11.</w:t>
+              <w:t xml:space="preserve">Herbstferien 17.10.–2.11.</w:t>
             </w:r>
             <w:r>
               <w:rPr>
@@ -1603,7 +1603,7 @@
                 <w:sz w:val="19"/>
                 <w:szCs w:val="19"/>
               </w:rPr>
-              <w:t xml:space="preserve">5</w:t>
+              <w:t xml:space="preserve">4</w:t>
             </w:r>
           </w:p>
         </w:tc>
@@ -1637,7 +1637,7 @@
                 <w:sz w:val="19"/>
                 <w:szCs w:val="19"/>
               </w:rPr>
-              <w:t xml:space="preserve">Strophe, Vers, Reim</w:t>
+              <w:t xml:space="preserve">Das „Ur-Ei“: episch, lyrisch, dramatisch</w:t>
             </w:r>
           </w:p>
         </w:tc>
@@ -1671,7 +1671,7 @@
                 <w:sz w:val="19"/>
                 <w:szCs w:val="19"/>
               </w:rPr>
-              <w:t xml:space="preserve">… Strophe und Vers unterscheiden und Paarreim, Kreuzreim und umarmenden Reim bestimmen.</w:t>
+              <w:t xml:space="preserve">… an einer Ballade erzählende, lyrische und dramatische Elemente nachweisen.</w:t>
             </w:r>
           </w:p>
         </w:tc>
@@ -1703,7 +1703,7 @@
                 <w:sz w:val="19"/>
                 <w:szCs w:val="19"/>
               </w:rPr>
-              <w:t xml:space="preserve">Einstieg nach den Ferien: Wiederholung Lesetechniken und Ur-Ei. Merksatz Reimformen; Reimschema an Strophen bestimmen (Schnipsel); Speed-Duell zu Reimformen.</w:t>
+              <w:t xml:space="preserve">Einstieg nach den Ferien: Lesetechniken und Gliederung wiederholen. Merksatz Ballade (Goethe: „Ur-Ei“); Belegstellen in drei Farben markieren (allein), dann PA.</w:t>
             </w:r>
           </w:p>
         </w:tc>
@@ -1809,7 +1809,7 @@
                 <w:sz w:val="19"/>
                 <w:szCs w:val="19"/>
               </w:rPr>
-              <w:t xml:space="preserve">6</w:t>
+              <w:t xml:space="preserve">5</w:t>
             </w:r>
           </w:p>
         </w:tc>
@@ -1843,7 +1843,7 @@
                 <w:sz w:val="19"/>
                 <w:szCs w:val="19"/>
               </w:rPr>
-              <w:t xml:space="preserve">Der Spannungsbogen</w:t>
+              <w:t xml:space="preserve">Strophe, Vers, Reim</w:t>
             </w:r>
           </w:p>
         </w:tc>
@@ -1877,7 +1877,7 @@
                 <w:sz w:val="19"/>
                 <w:szCs w:val="19"/>
               </w:rPr>
-              <w:t xml:space="preserve">… den Handlungsverlauf einer Ballade als Spannungskurve darstellen und begründen.</w:t>
+              <w:t xml:space="preserve">… Strophe und Vers unterscheiden und Paarreim, Kreuzreim und umarmenden Reim bestimmen.</w:t>
             </w:r>
           </w:p>
         </w:tc>
@@ -1909,7 +1909,7 @@
                 <w:sz w:val="19"/>
                 <w:szCs w:val="19"/>
               </w:rPr>
-              <w:t xml:space="preserve">Spannungskurve zeichnen (allein), Höhepunkt mit Textstelle belegen; Vergleich in PA.</w:t>
+              <w:t xml:space="preserve">Merksatz Reimformen; Reimschema an Strophen bestimmen (Schnipsel); Speed-Duell zu Reimformen.</w:t>
             </w:r>
           </w:p>
         </w:tc>
@@ -1941,7 +1941,7 @@
                 <w:sz w:val="17"/>
                 <w:szCs w:val="17"/>
               </w:rPr>
-              <w:t xml:space="preserve">2.8 E · 2.9 F</w:t>
+              <w:t xml:space="preserve">2.9 D</w:t>
             </w:r>
           </w:p>
         </w:tc>
@@ -2015,7 +2015,7 @@
                 <w:sz w:val="19"/>
                 <w:szCs w:val="19"/>
               </w:rPr>
-              <w:t xml:space="preserve">7</w:t>
+              <w:t xml:space="preserve">6</w:t>
             </w:r>
           </w:p>
         </w:tc>
@@ -2049,7 +2049,7 @@
                 <w:sz w:val="19"/>
                 <w:szCs w:val="19"/>
               </w:rPr>
-              <w:t xml:space="preserve">Erzählzeit und erzählte Zeit</w:t>
+              <w:t xml:space="preserve">Der Spannungsbogen</w:t>
             </w:r>
           </w:p>
         </w:tc>
@@ -2083,7 +2083,7 @@
                 <w:sz w:val="19"/>
                 <w:szCs w:val="19"/>
               </w:rPr>
-              <w:t xml:space="preserve">… Erzählzeit und erzählte Zeit unterscheiden und ihre Wirkung erklären.</w:t>
+              <w:t xml:space="preserve">… den Handlungsverlauf einer Ballade als Spannungskurve darstellen und begründen.</w:t>
             </w:r>
           </w:p>
         </w:tc>
@@ -2115,7 +2115,7 @@
                 <w:sz w:val="19"/>
                 <w:szCs w:val="19"/>
               </w:rPr>
-              <w:t xml:space="preserve">Countdown „Noch zwanzig Minuten …“: Zeitangaben markieren, Zeitraffung und -dehnung erkennen, Wirkung auf die Spannung beschreiben.</w:t>
+              <w:t xml:space="preserve">Spannungskurve zeichnen (allein), Höhepunkt mit Textstelle belegen; Vergleich in PA.</w:t>
             </w:r>
           </w:p>
         </w:tc>
@@ -2147,7 +2147,7 @@
                 <w:sz w:val="17"/>
                 <w:szCs w:val="17"/>
               </w:rPr>
-              <w:t xml:space="preserve">2.9 F</w:t>
+              <w:t xml:space="preserve">2.8 E · 2.9 F</w:t>
             </w:r>
           </w:p>
         </w:tc>
@@ -2221,7 +2221,7 @@
                 <w:sz w:val="19"/>
                 <w:szCs w:val="19"/>
               </w:rPr>
-              <w:t xml:space="preserve">8</w:t>
+              <w:t xml:space="preserve">7</w:t>
             </w:r>
           </w:p>
         </w:tc>
@@ -2255,7 +2255,7 @@
                 <w:sz w:val="19"/>
                 <w:szCs w:val="19"/>
               </w:rPr>
-              <w:t xml:space="preserve">Fakten hinter der Ballade</w:t>
+              <w:t xml:space="preserve">Erzählzeit und erzählte Zeit</w:t>
             </w:r>
           </w:p>
         </w:tc>
@@ -2289,7 +2289,7 @@
                 <w:sz w:val="19"/>
                 <w:szCs w:val="19"/>
               </w:rPr>
-              <w:t xml:space="preserve">… einen Sachtext mit der passenden Lesetechnik lesen und Informationen auf Verlässlichkeit prüfen.</w:t>
+              <w:t xml:space="preserve">… Erzählzeit und erzählte Zeit unterscheiden und ihre Wirkung erklären.</w:t>
             </w:r>
           </w:p>
         </w:tc>
@@ -2321,7 +2321,7 @@
                 <w:sz w:val="19"/>
                 <w:szCs w:val="19"/>
               </w:rPr>
-              <w:t xml:space="preserve">Sachtext zum Unglück der „Erie“ (1841) und zu Fontane; Lesetechniken gezielt wählen; zwei Quellen vergleichen: Was ist belegt, was erfunden?</w:t>
+              <w:t xml:space="preserve">Countdown „Noch zwanzig Minuten …“: Zeitangaben markieren, Zeitraffung und -dehnung erkennen, Wirkung beschreiben.</w:t>
             </w:r>
           </w:p>
         </w:tc>
@@ -2353,7 +2353,7 @@
                 <w:sz w:val="17"/>
                 <w:szCs w:val="17"/>
               </w:rPr>
-              <w:t xml:space="preserve">2.8 D/E · 2.10 D/E</w:t>
+              <w:t xml:space="preserve">2.9 F</w:t>
             </w:r>
           </w:p>
         </w:tc>
@@ -2477,7 +2477,7 @@
                 <w:sz w:val="19"/>
                 <w:szCs w:val="19"/>
               </w:rPr>
-              <w:t xml:space="preserve">9</w:t>
+              <w:t xml:space="preserve">8</w:t>
             </w:r>
           </w:p>
         </w:tc>
@@ -2511,7 +2511,7 @@
                 <w:sz w:val="19"/>
                 <w:szCs w:val="19"/>
               </w:rPr>
-              <w:t xml:space="preserve">Ein Held? John Maynard</w:t>
+              <w:t xml:space="preserve">Fakten hinter der Ballade</w:t>
             </w:r>
           </w:p>
         </w:tc>
@@ -2545,7 +2545,7 @@
                 <w:sz w:val="19"/>
                 <w:szCs w:val="19"/>
               </w:rPr>
-              <w:t xml:space="preserve">… eine Figur beschreiben und meine Einschätzung am Text begründen.</w:t>
+              <w:t xml:space="preserve">… einen Sachtext mit der passenden Lesetechnik lesen und Informationen auf Verlässlichkeit prüfen.</w:t>
             </w:r>
           </w:p>
         </w:tc>
@@ -2577,7 +2577,7 @@
                 <w:sz w:val="19"/>
                 <w:szCs w:val="19"/>
               </w:rPr>
-              <w:t xml:space="preserve">Figurenbeschreibung mit Textbelegen; Positionslinie „Held oder Pflichterfüllung?“</w:t>
+              <w:t xml:space="preserve">Sachtext zum Unglück der „Erie“ (1841) und zu Fontane; Lesetechnik selbst wählen; zwei Quellen vergleichen: Was ist belegt, was erfunden?</w:t>
             </w:r>
           </w:p>
         </w:tc>
@@ -2609,7 +2609,7 @@
                 <w:sz w:val="17"/>
                 <w:szCs w:val="17"/>
               </w:rPr>
-              <w:t xml:space="preserve">2.8 D · 2.9 E</w:t>
+              <w:t xml:space="preserve">2.8 D/E · 2.10 D/E</w:t>
             </w:r>
           </w:p>
         </w:tc>
@@ -2683,7 +2683,7 @@
                 <w:sz w:val="19"/>
                 <w:szCs w:val="19"/>
               </w:rPr>
-              <w:t xml:space="preserve">10</w:t>
+              <w:t xml:space="preserve">9</w:t>
             </w:r>
           </w:p>
         </w:tc>
@@ -2717,7 +2717,7 @@
                 <w:sz w:val="19"/>
                 <w:szCs w:val="19"/>
               </w:rPr>
-              <w:t xml:space="preserve">Ein Konflikt beginnt</w:t>
+              <w:t xml:space="preserve">Ein Held? John Maynard</w:t>
             </w:r>
           </w:p>
         </w:tc>
@@ -2751,7 +2751,7 @@
                 <w:sz w:val="19"/>
                 <w:szCs w:val="19"/>
               </w:rPr>
-              <w:t xml:space="preserve">… den Ausgangskonflikt einer Ballade benennen und Vermutungen zum Verlauf begründen.</w:t>
+              <w:t xml:space="preserve">… eine Figur beschreiben und meine Einschätzung am Text begründen.</w:t>
             </w:r>
           </w:p>
         </w:tc>
@@ -2783,7 +2783,7 @@
                 <w:sz w:val="19"/>
                 <w:szCs w:val="19"/>
               </w:rPr>
-              <w:t xml:space="preserve">Bürgschaft Strophen 1–7 lesen bzw. hören; Konflikt Möros – Dionys herausarbeiten; Vermutungen schriftlich, dann Weiterlesen.</w:t>
+              <w:t xml:space="preserve">Figurenbeschreibung mit Textbelegen; Positionslinie „Held oder Pflichterfüllung?“</w:t>
             </w:r>
           </w:p>
         </w:tc>
@@ -2815,7 +2815,7 @@
                 <w:sz w:val="17"/>
                 <w:szCs w:val="17"/>
               </w:rPr>
-              <w:t xml:space="preserve">2.8 D · 2.9 F</w:t>
+              <w:t xml:space="preserve">2.8 D · 2.9 E</w:t>
             </w:r>
           </w:p>
         </w:tc>
@@ -2889,7 +2889,7 @@
                 <w:sz w:val="19"/>
                 <w:szCs w:val="19"/>
               </w:rPr>
-              <w:t xml:space="preserve">11</w:t>
+              <w:t xml:space="preserve">10</w:t>
             </w:r>
           </w:p>
         </w:tc>
@@ -2923,7 +2923,7 @@
                 <w:sz w:val="19"/>
                 <w:szCs w:val="19"/>
               </w:rPr>
-              <w:t xml:space="preserve">Ein Lauf gegen die Zeit</w:t>
+              <w:t xml:space="preserve">Ein Konflikt beginnt</w:t>
             </w:r>
           </w:p>
         </w:tc>
@@ -2957,7 +2957,7 @@
                 <w:sz w:val="19"/>
                 <w:szCs w:val="19"/>
               </w:rPr>
-              <w:t xml:space="preserve">… die Hindernisse der Handlung in einer Grafik darstellen.</w:t>
+              <w:t xml:space="preserve">… den Ausgangskonflikt einer Ballade benennen und Vermutungen zum Verlauf begründen.</w:t>
             </w:r>
           </w:p>
         </w:tc>
@@ -2989,7 +2989,7 @@
                 <w:sz w:val="19"/>
                 <w:szCs w:val="19"/>
               </w:rPr>
-              <w:t xml:space="preserve">Hindernisse als Grafik (Fluss, Räuber, Hitze); Was treibt Möros an? (Bezug Ausdauer und Durchhalten bietet sich an.)</w:t>
+              <w:t xml:space="preserve">Bürgschaft Strophen 1–7 lesen bzw. hören; Konflikt Möros – Dionys; Vermutungen schriftlich, dann Weiterlesen.</w:t>
             </w:r>
           </w:p>
         </w:tc>
@@ -3021,7 +3021,7 @@
                 <w:sz w:val="17"/>
                 <w:szCs w:val="17"/>
               </w:rPr>
-              <w:t xml:space="preserve">2.8 E · 2.9 F</w:t>
+              <w:t xml:space="preserve">2.8 D · 2.9 F</w:t>
             </w:r>
           </w:p>
         </w:tc>
@@ -3095,7 +3095,7 @@
                 <w:sz w:val="19"/>
                 <w:szCs w:val="19"/>
               </w:rPr>
-              <w:t xml:space="preserve">12</w:t>
+              <w:t xml:space="preserve">11</w:t>
             </w:r>
           </w:p>
         </w:tc>
@@ -3129,7 +3129,7 @@
                 <w:sz w:val="19"/>
                 <w:szCs w:val="19"/>
               </w:rPr>
-              <w:t xml:space="preserve">Figurenkonstellation</w:t>
+              <w:t xml:space="preserve">Ein Lauf gegen die Zeit</w:t>
             </w:r>
           </w:p>
         </w:tc>
@@ -3163,7 +3163,7 @@
                 <w:sz w:val="19"/>
                 <w:szCs w:val="19"/>
               </w:rPr>
-              <w:t xml:space="preserve">… die Beziehungen der Figuren in einem Schaubild darstellen.</w:t>
+              <w:t xml:space="preserve">… die Hindernisse der Handlung in einer Grafik darstellen.</w:t>
             </w:r>
           </w:p>
         </w:tc>
@@ -3195,7 +3195,7 @@
                 <w:sz w:val="19"/>
                 <w:szCs w:val="19"/>
               </w:rPr>
-              <w:t xml:space="preserve">Schaubild (Dionys, Möros, Freund, Philostratus) allein, dann in PA ergänzen; Beziehungspfeile beschriften.</w:t>
+              <w:t xml:space="preserve">Hindernisse als Grafik (Fluss, Räuber, Hitze); Was treibt Möros an? (Bezug Ausdauer bietet sich an.)</w:t>
             </w:r>
           </w:p>
         </w:tc>
@@ -3227,7 +3227,7 @@
                 <w:sz w:val="17"/>
                 <w:szCs w:val="17"/>
               </w:rPr>
-              <w:t xml:space="preserve">2.9 E</w:t>
+              <w:t xml:space="preserve">2.8 E · 2.9 F</w:t>
             </w:r>
           </w:p>
         </w:tc>
@@ -3301,7 +3301,7 @@
                 <w:sz w:val="19"/>
                 <w:szCs w:val="19"/>
               </w:rPr>
-              <w:t xml:space="preserve">13</w:t>
+              <w:t xml:space="preserve">12</w:t>
             </w:r>
           </w:p>
         </w:tc>
@@ -3335,7 +3335,7 @@
                 <w:sz w:val="19"/>
                 <w:szCs w:val="19"/>
               </w:rPr>
-              <w:t xml:space="preserve">Eine Figur verändert sich</w:t>
+              <w:t xml:space="preserve">Figurenkonstellation</w:t>
             </w:r>
           </w:p>
         </w:tc>
@@ -3369,7 +3369,7 @@
                 <w:sz w:val="19"/>
                 <w:szCs w:val="19"/>
               </w:rPr>
-              <w:t xml:space="preserve">… die Entwicklung einer Figur beschreiben und am Text belegen.</w:t>
+              <w:t xml:space="preserve">… die Beziehungen der Figuren in einem Schaubild darstellen.</w:t>
             </w:r>
           </w:p>
         </w:tc>
@@ -3401,7 +3401,7 @@
                 <w:sz w:val="19"/>
                 <w:szCs w:val="19"/>
               </w:rPr>
-              <w:t xml:space="preserve">Dionys am Anfang und am Ende: Zitate sammeln, Wandel begründen; einfache Zitiertechnik (Strophe/Vers).</w:t>
+              <w:t xml:space="preserve">Schaubild (Dionys, Möros, Freund, Philostratus) allein, dann in PA ergänzen.</w:t>
             </w:r>
           </w:p>
         </w:tc>
@@ -3433,7 +3433,7 @@
                 <w:sz w:val="17"/>
                 <w:szCs w:val="17"/>
               </w:rPr>
-              <w:t xml:space="preserve">2.9 E/F</w:t>
+              <w:t xml:space="preserve">2.9 E</w:t>
             </w:r>
           </w:p>
         </w:tc>
@@ -3557,7 +3557,7 @@
                 <w:sz w:val="19"/>
                 <w:szCs w:val="19"/>
               </w:rPr>
-              <w:t xml:space="preserve">14</w:t>
+              <w:t xml:space="preserve">13</w:t>
             </w:r>
           </w:p>
         </w:tc>
@@ -3591,7 +3591,7 @@
                 <w:sz w:val="19"/>
                 <w:szCs w:val="19"/>
               </w:rPr>
-              <w:t xml:space="preserve">Sprache und Wirkung</w:t>
+              <w:t xml:space="preserve">Eine Figur verändert sich</w:t>
             </w:r>
           </w:p>
         </w:tc>
@@ -3625,7 +3625,7 @@
                 <w:sz w:val="19"/>
                 <w:szCs w:val="19"/>
               </w:rPr>
-              <w:t xml:space="preserve">… sprachliche Mittel erkennen und ihre Wirkung fachsprachlich beschreiben.</w:t>
+              <w:t xml:space="preserve">… die Entwicklung einer Figur beschreiben und am Text belegen.</w:t>
             </w:r>
           </w:p>
         </w:tc>
@@ -3657,7 +3657,7 @@
                 <w:sz w:val="19"/>
                 <w:szCs w:val="19"/>
               </w:rPr>
-              <w:t xml:space="preserve">Wortwahl, Wiederholung, sprachliche Bilder in ausgewählten Strophen der Bürgschaft; Wirkung mit Formulierungshilfen beschreiben.</w:t>
+              <w:t xml:space="preserve">Dionys am Anfang und am Ende: Zitate sammeln, Wandel begründen; einfache Zitiertechnik (Strophe/Vers).</w:t>
             </w:r>
           </w:p>
         </w:tc>
@@ -3689,7 +3689,7 @@
                 <w:sz w:val="17"/>
                 <w:szCs w:val="17"/>
               </w:rPr>
-              <w:t xml:space="preserve">2.9 E</w:t>
+              <w:t xml:space="preserve">2.9 E/F</w:t>
             </w:r>
           </w:p>
         </w:tc>
@@ -3763,7 +3763,7 @@
                 <w:sz w:val="19"/>
                 <w:szCs w:val="19"/>
               </w:rPr>
-              <w:t xml:space="preserve">15</w:t>
+              <w:t xml:space="preserve">14</w:t>
             </w:r>
           </w:p>
         </w:tc>
@@ -3797,7 +3797,7 @@
                 <w:sz w:val="19"/>
                 <w:szCs w:val="19"/>
               </w:rPr>
-              <w:t xml:space="preserve">Der Handschuh</w:t>
+              <w:t xml:space="preserve">Sprache und Wirkung</w:t>
             </w:r>
           </w:p>
         </w:tc>
@@ -3831,7 +3831,7 @@
                 <w:sz w:val="19"/>
                 <w:szCs w:val="19"/>
               </w:rPr>
-              <w:t xml:space="preserve">… den Inhalt einer Ballade erfassen und gliedern (binnendifferenziert).</w:t>
+              <w:t xml:space="preserve">… sprachliche Mittel erkennen und ihre Wirkung fachsprachlich beschreiben.</w:t>
             </w:r>
           </w:p>
         </w:tc>
@@ -3863,7 +3863,7 @@
                 <w:sz w:val="19"/>
                 <w:szCs w:val="19"/>
               </w:rPr>
-              <w:t xml:space="preserve">Lesen mit gestuften Hilfen (Worterklärungen, Leitfragen); Gliederung mit Zwischenüberschriften.</w:t>
+              <w:t xml:space="preserve">Wortwahl, Wiederholung, sprachliche Bilder; Wirkung mit Formulierungshilfen beschreiben.</w:t>
             </w:r>
           </w:p>
         </w:tc>
@@ -3895,7 +3895,7 @@
                 <w:sz w:val="17"/>
                 <w:szCs w:val="17"/>
               </w:rPr>
-              <w:t xml:space="preserve">2.8 D/E</w:t>
+              <w:t xml:space="preserve">2.9 E</w:t>
             </w:r>
           </w:p>
         </w:tc>
@@ -3969,7 +3969,7 @@
                 <w:sz w:val="19"/>
                 <w:szCs w:val="19"/>
               </w:rPr>
-              <w:t xml:space="preserve">16</w:t>
+              <w:t xml:space="preserve">15</w:t>
             </w:r>
           </w:p>
         </w:tc>
@@ -4003,7 +4003,7 @@
                 <w:sz w:val="19"/>
                 <w:szCs w:val="19"/>
               </w:rPr>
-              <w:t xml:space="preserve">Mutprobe oder Demütigung?</w:t>
+              <w:t xml:space="preserve">Der Handschuh</w:t>
             </w:r>
           </w:p>
         </w:tc>
@@ -4037,7 +4037,7 @@
                 <w:sz w:val="19"/>
                 <w:szCs w:val="19"/>
               </w:rPr>
-              <w:t xml:space="preserve">… das Verhalten zweier Figuren bewerten und meine Deutung am Text belegen.</w:t>
+              <w:t xml:space="preserve">… den Inhalt einer Ballade erfassen und gliedern (binnendifferenziert).</w:t>
             </w:r>
           </w:p>
         </w:tc>
@@ -4069,7 +4069,7 @@
                 <w:sz w:val="19"/>
                 <w:szCs w:val="19"/>
               </w:rPr>
-              <w:t xml:space="preserve">Kunigunde und Delorges: Positionen sammeln und mit Zitaten belegen.</w:t>
+              <w:t xml:space="preserve">Lesen mit gestuften Hilfen (Worterklärungen, Leitfragen); Gliederung mit Zwischenüberschriften.</w:t>
             </w:r>
           </w:p>
         </w:tc>
@@ -4101,7 +4101,7 @@
                 <w:sz w:val="17"/>
                 <w:szCs w:val="17"/>
               </w:rPr>
-              <w:t xml:space="preserve">2.9 E</w:t>
+              <w:t xml:space="preserve">2.8 D/E</w:t>
             </w:r>
           </w:p>
         </w:tc>
@@ -4175,7 +4175,7 @@
                 <w:sz w:val="19"/>
                 <w:szCs w:val="19"/>
               </w:rPr>
-              <w:t xml:space="preserve">17</w:t>
+              <w:t xml:space="preserve">16</w:t>
             </w:r>
           </w:p>
         </w:tc>
@@ -4209,7 +4209,7 @@
                 <w:sz w:val="19"/>
                 <w:szCs w:val="19"/>
               </w:rPr>
-              <w:t xml:space="preserve">Wie analysiere ich eine Ballade?</w:t>
+              <w:t xml:space="preserve">Mutprobe oder Demütigung?</w:t>
             </w:r>
           </w:p>
         </w:tc>
@@ -4243,7 +4243,7 @@
                 <w:sz w:val="19"/>
                 <w:szCs w:val="19"/>
               </w:rPr>
-              <w:t xml:space="preserve">… eine Ballade nach Inhalt, Form und Sprache untersuchen.</w:t>
+              <w:t xml:space="preserve">… das Verhalten zweier Figuren bewerten und meine Deutung am Text belegen.</w:t>
             </w:r>
           </w:p>
         </w:tc>
@@ -4275,7 +4275,7 @@
                 <w:sz w:val="19"/>
                 <w:szCs w:val="19"/>
               </w:rPr>
-              <w:t xml:space="preserve">Checkliste Inhalt – Form – Sprache gemeinsam erarbeiten; Musteranalyse einer Strophe; Formulierungshilfen.</w:t>
+              <w:t xml:space="preserve">Kunigunde und Delorges: Positionen sammeln und mit Zitaten belegen.</w:t>
             </w:r>
           </w:p>
         </w:tc>
@@ -4307,7 +4307,7 @@
                 <w:sz w:val="17"/>
                 <w:szCs w:val="17"/>
               </w:rPr>
-              <w:t xml:space="preserve">2.9 D/E</w:t>
+              <w:t xml:space="preserve">2.9 E</w:t>
             </w:r>
           </w:p>
         </w:tc>
@@ -4381,7 +4381,7 @@
                 <w:sz w:val="19"/>
                 <w:szCs w:val="19"/>
               </w:rPr>
-              <w:t xml:space="preserve">18</w:t>
+              <w:t xml:space="preserve">17</w:t>
             </w:r>
           </w:p>
         </w:tc>
@@ -4415,7 +4415,7 @@
                 <w:sz w:val="19"/>
                 <w:szCs w:val="19"/>
               </w:rPr>
-              <w:t xml:space="preserve">Analyse üben</w:t>
+              <w:t xml:space="preserve">Wie analysiere ich eine Ballade?</w:t>
             </w:r>
           </w:p>
         </w:tc>
@@ -4449,7 +4449,7 @@
                 <w:sz w:val="19"/>
                 <w:szCs w:val="19"/>
               </w:rPr>
-              <w:t xml:space="preserve">… eine Ballade mithilfe der Checkliste analysieren und überprüfen.</w:t>
+              <w:t xml:space="preserve">… eine Ballade nach Inhalt, Form und Sprache untersuchen.</w:t>
             </w:r>
           </w:p>
         </w:tc>
@@ -4481,7 +4481,7 @@
                 <w:sz w:val="19"/>
                 <w:szCs w:val="19"/>
               </w:rPr>
-              <w:t xml:space="preserve">Analyse allein schreiben, in PA mit Checkliste prüfen, mit Grün verbessern.</w:t>
+              <w:t xml:space="preserve">Checkliste Inhalt – Form – Sprache gemeinsam erarbeiten; Musteranalyse einer Strophe; Formulierungshilfen.</w:t>
             </w:r>
           </w:p>
         </w:tc>
@@ -4597,7 +4597,7 @@
                 <w:sz w:val="18"/>
                 <w:szCs w:val="18"/>
               </w:rPr>
-              <w:t xml:space="preserve">   5 Stunden · Bürgschaft / Handschuh / John Maynard</w:t>
+              <w:t xml:space="preserve">   5 Stunden</w:t>
             </w:r>
           </w:p>
         </w:tc>
@@ -4637,7 +4637,7 @@
                 <w:sz w:val="19"/>
                 <w:szCs w:val="19"/>
               </w:rPr>
-              <w:t xml:space="preserve">19</w:t>
+              <w:t xml:space="preserve">18</w:t>
             </w:r>
           </w:p>
         </w:tc>
@@ -4671,7 +4671,7 @@
                 <w:sz w:val="19"/>
                 <w:szCs w:val="19"/>
               </w:rPr>
-              <w:t xml:space="preserve">Leistung: Analyse</w:t>
+              <w:t xml:space="preserve">Analyse üben</w:t>
             </w:r>
           </w:p>
         </w:tc>
@@ -4705,7 +4705,7 @@
                 <w:sz w:val="19"/>
                 <w:szCs w:val="19"/>
               </w:rPr>
-              <w:t xml:space="preserve">… eine Ballade hinsichtlich ihrer Merkmale analysieren.</w:t>
+              <w:t xml:space="preserve">… eine Ballade mithilfe der Checkliste analysieren und überprüfen.</w:t>
             </w:r>
           </w:p>
         </w:tc>
@@ -4737,7 +4737,7 @@
                 <w:sz w:val="19"/>
                 <w:szCs w:val="19"/>
               </w:rPr>
-              <w:t xml:space="preserve">Schriftliche Analyse (behandelte Ballade oder kurze neue Strophenfolge).</w:t>
+              <w:t xml:space="preserve">Analyse allein schreiben, in PA mit Checkliste prüfen, mit Grün verbessern.</w:t>
             </w:r>
           </w:p>
         </w:tc>
@@ -4769,7 +4769,7 @@
                 <w:sz w:val="17"/>
                 <w:szCs w:val="17"/>
               </w:rPr>
-              <w:t xml:space="preserve">2.9</w:t>
+              <w:t xml:space="preserve">2.9 D/E</w:t>
             </w:r>
           </w:p>
         </w:tc>
@@ -4803,7 +4803,7 @@
                 <w:sz w:val="19"/>
                 <w:szCs w:val="19"/>
               </w:rPr>
-              <w:t xml:space="preserve">Bewertung 1: Analyse</w:t>
+              <w:t xml:space="preserve"/>
             </w:r>
           </w:p>
         </w:tc>
@@ -4843,7 +4843,7 @@
                 <w:sz w:val="19"/>
                 <w:szCs w:val="19"/>
               </w:rPr>
-              <w:t xml:space="preserve">20</w:t>
+              <w:t xml:space="preserve">19</w:t>
             </w:r>
           </w:p>
         </w:tc>
@@ -4877,7 +4877,7 @@
                 <w:sz w:val="19"/>
                 <w:szCs w:val="19"/>
               </w:rPr>
-              <w:t xml:space="preserve">Perspektive wechseln</w:t>
+              <w:t xml:space="preserve">Leistung: Analyse</w:t>
             </w:r>
           </w:p>
         </w:tc>
@@ -4911,7 +4911,7 @@
                 <w:sz w:val="19"/>
                 <w:szCs w:val="19"/>
               </w:rPr>
-              <w:t xml:space="preserve">… Erzähler und Figur unterscheiden und Gefühle einer Figur aus dem Text erschließen.</w:t>
+              <w:t xml:space="preserve">… eine Ballade hinsichtlich ihrer Merkmale analysieren.</w:t>
             </w:r>
           </w:p>
         </w:tc>
@@ -4943,7 +4943,7 @@
                 <w:sz w:val="19"/>
                 <w:szCs w:val="19"/>
               </w:rPr>
-              <w:t xml:space="preserve">Erzählperspektive bestimmen; Gefühlskurve einer Figur (z. B. der Freund als Bürge) mit Textbelegen.</w:t>
+              <w:t xml:space="preserve">Schriftliche Analyse (behandelte Ballade oder kurze neue Strophenfolge).</w:t>
             </w:r>
           </w:p>
         </w:tc>
@@ -4975,7 +4975,7 @@
                 <w:sz w:val="17"/>
                 <w:szCs w:val="17"/>
               </w:rPr>
-              <w:t xml:space="preserve">2.9 E</w:t>
+              <w:t xml:space="preserve">2.9</w:t>
             </w:r>
           </w:p>
         </w:tc>
@@ -5009,7 +5009,7 @@
                 <w:sz w:val="19"/>
                 <w:szCs w:val="19"/>
               </w:rPr>
-              <w:t xml:space="preserve"/>
+              <w:t xml:space="preserve">Bewertung 1: Analyse</w:t>
             </w:r>
           </w:p>
         </w:tc>
@@ -5049,7 +5049,7 @@
                 <w:sz w:val="19"/>
                 <w:szCs w:val="19"/>
               </w:rPr>
-              <w:t xml:space="preserve">21</w:t>
+              <w:t xml:space="preserve">20</w:t>
             </w:r>
           </w:p>
         </w:tc>
@@ -5083,7 +5083,7 @@
                 <w:sz w:val="19"/>
                 <w:szCs w:val="19"/>
               </w:rPr>
-              <w:t xml:space="preserve">Textformen und Schreibplan</w:t>
+              <w:t xml:space="preserve">Perspektive wechseln</w:t>
             </w:r>
           </w:p>
         </w:tc>
@@ -5117,7 +5117,7 @@
                 <w:sz w:val="19"/>
                 <w:szCs w:val="19"/>
               </w:rPr>
-              <w:t xml:space="preserve">… Merkmale von Tagebuch, Brief und Chatverlauf nennen und einen Schreibplan anlegen.</w:t>
+              <w:t xml:space="preserve">… Erzähler und Figur unterscheiden und Gefühle einer Figur aus dem Text erschließen.</w:t>
             </w:r>
           </w:p>
         </w:tc>
@@ -5149,7 +5149,7 @@
                 <w:sz w:val="19"/>
                 <w:szCs w:val="19"/>
               </w:rPr>
-              <w:t xml:space="preserve">Merkmale vergleichen; Figur und Textform wählen; Schreibplan (Cluster/Stichpunkte).</w:t>
+              <w:t xml:space="preserve">Erzählperspektive bestimmen; Gefühlskurve einer Figur (z. B. der Freund als Bürge) mit Textbelegen.</w:t>
             </w:r>
           </w:p>
         </w:tc>
@@ -5181,7 +5181,7 @@
                 <w:sz w:val="17"/>
                 <w:szCs w:val="17"/>
               </w:rPr>
-              <w:t xml:space="preserve">2.6 D/F</w:t>
+              <w:t xml:space="preserve">2.9 E</w:t>
             </w:r>
           </w:p>
         </w:tc>
@@ -5255,7 +5255,7 @@
                 <w:sz w:val="19"/>
                 <w:szCs w:val="19"/>
               </w:rPr>
-              <w:t xml:space="preserve">22</w:t>
+              <w:t xml:space="preserve">21</w:t>
             </w:r>
           </w:p>
         </w:tc>
@@ -5289,7 +5289,7 @@
                 <w:sz w:val="19"/>
                 <w:szCs w:val="19"/>
               </w:rPr>
-              <w:t xml:space="preserve">Entwurf schreiben</w:t>
+              <w:t xml:space="preserve">Textformen und Schreibplan</w:t>
             </w:r>
           </w:p>
         </w:tc>
@@ -5323,7 +5323,7 @@
                 <w:sz w:val="19"/>
                 <w:szCs w:val="19"/>
               </w:rPr>
-              <w:t xml:space="preserve">… einen Text aus der Sicht einer Figur schreiben.</w:t>
+              <w:t xml:space="preserve">… Merkmale von Tagebuch, Brief und Chatverlauf nennen und einen Schreibplan anlegen.</w:t>
             </w:r>
           </w:p>
         </w:tc>
@@ -5355,7 +5355,7 @@
                 <w:sz w:val="19"/>
                 <w:szCs w:val="19"/>
               </w:rPr>
-              <w:t xml:space="preserve">Entwurf mit Satzanfängen als Formulierungshilfe (keine fertigen Sätze).</w:t>
+              <w:t xml:space="preserve">Merkmale vergleichen; Figur und Textform wählen; Schreibplan (Cluster/Stichpunkte).</w:t>
             </w:r>
           </w:p>
         </w:tc>
@@ -5387,7 +5387,7 @@
                 <w:sz w:val="17"/>
                 <w:szCs w:val="17"/>
               </w:rPr>
-              <w:t xml:space="preserve">2.6 F</w:t>
+              <w:t xml:space="preserve">2.6 D/F</w:t>
             </w:r>
           </w:p>
         </w:tc>
@@ -5461,7 +5461,7 @@
                 <w:sz w:val="19"/>
                 <w:szCs w:val="19"/>
               </w:rPr>
-              <w:t xml:space="preserve">23</w:t>
+              <w:t xml:space="preserve">22</w:t>
             </w:r>
           </w:p>
         </w:tc>
@@ -5495,7 +5495,7 @@
                 <w:sz w:val="19"/>
                 <w:szCs w:val="19"/>
               </w:rPr>
-              <w:t xml:space="preserve">Schreibkonferenz</w:t>
+              <w:t xml:space="preserve">Entwurf schreiben</w:t>
             </w:r>
           </w:p>
         </w:tc>
@@ -5529,7 +5529,7 @@
                 <w:sz w:val="19"/>
                 <w:szCs w:val="19"/>
               </w:rPr>
-              <w:t xml:space="preserve">… einen fremden Text nach Kriterien einschätzen und Verbesserungsvorschläge machen.</w:t>
+              <w:t xml:space="preserve">… einen Text aus der Sicht einer Figur schreiben.</w:t>
             </w:r>
           </w:p>
         </w:tc>
@@ -5561,7 +5561,7 @@
                 <w:sz w:val="19"/>
                 <w:szCs w:val="19"/>
               </w:rPr>
-              <w:t xml:space="preserve">Kriterienbogen; Schreibkonferenz in Dreiergruppen mit festen Rollen.</w:t>
+              <w:t xml:space="preserve">Entwurf mit Satzanfängen als Formulierungshilfe (keine fertigen Sätze).</w:t>
             </w:r>
           </w:p>
         </w:tc>
@@ -5593,7 +5593,7 @@
                 <w:sz w:val="17"/>
                 <w:szCs w:val="17"/>
               </w:rPr>
-              <w:t xml:space="preserve">2.6 D · 2.3</w:t>
+              <w:t xml:space="preserve">2.6 F</w:t>
             </w:r>
           </w:p>
         </w:tc>
@@ -5668,7 +5668,7 @@
                 <w:sz w:val="21"/>
                 <w:szCs w:val="21"/>
               </w:rPr>
-              <w:t xml:space="preserve">Woche 6 · 30.11.–4.12. · Balladen in Ton und Musik</w:t>
+              <w:t xml:space="preserve">Woche 6 · 30.11.–4.12. · Überarbeiten – Erlkönig</w:t>
             </w:r>
             <w:r>
               <w:rPr>
@@ -5717,7 +5717,7 @@
                 <w:sz w:val="19"/>
                 <w:szCs w:val="19"/>
               </w:rPr>
-              <w:t xml:space="preserve">24</w:t>
+              <w:t xml:space="preserve">23</w:t>
             </w:r>
           </w:p>
         </w:tc>
@@ -5751,7 +5751,7 @@
                 <w:sz w:val="19"/>
                 <w:szCs w:val="19"/>
               </w:rPr>
-              <w:t xml:space="preserve">Überarbeiten</w:t>
+              <w:t xml:space="preserve">Schreibkonferenz</w:t>
             </w:r>
           </w:p>
         </w:tc>
@@ -5785,7 +5785,7 @@
                 <w:sz w:val="19"/>
                 <w:szCs w:val="19"/>
               </w:rPr>
-              <w:t xml:space="preserve">… meinen Text nach Kriterien und eigenen Schwerpunkten überarbeiten.</w:t>
+              <w:t xml:space="preserve">… einen fremden Text nach Kriterien einschätzen und Verbesserungsvorschläge machen.</w:t>
             </w:r>
           </w:p>
         </w:tc>
@@ -5817,7 +5817,7 @@
                 <w:sz w:val="19"/>
                 <w:szCs w:val="19"/>
               </w:rPr>
-              <w:t xml:space="preserve">Überarbeitung mit Grün; eigene Überarbeitungsschwerpunkte notieren.</w:t>
+              <w:t xml:space="preserve">Kriterienbogen; Schreibkonferenz in Dreiergruppen mit festen Rollen.</w:t>
             </w:r>
           </w:p>
         </w:tc>
@@ -5849,7 +5849,7 @@
                 <w:sz w:val="17"/>
                 <w:szCs w:val="17"/>
               </w:rPr>
-              <w:t xml:space="preserve">2.6 D/E</w:t>
+              <w:t xml:space="preserve">2.6 D · 2.3</w:t>
             </w:r>
           </w:p>
         </w:tc>
@@ -5923,7 +5923,7 @@
                 <w:sz w:val="19"/>
                 <w:szCs w:val="19"/>
               </w:rPr>
-              <w:t xml:space="preserve">25</w:t>
+              <w:t xml:space="preserve">24</w:t>
             </w:r>
           </w:p>
         </w:tc>
@@ -5957,7 +5957,7 @@
                 <w:sz w:val="19"/>
                 <w:szCs w:val="19"/>
               </w:rPr>
-              <w:t xml:space="preserve">Leistung: Textüberarbeitung</w:t>
+              <w:t xml:space="preserve">Überarbeiten</w:t>
             </w:r>
           </w:p>
         </w:tc>
@@ -5991,7 +5991,7 @@
                 <w:sz w:val="19"/>
                 <w:szCs w:val="19"/>
               </w:rPr>
-              <w:t xml:space="preserve">… einen Text aus der Figurenperspektive kriteriengeleitet überarbeiten.</w:t>
+              <w:t xml:space="preserve">… meinen Text nach Kriterien und eigenen Schwerpunkten überarbeiten.</w:t>
             </w:r>
           </w:p>
         </w:tc>
@@ -6023,7 +6023,7 @@
                 <w:sz w:val="19"/>
                 <w:szCs w:val="19"/>
               </w:rPr>
-              <w:t xml:space="preserve">Überarbeitung und Abgabe (Bewertung).</w:t>
+              <w:t xml:space="preserve">Überarbeitung mit Grün; eigene Überarbeitungsschwerpunkte notieren.</w:t>
             </w:r>
           </w:p>
         </w:tc>
@@ -6055,7 +6055,7 @@
                 <w:sz w:val="17"/>
                 <w:szCs w:val="17"/>
               </w:rPr>
-              <w:t xml:space="preserve">2.6</w:t>
+              <w:t xml:space="preserve">2.6 D/E</w:t>
             </w:r>
           </w:p>
         </w:tc>
@@ -6089,7 +6089,7 @@
                 <w:sz w:val="19"/>
                 <w:szCs w:val="19"/>
               </w:rPr>
-              <w:t xml:space="preserve">Bewertung 2: Textüberarbeitung</w:t>
+              <w:t xml:space="preserve"/>
             </w:r>
           </w:p>
         </w:tc>
@@ -6129,7 +6129,7 @@
                 <w:sz w:val="19"/>
                 <w:szCs w:val="19"/>
               </w:rPr>
-              <w:t xml:space="preserve">26</w:t>
+              <w:t xml:space="preserve">25</w:t>
             </w:r>
           </w:p>
         </w:tc>
@@ -6163,7 +6163,7 @@
                 <w:sz w:val="19"/>
                 <w:szCs w:val="19"/>
               </w:rPr>
-              <w:t xml:space="preserve">Wer spricht im Erlkönig?</w:t>
+              <w:t xml:space="preserve">Leistung: Textüberarbeitung</w:t>
             </w:r>
           </w:p>
         </w:tc>
@@ -6197,7 +6197,7 @@
                 <w:sz w:val="19"/>
                 <w:szCs w:val="19"/>
               </w:rPr>
-              <w:t xml:space="preserve">… die Sprecher einer Ballade unterscheiden und den Dialog als dramatisches Element erklären.</w:t>
+              <w:t xml:space="preserve">… einen Text aus der Figurenperspektive kriteriengeleitet überarbeiten.</w:t>
             </w:r>
           </w:p>
         </w:tc>
@@ -6229,7 +6229,7 @@
                 <w:sz w:val="19"/>
                 <w:szCs w:val="19"/>
               </w:rPr>
-              <w:t xml:space="preserve">Sprecher farbig markieren (Erzähler, Vater, Sohn, Erlkönig); mit verteilten Rollen lesen.</w:t>
+              <w:t xml:space="preserve">Überarbeitung und Abgabe (Bewertung).</w:t>
             </w:r>
           </w:p>
         </w:tc>
@@ -6261,7 +6261,7 @@
                 <w:sz w:val="17"/>
                 <w:szCs w:val="17"/>
               </w:rPr>
-              <w:t xml:space="preserve">2.9 D</w:t>
+              <w:t xml:space="preserve">2.6</w:t>
             </w:r>
           </w:p>
         </w:tc>
@@ -6295,7 +6295,7 @@
                 <w:sz w:val="19"/>
                 <w:szCs w:val="19"/>
               </w:rPr>
-              <w:t xml:space="preserve"/>
+              <w:t xml:space="preserve">Bewertung 2: Textüberarbeitung</w:t>
             </w:r>
           </w:p>
         </w:tc>
@@ -6335,7 +6335,7 @@
                 <w:sz w:val="19"/>
                 <w:szCs w:val="19"/>
               </w:rPr>
-              <w:t xml:space="preserve">27</w:t>
+              <w:t xml:space="preserve">26</w:t>
             </w:r>
           </w:p>
         </w:tc>
@@ -6369,7 +6369,7 @@
                 <w:sz w:val="19"/>
                 <w:szCs w:val="19"/>
               </w:rPr>
-              <w:t xml:space="preserve">Wie entsteht das Unheimliche?</w:t>
+              <w:t xml:space="preserve">Wer spricht im Erlkönig?</w:t>
             </w:r>
           </w:p>
         </w:tc>
@@ -6403,7 +6403,7 @@
                 <w:sz w:val="19"/>
                 <w:szCs w:val="19"/>
               </w:rPr>
-              <w:t xml:space="preserve">… beschreiben, wie Sprache und Aufbau Spannung erzeugen.</w:t>
+              <w:t xml:space="preserve">… die Sprecher einer Ballade unterscheiden und den Dialog als dramatisches Element erklären.</w:t>
             </w:r>
           </w:p>
         </w:tc>
@@ -6435,7 +6435,7 @@
                 <w:sz w:val="19"/>
                 <w:szCs w:val="19"/>
               </w:rPr>
-              <w:t xml:space="preserve">Steigerung von Strophe zu Strophe; Wortwahl des Erlkönigs; Wirkung belegen.</w:t>
+              <w:t xml:space="preserve">Sprecher farbig markieren (Erzähler, Vater, Sohn, Erlkönig); mit verteilten Rollen lesen.</w:t>
             </w:r>
           </w:p>
         </w:tc>
@@ -6467,7 +6467,7 @@
                 <w:sz w:val="17"/>
                 <w:szCs w:val="17"/>
               </w:rPr>
-              <w:t xml:space="preserve">2.9 E</w:t>
+              <w:t xml:space="preserve">2.9 D</w:t>
             </w:r>
           </w:p>
         </w:tc>
@@ -6541,7 +6541,7 @@
                 <w:sz w:val="19"/>
                 <w:szCs w:val="19"/>
               </w:rPr>
-              <w:t xml:space="preserve">28</w:t>
+              <w:t xml:space="preserve">27</w:t>
             </w:r>
           </w:p>
         </w:tc>
@@ -6575,7 +6575,7 @@
                 <w:sz w:val="19"/>
                 <w:szCs w:val="19"/>
               </w:rPr>
-              <w:t xml:space="preserve">Schuberts Erlkönig</w:t>
+              <w:t xml:space="preserve">Wie entsteht das Unheimliche?</w:t>
             </w:r>
           </w:p>
         </w:tc>
@@ -6609,7 +6609,7 @@
                 <w:sz w:val="19"/>
                 <w:szCs w:val="19"/>
               </w:rPr>
-              <w:t xml:space="preserve">… mediale Gestaltungsmittel einer Vertonung beschreiben.</w:t>
+              <w:t xml:space="preserve">… beschreiben, wie Sprache und Aufbau Spannung erzeugen.</w:t>
             </w:r>
           </w:p>
         </w:tc>
@@ -6641,7 +6641,7 @@
                 <w:sz w:val="19"/>
                 <w:szCs w:val="19"/>
               </w:rPr>
-              <w:t xml:space="preserve">Hören: Galopp im Klavier, Stimmlagen der Figuren; Höraufträge für alle, Notizraster.</w:t>
+              <w:t xml:space="preserve">Steigerung von Strophe zu Strophe; Wortwahl des Erlkönigs; Wirkung belegen.</w:t>
             </w:r>
           </w:p>
         </w:tc>
@@ -6673,7 +6673,7 @@
                 <w:sz w:val="17"/>
                 <w:szCs w:val="17"/>
               </w:rPr>
-              <w:t xml:space="preserve">2.11 D · 2.3</w:t>
+              <w:t xml:space="preserve">2.9 E</w:t>
             </w:r>
           </w:p>
         </w:tc>
@@ -6748,7 +6748,7 @@
                 <w:sz w:val="21"/>
                 <w:szCs w:val="21"/>
               </w:rPr>
-              <w:t xml:space="preserve">Woche 7 · 7.–11.12. · Vom Text zu Film und Bild</w:t>
+              <w:t xml:space="preserve">Woche 7 · 7.–11.12. · Medien und Vortrag</w:t>
             </w:r>
             <w:r>
               <w:rPr>
@@ -6797,7 +6797,7 @@
                 <w:sz w:val="19"/>
                 <w:szCs w:val="19"/>
               </w:rPr>
-              <w:t xml:space="preserve">29</w:t>
+              <w:t xml:space="preserve">28</w:t>
             </w:r>
           </w:p>
         </w:tc>
@@ -6831,7 +6831,7 @@
                 <w:sz w:val="19"/>
                 <w:szCs w:val="19"/>
               </w:rPr>
-              <w:t xml:space="preserve">Moderne Fassungen</w:t>
+              <w:t xml:space="preserve">Erlkönig vertont</w:t>
             </w:r>
           </w:p>
         </w:tc>
@@ -6865,7 +6865,7 @@
                 <w:sz w:val="19"/>
                 <w:szCs w:val="19"/>
               </w:rPr>
-              <w:t xml:space="preserve">… zwei Fassungen vergleichen und ihre Wirkung auf mich begründen.</w:t>
+              <w:t xml:space="preserve">… mediale Gestaltungsmittel zweier Vertonungen beschreiben und ihre Wirkung vergleichen.</w:t>
             </w:r>
           </w:p>
         </w:tc>
@@ -6897,7 +6897,7 @@
                 <w:sz w:val="19"/>
                 <w:szCs w:val="19"/>
               </w:rPr>
-              <w:t xml:space="preserve">Rap- oder Popversion vs. Schubert; eigene Medienerfahrung austauschen.</w:t>
+              <w:t xml:space="preserve">Schubert (Galopp im Klavier, Stimmlagen) und eine moderne Fassung; Höraufträge für alle, Notizraster; Wirkung auf mich begründen.</w:t>
             </w:r>
           </w:p>
         </w:tc>
@@ -6929,7 +6929,7 @@
                 <w:sz w:val="17"/>
                 <w:szCs w:val="17"/>
               </w:rPr>
-              <w:t xml:space="preserve">2.11 F · C/D</w:t>
+              <w:t xml:space="preserve">2.11 D/F · 2.3</w:t>
             </w:r>
           </w:p>
         </w:tc>
@@ -7003,7 +7003,7 @@
                 <w:sz w:val="19"/>
                 <w:szCs w:val="19"/>
               </w:rPr>
-              <w:t xml:space="preserve">30</w:t>
+              <w:t xml:space="preserve">29</w:t>
             </w:r>
           </w:p>
         </w:tc>
@@ -7209,7 +7209,7 @@
                 <w:sz w:val="19"/>
                 <w:szCs w:val="19"/>
               </w:rPr>
-              <w:t xml:space="preserve">31</w:t>
+              <w:t xml:space="preserve">30</w:t>
             </w:r>
           </w:p>
         </w:tc>
@@ -7243,7 +7243,7 @@
                 <w:sz w:val="19"/>
                 <w:szCs w:val="19"/>
               </w:rPr>
-              <w:t xml:space="preserve">Ballade und Film</w:t>
+              <w:t xml:space="preserve">Ballade, Film und Graphic Novel</w:t>
             </w:r>
           </w:p>
         </w:tc>
@@ -7277,7 +7277,7 @@
                 <w:sz w:val="19"/>
                 <w:szCs w:val="19"/>
               </w:rPr>
-              <w:t xml:space="preserve">… Text und Verfilmung vergleichen.</w:t>
+              <w:t xml:space="preserve">… Text, Verfilmung und Bildfassung vergleichen.</w:t>
             </w:r>
           </w:p>
         </w:tc>
@@ -7309,7 +7309,7 @@
                 <w:sz w:val="19"/>
                 <w:szCs w:val="19"/>
               </w:rPr>
-              <w:t xml:space="preserve">Micky-Maus-Fassung (Fantasia): Was übernimmt der Film, was verändert er? Vergleichsraster allein, dann PA.</w:t>
+              <w:t xml:space="preserve">Micky-Maus-Fassung (Fantasia) mit Vergleichsraster; * eine Strophe als Comic-Panel gestalten.</w:t>
             </w:r>
           </w:p>
         </w:tc>
@@ -7341,7 +7341,7 @@
                 <w:sz w:val="17"/>
                 <w:szCs w:val="17"/>
               </w:rPr>
-              <w:t xml:space="preserve">2.11 D</w:t>
+              <w:t xml:space="preserve">2.11 D · 2.8 E</w:t>
             </w:r>
           </w:p>
         </w:tc>
@@ -7415,7 +7415,7 @@
                 <w:sz w:val="19"/>
                 <w:szCs w:val="19"/>
               </w:rPr>
-              <w:t xml:space="preserve">32</w:t>
+              <w:t xml:space="preserve">31</w:t>
             </w:r>
           </w:p>
         </w:tc>
@@ -7449,7 +7449,7 @@
                 <w:sz w:val="19"/>
                 <w:szCs w:val="19"/>
               </w:rPr>
-              <w:t xml:space="preserve">Ballade als Graphic Novel</w:t>
+              <w:t xml:space="preserve">Was macht einen guten Vortrag aus?</w:t>
             </w:r>
           </w:p>
         </w:tc>
@@ -7483,7 +7483,7 @@
                 <w:sz w:val="19"/>
                 <w:szCs w:val="19"/>
               </w:rPr>
-              <w:t xml:space="preserve">… mein Textverständnis in einer anderen Darstellungsform ausdrücken.</w:t>
+              <w:t xml:space="preserve">… Kriterien für einen gelungenen Balladenvortrag nennen.</w:t>
             </w:r>
           </w:p>
         </w:tc>
@@ -7515,7 +7515,7 @@
                 <w:sz w:val="19"/>
                 <w:szCs w:val="19"/>
               </w:rPr>
-              <w:t xml:space="preserve">Eine Strophe als Comic-Panel mit Sprechblase gestalten; Galeriegang mit Kurzbegründung.</w:t>
+              <w:t xml:space="preserve">Zwei Vorträge derselben Strophe vergleichen; Kriterien sammeln; Ballade für die Rezitation wählen.</w:t>
             </w:r>
           </w:p>
         </w:tc>
@@ -7547,7 +7547,7 @@
                 <w:sz w:val="17"/>
                 <w:szCs w:val="17"/>
               </w:rPr>
-              <w:t xml:space="preserve">2.8 E</w:t>
+              <w:t xml:space="preserve">2.7 D · 2.3</w:t>
             </w:r>
           </w:p>
         </w:tc>
@@ -7621,7 +7621,7 @@
                 <w:sz w:val="19"/>
                 <w:szCs w:val="19"/>
               </w:rPr>
-              <w:t xml:space="preserve">33</w:t>
+              <w:t xml:space="preserve">32</w:t>
             </w:r>
           </w:p>
         </w:tc>
@@ -7655,7 +7655,7 @@
                 <w:sz w:val="19"/>
                 <w:szCs w:val="19"/>
               </w:rPr>
-              <w:t xml:space="preserve">Was macht einen guten Vortrag aus?</w:t>
+              <w:t xml:space="preserve">Vortragszeichen setzen</w:t>
             </w:r>
           </w:p>
         </w:tc>
@@ -7689,7 +7689,7 @@
                 <w:sz w:val="19"/>
                 <w:szCs w:val="19"/>
               </w:rPr>
-              <w:t xml:space="preserve">… Kriterien für einen gelungenen Balladenvortrag nennen.</w:t>
+              <w:t xml:space="preserve">… einen Text mit Vortragszeichen für meinen Vortrag vorbereiten.</w:t>
             </w:r>
           </w:p>
         </w:tc>
@@ -7721,7 +7721,7 @@
                 <w:sz w:val="19"/>
                 <w:szCs w:val="19"/>
               </w:rPr>
-              <w:t xml:space="preserve">Zwei Vorträge derselben Strophe vergleichen; Kriterien sammeln (Tempo, Pausen, Betonung, Lautstärke, Mimik, Gestik, Blickkontakt). Ballade für die Rezitation wählen.</w:t>
+              <w:t xml:space="preserve">Vortragszeichen an einer Strophe, dann an der eigenen Ballade. Hausaufgabe: auswendig lernen.</w:t>
             </w:r>
           </w:p>
         </w:tc>
@@ -7753,7 +7753,7 @@
                 <w:sz w:val="17"/>
                 <w:szCs w:val="17"/>
               </w:rPr>
-              <w:t xml:space="preserve">2.7 D · 2.3</w:t>
+              <w:t xml:space="preserve">2.7 D</w:t>
             </w:r>
           </w:p>
         </w:tc>
@@ -7828,7 +7828,7 @@
                 <w:sz w:val="21"/>
                 <w:szCs w:val="21"/>
               </w:rPr>
-              <w:t xml:space="preserve">Woche 8 · 14.–18.12. · Rezitation vorbereiten</w:t>
+              <w:t xml:space="preserve">Woche 8 · 14.–18.12. · Rezitation</w:t>
             </w:r>
             <w:r>
               <w:rPr>
@@ -7877,7 +7877,7 @@
                 <w:sz w:val="19"/>
                 <w:szCs w:val="19"/>
               </w:rPr>
-              <w:t xml:space="preserve">34</w:t>
+              <w:t xml:space="preserve">33</w:t>
             </w:r>
           </w:p>
         </w:tc>
@@ -7911,7 +7911,7 @@
                 <w:sz w:val="19"/>
                 <w:szCs w:val="19"/>
               </w:rPr>
-              <w:t xml:space="preserve">Vortragszeichen setzen</w:t>
+              <w:t xml:space="preserve">Auswendig lernen</w:t>
             </w:r>
           </w:p>
         </w:tc>
@@ -7945,7 +7945,7 @@
                 <w:sz w:val="19"/>
                 <w:szCs w:val="19"/>
               </w:rPr>
-              <w:t xml:space="preserve">… einen Text mit Vortragszeichen für meinen Vortrag vorbereiten.</w:t>
+              <w:t xml:space="preserve">… Strategien zum Auswendiglernen anwenden.</w:t>
             </w:r>
           </w:p>
         </w:tc>
@@ -7977,7 +7977,7 @@
                 <w:sz w:val="19"/>
                 <w:szCs w:val="19"/>
               </w:rPr>
-              <w:t xml:space="preserve">Vortragszeichen an einer Strophe, dann an der eigenen Ballade.</w:t>
+              <w:t xml:space="preserve">Strophenweise lernen, Stichwortkarten, Partnerabfrage.</w:t>
             </w:r>
           </w:p>
         </w:tc>
@@ -8009,7 +8009,7 @@
                 <w:sz w:val="17"/>
                 <w:szCs w:val="17"/>
               </w:rPr>
-              <w:t xml:space="preserve">2.7 D</w:t>
+              <w:t xml:space="preserve">2.7</w:t>
             </w:r>
           </w:p>
         </w:tc>
@@ -8083,7 +8083,7 @@
                 <w:sz w:val="19"/>
                 <w:szCs w:val="19"/>
               </w:rPr>
-              <w:t xml:space="preserve">35</w:t>
+              <w:t xml:space="preserve">34</w:t>
             </w:r>
           </w:p>
         </w:tc>
@@ -8117,7 +8117,7 @@
                 <w:sz w:val="19"/>
                 <w:szCs w:val="19"/>
               </w:rPr>
-              <w:t xml:space="preserve">Auswendig lernen</w:t>
+              <w:t xml:space="preserve">Mimik, Gestik, Stimme</w:t>
             </w:r>
           </w:p>
         </w:tc>
@@ -8151,7 +8151,7 @@
                 <w:sz w:val="19"/>
                 <w:szCs w:val="19"/>
               </w:rPr>
-              <w:t xml:space="preserve">… Strategien zum Auswendiglernen anwenden.</w:t>
+              <w:t xml:space="preserve">… nonverbale Mittel und Intonation gezielt einsetzen.</w:t>
             </w:r>
           </w:p>
         </w:tc>
@@ -8183,7 +8183,7 @@
                 <w:sz w:val="19"/>
                 <w:szCs w:val="19"/>
               </w:rPr>
-              <w:t xml:space="preserve">Strophenweise lernen, Stichwortkarten, Partnerabfrage.</w:t>
+              <w:t xml:space="preserve">Übungen zu Stimme und Haltung; eine Strophe mit unterschiedlicher Wirkung sprechen.</w:t>
             </w:r>
           </w:p>
         </w:tc>
@@ -8215,7 +8215,7 @@
                 <w:sz w:val="17"/>
                 <w:szCs w:val="17"/>
               </w:rPr>
-              <w:t xml:space="preserve">2.7</w:t>
+              <w:t xml:space="preserve">2.1 · 2.7 E/F</w:t>
             </w:r>
           </w:p>
         </w:tc>
@@ -8289,7 +8289,7 @@
                 <w:sz w:val="19"/>
                 <w:szCs w:val="19"/>
               </w:rPr>
-              <w:t xml:space="preserve">36</w:t>
+              <w:t xml:space="preserve">35</w:t>
             </w:r>
           </w:p>
         </w:tc>
@@ -8323,7 +8323,7 @@
                 <w:sz w:val="19"/>
                 <w:szCs w:val="19"/>
               </w:rPr>
-              <w:t xml:space="preserve">Mimik, Gestik, Stimme</w:t>
+              <w:t xml:space="preserve">Üben mit Feedback – Generalprobe</w:t>
             </w:r>
           </w:p>
         </w:tc>
@@ -8357,7 +8357,7 @@
                 <w:sz w:val="19"/>
                 <w:szCs w:val="19"/>
               </w:rPr>
-              <w:t xml:space="preserve">… nonverbale Mittel und Intonation gezielt einsetzen.</w:t>
+              <w:t xml:space="preserve">… einen Vortrag nach Kriterien einschätzen und Feedback geben.</w:t>
             </w:r>
           </w:p>
         </w:tc>
@@ -8389,7 +8389,7 @@
                 <w:sz w:val="19"/>
                 <w:szCs w:val="19"/>
               </w:rPr>
-              <w:t xml:space="preserve">Übungen zu Stimme und Haltung; eine Strophe mit unterschiedlicher Wirkung sprechen.</w:t>
+              <w:t xml:space="preserve">PA: Vortrag – Feedbackbogen mit Notizen beim Zuhören – zweiter Durchgang; Generalprobe in Kleingruppen.</w:t>
             </w:r>
           </w:p>
         </w:tc>
@@ -8421,7 +8421,7 @@
                 <w:sz w:val="17"/>
                 <w:szCs w:val="17"/>
               </w:rPr>
-              <w:t xml:space="preserve">2.1 · 2.7 E/F</w:t>
+              <w:t xml:space="preserve">2.7 D · 2.3</w:t>
             </w:r>
           </w:p>
         </w:tc>
@@ -8495,7 +8495,7 @@
                 <w:sz w:val="19"/>
                 <w:szCs w:val="19"/>
               </w:rPr>
-              <w:t xml:space="preserve">37</w:t>
+              <w:t xml:space="preserve">36</w:t>
             </w:r>
           </w:p>
         </w:tc>
@@ -8529,7 +8529,7 @@
                 <w:sz w:val="19"/>
                 <w:szCs w:val="19"/>
               </w:rPr>
-              <w:t xml:space="preserve">Üben mit Feedback</w:t>
+              <w:t xml:space="preserve">Rezitation I</w:t>
             </w:r>
           </w:p>
         </w:tc>
@@ -8563,7 +8563,7 @@
                 <w:sz w:val="19"/>
                 <w:szCs w:val="19"/>
               </w:rPr>
-              <w:t xml:space="preserve">… einen Vortrag nach Kriterien einschätzen und Feedback geben.</w:t>
+              <w:t xml:space="preserve">… eine Ballade kriterienorientiert vortragen.</w:t>
             </w:r>
           </w:p>
         </w:tc>
@@ -8595,7 +8595,7 @@
                 <w:sz w:val="19"/>
                 <w:szCs w:val="19"/>
               </w:rPr>
-              <w:t xml:space="preserve">PA: Vortrag – Feedbackbogen mit Notizen beim Zuhören – zweiter Durchgang.</w:t>
+              <w:t xml:space="preserve">Vorträge; Zuhörer notieren Feedback.</w:t>
             </w:r>
           </w:p>
         </w:tc>
@@ -8627,7 +8627,7 @@
                 <w:sz w:val="17"/>
                 <w:szCs w:val="17"/>
               </w:rPr>
-              <w:t xml:space="preserve">2.7 D · 2.3</w:t>
+              <w:t xml:space="preserve">2.7 · 2.3</w:t>
             </w:r>
           </w:p>
         </w:tc>
@@ -8661,7 +8661,7 @@
                 <w:sz w:val="19"/>
                 <w:szCs w:val="19"/>
               </w:rPr>
-              <w:t xml:space="preserve"/>
+              <w:t xml:space="preserve">Bewertung 3: Rezitation</w:t>
             </w:r>
           </w:p>
         </w:tc>
@@ -8701,7 +8701,7 @@
                 <w:sz w:val="19"/>
                 <w:szCs w:val="19"/>
               </w:rPr>
-              <w:t xml:space="preserve">38</w:t>
+              <w:t xml:space="preserve">37</w:t>
             </w:r>
           </w:p>
         </w:tc>
@@ -8735,7 +8735,7 @@
                 <w:sz w:val="19"/>
                 <w:szCs w:val="19"/>
               </w:rPr>
-              <w:t xml:space="preserve">Generalprobe</w:t>
+              <w:t xml:space="preserve">Rezitation II</w:t>
             </w:r>
           </w:p>
         </w:tc>
@@ -8769,7 +8769,7 @@
                 <w:sz w:val="19"/>
                 <w:szCs w:val="19"/>
               </w:rPr>
-              <w:t xml:space="preserve">… meinen Vortrag im geschützten Rahmen halten und verbessern.</w:t>
+              <w:t xml:space="preserve">… eine Ballade kriterienorientiert vortragen.</w:t>
             </w:r>
           </w:p>
         </w:tc>
@@ -8801,7 +8801,7 @@
                 <w:sz w:val="19"/>
                 <w:szCs w:val="19"/>
               </w:rPr>
-              <w:t xml:space="preserve">Kleingruppen; Selbst- und Fremdeinschätzung. Über die Ferien weiter auswendig lernen.</w:t>
+              <w:t xml:space="preserve">Vorträge; Zuhörer notieren Feedback.</w:t>
             </w:r>
           </w:p>
         </w:tc>
@@ -8833,7 +8833,7 @@
                 <w:sz w:val="17"/>
                 <w:szCs w:val="17"/>
               </w:rPr>
-              <w:t xml:space="preserve">2.7</w:t>
+              <w:t xml:space="preserve">2.7 · 2.3</w:t>
             </w:r>
           </w:p>
         </w:tc>
@@ -8867,7 +8867,7 @@
                 <w:sz w:val="19"/>
                 <w:szCs w:val="19"/>
               </w:rPr>
-              <w:t xml:space="preserve"/>
+              <w:t xml:space="preserve">Bewertung 3: Rezitation</w:t>
             </w:r>
           </w:p>
         </w:tc>
@@ -8908,7 +8908,7 @@
                 <w:sz w:val="21"/>
                 <w:szCs w:val="21"/>
               </w:rPr>
-              <w:t xml:space="preserve">Woche 9 · nach den Weihnachtsferien (Termin prüfen) · Rezitation und Abschluss</w:t>
+              <w:t xml:space="preserve">Woche 9 · 21.–22.12. · Abschluss vor den Weihnachtsferien</w:t>
             </w:r>
             <w:r>
               <w:rPr>
@@ -8917,7 +8917,7 @@
                 <w:sz w:val="18"/>
                 <w:szCs w:val="18"/>
               </w:rPr>
-              <w:t xml:space="preserve">   5 Stunden</w:t>
+              <w:t xml:space="preserve">   Stundenzahl prüfen (angenommen: 2)</w:t>
             </w:r>
           </w:p>
         </w:tc>
@@ -8957,7 +8957,7 @@
                 <w:sz w:val="19"/>
                 <w:szCs w:val="19"/>
               </w:rPr>
-              <w:t xml:space="preserve">39</w:t>
+              <w:t xml:space="preserve">38</w:t>
             </w:r>
           </w:p>
         </w:tc>
@@ -8991,7 +8991,7 @@
                 <w:sz w:val="19"/>
                 <w:szCs w:val="19"/>
               </w:rPr>
-              <w:t xml:space="preserve">Rezitation I</w:t>
+              <w:t xml:space="preserve">Rezitation III</w:t>
             </w:r>
           </w:p>
         </w:tc>
@@ -9057,7 +9057,7 @@
                 <w:sz w:val="19"/>
                 <w:szCs w:val="19"/>
               </w:rPr>
-              <w:t xml:space="preserve">Kurze Auffrischung, dann Vorträge; Zuhörer notieren Feedback.</w:t>
+              <w:t xml:space="preserve">Restliche Vorträge (ggf. im geschützten Raum).</w:t>
             </w:r>
           </w:p>
         </w:tc>
@@ -9089,7 +9089,7 @@
                 <w:sz w:val="17"/>
                 <w:szCs w:val="17"/>
               </w:rPr>
-              <w:t xml:space="preserve">2.7 · 2.3</w:t>
+              <w:t xml:space="preserve">2.7</w:t>
             </w:r>
           </w:p>
         </w:tc>
@@ -9163,7 +9163,7 @@
                 <w:sz w:val="19"/>
                 <w:szCs w:val="19"/>
               </w:rPr>
-              <w:t xml:space="preserve">40</w:t>
+              <w:t xml:space="preserve">39</w:t>
             </w:r>
           </w:p>
         </w:tc>
@@ -9197,7 +9197,7 @@
                 <w:sz w:val="19"/>
                 <w:szCs w:val="19"/>
               </w:rPr>
-              <w:t xml:space="preserve">Rezitation II</w:t>
+              <w:t xml:space="preserve">* Rückblick: meine Ballade</w:t>
             </w:r>
           </w:p>
         </w:tc>
@@ -9231,7 +9231,7 @@
                 <w:sz w:val="19"/>
                 <w:szCs w:val="19"/>
               </w:rPr>
-              <w:t xml:space="preserve">… eine Ballade kriterienorientiert vortragen.</w:t>
+              <w:t xml:space="preserve">… meinen Lernstand einschätzen und begründen, welche Ballade mich am meisten überzeugt.</w:t>
             </w:r>
           </w:p>
         </w:tc>
@@ -9263,7 +9263,7 @@
                 <w:sz w:val="19"/>
                 <w:szCs w:val="19"/>
               </w:rPr>
-              <w:t xml:space="preserve">Vorträge; Zuhörer notieren Feedback.</w:t>
+              <w:t xml:space="preserve">Selbsteinschätzung; kurze begründete Stellungnahme. Dient zugleich als Puffer, falls Rezitationen länger dauern.</w:t>
             </w:r>
           </w:p>
         </w:tc>
@@ -9295,625 +9295,7 @@
                 <w:sz w:val="17"/>
                 <w:szCs w:val="17"/>
               </w:rPr>
-              <w:t xml:space="preserve">2.7 · 2.3</w:t>
-            </w:r>
-          </w:p>
-        </w:tc>
-        <w:tc>
-          <w:tcPr>
-            <w:tcW w:type="dxa" w:w="1900"/>
-            <w:tcBorders>
-              <w:top w:val="single" w:color="B9C6E8" w:sz="6"/>
-              <w:left w:val="single" w:color="B9C6E8" w:sz="6"/>
-              <w:bottom w:val="single" w:color="B9C6E8" w:sz="6"/>
-              <w:right w:val="single" w:color="B9C6E8" w:sz="6"/>
-            </w:tcBorders>
-            <w:tcMar>
-              <w:top w:type="dxa" w:w="50"/>
-              <w:left w:type="dxa" w:w="80"/>
-              <w:bottom w:type="dxa" w:w="50"/>
-              <w:right w:type="dxa" w:w="100"/>
-            </w:tcMar>
-            <w:vAlign w:val="top"/>
-          </w:tcPr>
-          <w:p>
-            <w:pPr>
-              <w:spacing w:after="0" w:before="0"/>
-            </w:pPr>
-            <w:r>
-              <w:rPr>
-                <w:rFonts w:ascii="Calibri" w:cs="Calibri" w:eastAsia="Calibri" w:hAnsi="Calibri"/>
-                <w:b/>
-                <w:bCs/>
-                <w:color w:val="C0392B"/>
-                <w:sz w:val="19"/>
-                <w:szCs w:val="19"/>
-              </w:rPr>
-              <w:t xml:space="preserve">Bewertung 3: Rezitation</w:t>
-            </w:r>
-          </w:p>
-        </w:tc>
-      </w:tr>
-      <w:tr>
-        <w:trPr>
-          <w:cantSplit/>
-        </w:trPr>
-        <w:tc>
-          <w:tcPr>
-            <w:tcW w:type="dxa" w:w="700"/>
-            <w:tcBorders>
-              <w:top w:val="single" w:color="B9C6E8" w:sz="6"/>
-              <w:left w:val="single" w:color="B9C6E8" w:sz="6"/>
-              <w:bottom w:val="single" w:color="B9C6E8" w:sz="6"/>
-              <w:right w:val="single" w:color="B9C6E8" w:sz="6"/>
-            </w:tcBorders>
-            <w:shd w:fill="F4F7FD" w:color="auto" w:val="clear"/>
-            <w:tcMar>
-              <w:top w:type="dxa" w:w="50"/>
-              <w:left w:type="dxa" w:w="80"/>
-              <w:bottom w:type="dxa" w:w="50"/>
-              <w:right w:type="dxa" w:w="100"/>
-            </w:tcMar>
-            <w:vAlign w:val="top"/>
-          </w:tcPr>
-          <w:p>
-            <w:pPr>
-              <w:spacing w:after="0" w:before="0"/>
-            </w:pPr>
-            <w:r>
-              <w:rPr>
-                <w:rFonts w:ascii="Calibri" w:cs="Calibri" w:eastAsia="Calibri" w:hAnsi="Calibri"/>
-                <w:b/>
-                <w:bCs/>
-                <w:color w:val="D9534F"/>
-                <w:sz w:val="19"/>
-                <w:szCs w:val="19"/>
-              </w:rPr>
-              <w:t xml:space="preserve">41</w:t>
-            </w:r>
-          </w:p>
-        </w:tc>
-        <w:tc>
-          <w:tcPr>
-            <w:tcW w:type="dxa" w:w="2700"/>
-            <w:tcBorders>
-              <w:top w:val="single" w:color="B9C6E8" w:sz="6"/>
-              <w:left w:val="single" w:color="B9C6E8" w:sz="6"/>
-              <w:bottom w:val="single" w:color="B9C6E8" w:sz="6"/>
-              <w:right w:val="single" w:color="B9C6E8" w:sz="6"/>
-            </w:tcBorders>
-            <w:tcMar>
-              <w:top w:type="dxa" w:w="50"/>
-              <w:left w:type="dxa" w:w="80"/>
-              <w:bottom w:type="dxa" w:w="50"/>
-              <w:right w:type="dxa" w:w="100"/>
-            </w:tcMar>
-            <w:vAlign w:val="top"/>
-          </w:tcPr>
-          <w:p>
-            <w:pPr>
-              <w:spacing w:after="0" w:before="0"/>
-            </w:pPr>
-            <w:r>
-              <w:rPr>
-                <w:rFonts w:ascii="Calibri" w:cs="Calibri" w:eastAsia="Calibri" w:hAnsi="Calibri"/>
-                <w:b/>
-                <w:bCs/>
-                <w:color w:val="1E2761"/>
-                <w:sz w:val="19"/>
-                <w:szCs w:val="19"/>
-              </w:rPr>
-              <w:t xml:space="preserve">Rezitation III</w:t>
-            </w:r>
-          </w:p>
-        </w:tc>
-        <w:tc>
-          <w:tcPr>
-            <w:tcW w:type="dxa" w:w="3600"/>
-            <w:tcBorders>
-              <w:top w:val="single" w:color="B9C6E8" w:sz="6"/>
-              <w:left w:val="single" w:color="B9C6E8" w:sz="6"/>
-              <w:bottom w:val="single" w:color="B9C6E8" w:sz="6"/>
-              <w:right w:val="single" w:color="B9C6E8" w:sz="6"/>
-            </w:tcBorders>
-            <w:tcMar>
-              <w:top w:type="dxa" w:w="50"/>
-              <w:left w:type="dxa" w:w="80"/>
-              <w:bottom w:type="dxa" w:w="50"/>
-              <w:right w:type="dxa" w:w="100"/>
-            </w:tcMar>
-            <w:vAlign w:val="top"/>
-          </w:tcPr>
-          <w:p>
-            <w:pPr>
-              <w:spacing w:after="0" w:before="0"/>
-            </w:pPr>
-            <w:r>
-              <w:rPr>
-                <w:rFonts w:ascii="Calibri" w:cs="Calibri" w:eastAsia="Calibri" w:hAnsi="Calibri"/>
-                <w:i/>
-                <w:iCs/>
-                <w:color w:val="000000"/>
-                <w:sz w:val="19"/>
-                <w:szCs w:val="19"/>
-              </w:rPr>
-              <w:t xml:space="preserve">… eine Ballade kriterienorientiert vortragen.</w:t>
-            </w:r>
-          </w:p>
-        </w:tc>
-        <w:tc>
-          <w:tcPr>
-            <w:tcW w:type="dxa" w:w="5300"/>
-            <w:tcBorders>
-              <w:top w:val="single" w:color="B9C6E8" w:sz="6"/>
-              <w:left w:val="single" w:color="B9C6E8" w:sz="6"/>
-              <w:bottom w:val="single" w:color="B9C6E8" w:sz="6"/>
-              <w:right w:val="single" w:color="B9C6E8" w:sz="6"/>
-            </w:tcBorders>
-            <w:tcMar>
-              <w:top w:type="dxa" w:w="50"/>
-              <w:left w:type="dxa" w:w="80"/>
-              <w:bottom w:type="dxa" w:w="50"/>
-              <w:right w:type="dxa" w:w="100"/>
-            </w:tcMar>
-            <w:vAlign w:val="top"/>
-          </w:tcPr>
-          <w:p>
-            <w:pPr>
-              <w:spacing w:after="0" w:before="0"/>
-            </w:pPr>
-            <w:r>
-              <w:rPr>
-                <w:rFonts w:ascii="Calibri" w:cs="Calibri" w:eastAsia="Calibri" w:hAnsi="Calibri"/>
-                <w:color w:val="000000"/>
-                <w:sz w:val="19"/>
-                <w:szCs w:val="19"/>
-              </w:rPr>
-              <w:t xml:space="preserve">Restliche Vorträge (ggf. im geschützten Raum).</w:t>
-            </w:r>
-          </w:p>
-        </w:tc>
-        <w:tc>
-          <w:tcPr>
-            <w:tcW w:type="dxa" w:w="1238"/>
-            <w:tcBorders>
-              <w:top w:val="single" w:color="B9C6E8" w:sz="6"/>
-              <w:left w:val="single" w:color="B9C6E8" w:sz="6"/>
-              <w:bottom w:val="single" w:color="B9C6E8" w:sz="6"/>
-              <w:right w:val="single" w:color="B9C6E8" w:sz="6"/>
-            </w:tcBorders>
-            <w:tcMar>
-              <w:top w:type="dxa" w:w="50"/>
-              <w:left w:type="dxa" w:w="80"/>
-              <w:bottom w:type="dxa" w:w="50"/>
-              <w:right w:type="dxa" w:w="100"/>
-            </w:tcMar>
-            <w:vAlign w:val="top"/>
-          </w:tcPr>
-          <w:p>
-            <w:pPr>
-              <w:spacing w:after="0" w:before="0"/>
-            </w:pPr>
-            <w:r>
-              <w:rPr>
-                <w:rFonts w:ascii="Calibri" w:cs="Calibri" w:eastAsia="Calibri" w:hAnsi="Calibri"/>
-                <w:color w:val="5B6B8C"/>
-                <w:sz w:val="17"/>
-                <w:szCs w:val="17"/>
-              </w:rPr>
-              <w:t xml:space="preserve">2.7</w:t>
-            </w:r>
-          </w:p>
-        </w:tc>
-        <w:tc>
-          <w:tcPr>
-            <w:tcW w:type="dxa" w:w="1900"/>
-            <w:tcBorders>
-              <w:top w:val="single" w:color="B9C6E8" w:sz="6"/>
-              <w:left w:val="single" w:color="B9C6E8" w:sz="6"/>
-              <w:bottom w:val="single" w:color="B9C6E8" w:sz="6"/>
-              <w:right w:val="single" w:color="B9C6E8" w:sz="6"/>
-            </w:tcBorders>
-            <w:tcMar>
-              <w:top w:type="dxa" w:w="50"/>
-              <w:left w:type="dxa" w:w="80"/>
-              <w:bottom w:type="dxa" w:w="50"/>
-              <w:right w:type="dxa" w:w="100"/>
-            </w:tcMar>
-            <w:vAlign w:val="top"/>
-          </w:tcPr>
-          <w:p>
-            <w:pPr>
-              <w:spacing w:after="0" w:before="0"/>
-            </w:pPr>
-            <w:r>
-              <w:rPr>
-                <w:rFonts w:ascii="Calibri" w:cs="Calibri" w:eastAsia="Calibri" w:hAnsi="Calibri"/>
-                <w:b/>
-                <w:bCs/>
-                <w:color w:val="C0392B"/>
-                <w:sz w:val="19"/>
-                <w:szCs w:val="19"/>
-              </w:rPr>
-              <w:t xml:space="preserve">Bewertung 3: Rezitation</w:t>
-            </w:r>
-          </w:p>
-        </w:tc>
-      </w:tr>
-      <w:tr>
-        <w:trPr>
-          <w:cantSplit/>
-        </w:trPr>
-        <w:tc>
-          <w:tcPr>
-            <w:tcW w:type="dxa" w:w="700"/>
-            <w:tcBorders>
-              <w:top w:val="single" w:color="B9C6E8" w:sz="6"/>
-              <w:left w:val="single" w:color="B9C6E8" w:sz="6"/>
-              <w:bottom w:val="single" w:color="B9C6E8" w:sz="6"/>
-              <w:right w:val="single" w:color="B9C6E8" w:sz="6"/>
-            </w:tcBorders>
-            <w:shd w:fill="F4F7FD" w:color="auto" w:val="clear"/>
-            <w:tcMar>
-              <w:top w:type="dxa" w:w="50"/>
-              <w:left w:type="dxa" w:w="80"/>
-              <w:bottom w:type="dxa" w:w="50"/>
-              <w:right w:type="dxa" w:w="100"/>
-            </w:tcMar>
-            <w:vAlign w:val="top"/>
-          </w:tcPr>
-          <w:p>
-            <w:pPr>
-              <w:spacing w:after="0" w:before="0"/>
-            </w:pPr>
-            <w:r>
-              <w:rPr>
-                <w:rFonts w:ascii="Calibri" w:cs="Calibri" w:eastAsia="Calibri" w:hAnsi="Calibri"/>
-                <w:b/>
-                <w:bCs/>
-                <w:color w:val="D9534F"/>
-                <w:sz w:val="19"/>
-                <w:szCs w:val="19"/>
-              </w:rPr>
-              <w:t xml:space="preserve">42</w:t>
-            </w:r>
-          </w:p>
-        </w:tc>
-        <w:tc>
-          <w:tcPr>
-            <w:tcW w:type="dxa" w:w="2700"/>
-            <w:tcBorders>
-              <w:top w:val="single" w:color="B9C6E8" w:sz="6"/>
-              <w:left w:val="single" w:color="B9C6E8" w:sz="6"/>
-              <w:bottom w:val="single" w:color="B9C6E8" w:sz="6"/>
-              <w:right w:val="single" w:color="B9C6E8" w:sz="6"/>
-            </w:tcBorders>
-            <w:tcMar>
-              <w:top w:type="dxa" w:w="50"/>
-              <w:left w:type="dxa" w:w="80"/>
-              <w:bottom w:type="dxa" w:w="50"/>
-              <w:right w:type="dxa" w:w="100"/>
-            </w:tcMar>
-            <w:vAlign w:val="top"/>
-          </w:tcPr>
-          <w:p>
-            <w:pPr>
-              <w:spacing w:after="0" w:before="0"/>
-            </w:pPr>
-            <w:r>
-              <w:rPr>
-                <w:rFonts w:ascii="Calibri" w:cs="Calibri" w:eastAsia="Calibri" w:hAnsi="Calibri"/>
-                <w:b/>
-                <w:bCs/>
-                <w:color w:val="1E2761"/>
-                <w:sz w:val="19"/>
-                <w:szCs w:val="19"/>
-              </w:rPr>
-              <w:t xml:space="preserve">Rückblick: meine Ballade</w:t>
-            </w:r>
-          </w:p>
-        </w:tc>
-        <w:tc>
-          <w:tcPr>
-            <w:tcW w:type="dxa" w:w="3600"/>
-            <w:tcBorders>
-              <w:top w:val="single" w:color="B9C6E8" w:sz="6"/>
-              <w:left w:val="single" w:color="B9C6E8" w:sz="6"/>
-              <w:bottom w:val="single" w:color="B9C6E8" w:sz="6"/>
-              <w:right w:val="single" w:color="B9C6E8" w:sz="6"/>
-            </w:tcBorders>
-            <w:tcMar>
-              <w:top w:type="dxa" w:w="50"/>
-              <w:left w:type="dxa" w:w="80"/>
-              <w:bottom w:type="dxa" w:w="50"/>
-              <w:right w:type="dxa" w:w="100"/>
-            </w:tcMar>
-            <w:vAlign w:val="top"/>
-          </w:tcPr>
-          <w:p>
-            <w:pPr>
-              <w:spacing w:after="0" w:before="0"/>
-            </w:pPr>
-            <w:r>
-              <w:rPr>
-                <w:rFonts w:ascii="Calibri" w:cs="Calibri" w:eastAsia="Calibri" w:hAnsi="Calibri"/>
-                <w:i/>
-                <w:iCs/>
-                <w:color w:val="000000"/>
-                <w:sz w:val="19"/>
-                <w:szCs w:val="19"/>
-              </w:rPr>
-              <w:t xml:space="preserve">… meinen Lernstand einschätzen und begründen, welche Ballade mich am meisten überzeugt.</w:t>
-            </w:r>
-          </w:p>
-        </w:tc>
-        <w:tc>
-          <w:tcPr>
-            <w:tcW w:type="dxa" w:w="5300"/>
-            <w:tcBorders>
-              <w:top w:val="single" w:color="B9C6E8" w:sz="6"/>
-              <w:left w:val="single" w:color="B9C6E8" w:sz="6"/>
-              <w:bottom w:val="single" w:color="B9C6E8" w:sz="6"/>
-              <w:right w:val="single" w:color="B9C6E8" w:sz="6"/>
-            </w:tcBorders>
-            <w:tcMar>
-              <w:top w:type="dxa" w:w="50"/>
-              <w:left w:type="dxa" w:w="80"/>
-              <w:bottom w:type="dxa" w:w="50"/>
-              <w:right w:type="dxa" w:w="100"/>
-            </w:tcMar>
-            <w:vAlign w:val="top"/>
-          </w:tcPr>
-          <w:p>
-            <w:pPr>
-              <w:spacing w:after="0" w:before="0"/>
-            </w:pPr>
-            <w:r>
-              <w:rPr>
-                <w:rFonts w:ascii="Calibri" w:cs="Calibri" w:eastAsia="Calibri" w:hAnsi="Calibri"/>
-                <w:color w:val="000000"/>
-                <w:sz w:val="19"/>
-                <w:szCs w:val="19"/>
-              </w:rPr>
-              <w:t xml:space="preserve">Selbsteinschätzungsbogen; kurze begründete Stellungnahme; Austausch in PA, dann Plenum.</w:t>
-            </w:r>
-          </w:p>
-        </w:tc>
-        <w:tc>
-          <w:tcPr>
-            <w:tcW w:type="dxa" w:w="1238"/>
-            <w:tcBorders>
-              <w:top w:val="single" w:color="B9C6E8" w:sz="6"/>
-              <w:left w:val="single" w:color="B9C6E8" w:sz="6"/>
-              <w:bottom w:val="single" w:color="B9C6E8" w:sz="6"/>
-              <w:right w:val="single" w:color="B9C6E8" w:sz="6"/>
-            </w:tcBorders>
-            <w:tcMar>
-              <w:top w:type="dxa" w:w="50"/>
-              <w:left w:type="dxa" w:w="80"/>
-              <w:bottom w:type="dxa" w:w="50"/>
-              <w:right w:type="dxa" w:w="100"/>
-            </w:tcMar>
-            <w:vAlign w:val="top"/>
-          </w:tcPr>
-          <w:p>
-            <w:pPr>
-              <w:spacing w:after="0" w:before="0"/>
-            </w:pPr>
-            <w:r>
-              <w:rPr>
-                <w:rFonts w:ascii="Calibri" w:cs="Calibri" w:eastAsia="Calibri" w:hAnsi="Calibri"/>
-                <w:color w:val="5B6B8C"/>
-                <w:sz w:val="17"/>
-                <w:szCs w:val="17"/>
-              </w:rPr>
-              <w:t xml:space="preserve">2.7 D · 2.8 D · 2.11 C/D</w:t>
-            </w:r>
-          </w:p>
-        </w:tc>
-        <w:tc>
-          <w:tcPr>
-            <w:tcW w:type="dxa" w:w="1900"/>
-            <w:tcBorders>
-              <w:top w:val="single" w:color="B9C6E8" w:sz="6"/>
-              <w:left w:val="single" w:color="B9C6E8" w:sz="6"/>
-              <w:bottom w:val="single" w:color="B9C6E8" w:sz="6"/>
-              <w:right w:val="single" w:color="B9C6E8" w:sz="6"/>
-            </w:tcBorders>
-            <w:tcMar>
-              <w:top w:type="dxa" w:w="50"/>
-              <w:left w:type="dxa" w:w="80"/>
-              <w:bottom w:type="dxa" w:w="50"/>
-              <w:right w:type="dxa" w:w="100"/>
-            </w:tcMar>
-            <w:vAlign w:val="top"/>
-          </w:tcPr>
-          <w:p>
-            <w:pPr>
-              <w:spacing w:after="0" w:before="0"/>
-            </w:pPr>
-            <w:r>
-              <w:rPr>
-                <w:rFonts w:ascii="Calibri" w:cs="Calibri" w:eastAsia="Calibri" w:hAnsi="Calibri"/>
-                <w:b/>
-                <w:bCs/>
-                <w:color w:val="C0392B"/>
-                <w:sz w:val="19"/>
-                <w:szCs w:val="19"/>
-              </w:rPr>
-              <w:t xml:space="preserve"/>
-            </w:r>
-          </w:p>
-        </w:tc>
-      </w:tr>
-      <w:tr>
-        <w:trPr>
-          <w:cantSplit/>
-        </w:trPr>
-        <w:tc>
-          <w:tcPr>
-            <w:tcW w:type="dxa" w:w="700"/>
-            <w:tcBorders>
-              <w:top w:val="single" w:color="B9C6E8" w:sz="6"/>
-              <w:left w:val="single" w:color="B9C6E8" w:sz="6"/>
-              <w:bottom w:val="single" w:color="B9C6E8" w:sz="6"/>
-              <w:right w:val="single" w:color="B9C6E8" w:sz="6"/>
-            </w:tcBorders>
-            <w:shd w:fill="F4F7FD" w:color="auto" w:val="clear"/>
-            <w:tcMar>
-              <w:top w:type="dxa" w:w="50"/>
-              <w:left w:type="dxa" w:w="80"/>
-              <w:bottom w:type="dxa" w:w="50"/>
-              <w:right w:type="dxa" w:w="100"/>
-            </w:tcMar>
-            <w:vAlign w:val="top"/>
-          </w:tcPr>
-          <w:p>
-            <w:pPr>
-              <w:spacing w:after="0" w:before="0"/>
-            </w:pPr>
-            <w:r>
-              <w:rPr>
-                <w:rFonts w:ascii="Calibri" w:cs="Calibri" w:eastAsia="Calibri" w:hAnsi="Calibri"/>
-                <w:b/>
-                <w:bCs/>
-                <w:color w:val="D9534F"/>
-                <w:sz w:val="19"/>
-                <w:szCs w:val="19"/>
-              </w:rPr>
-              <w:t xml:space="preserve">43</w:t>
-            </w:r>
-          </w:p>
-        </w:tc>
-        <w:tc>
-          <w:tcPr>
-            <w:tcW w:type="dxa" w:w="2700"/>
-            <w:tcBorders>
-              <w:top w:val="single" w:color="B9C6E8" w:sz="6"/>
-              <w:left w:val="single" w:color="B9C6E8" w:sz="6"/>
-              <w:bottom w:val="single" w:color="B9C6E8" w:sz="6"/>
-              <w:right w:val="single" w:color="B9C6E8" w:sz="6"/>
-            </w:tcBorders>
-            <w:tcMar>
-              <w:top w:type="dxa" w:w="50"/>
-              <w:left w:type="dxa" w:w="80"/>
-              <w:bottom w:type="dxa" w:w="50"/>
-              <w:right w:type="dxa" w:w="100"/>
-            </w:tcMar>
-            <w:vAlign w:val="top"/>
-          </w:tcPr>
-          <w:p>
-            <w:pPr>
-              <w:spacing w:after="0" w:before="0"/>
-            </w:pPr>
-            <w:r>
-              <w:rPr>
-                <w:rFonts w:ascii="Calibri" w:cs="Calibri" w:eastAsia="Calibri" w:hAnsi="Calibri"/>
-                <w:b/>
-                <w:bCs/>
-                <w:color w:val="1E2761"/>
-                <w:sz w:val="19"/>
-                <w:szCs w:val="19"/>
-              </w:rPr>
-              <w:t xml:space="preserve">Puffer</w:t>
-            </w:r>
-          </w:p>
-        </w:tc>
-        <w:tc>
-          <w:tcPr>
-            <w:tcW w:type="dxa" w:w="3600"/>
-            <w:tcBorders>
-              <w:top w:val="single" w:color="B9C6E8" w:sz="6"/>
-              <w:left w:val="single" w:color="B9C6E8" w:sz="6"/>
-              <w:bottom w:val="single" w:color="B9C6E8" w:sz="6"/>
-              <w:right w:val="single" w:color="B9C6E8" w:sz="6"/>
-            </w:tcBorders>
-            <w:tcMar>
-              <w:top w:type="dxa" w:w="50"/>
-              <w:left w:type="dxa" w:w="80"/>
-              <w:bottom w:type="dxa" w:w="50"/>
-              <w:right w:type="dxa" w:w="100"/>
-            </w:tcMar>
-            <w:vAlign w:val="top"/>
-          </w:tcPr>
-          <w:p>
-            <w:pPr>
-              <w:spacing w:after="0" w:before="0"/>
-            </w:pPr>
-            <w:r>
-              <w:rPr>
-                <w:rFonts w:ascii="Calibri" w:cs="Calibri" w:eastAsia="Calibri" w:hAnsi="Calibri"/>
-                <w:i/>
-                <w:iCs/>
-                <w:color w:val="000000"/>
-                <w:sz w:val="19"/>
-                <w:szCs w:val="19"/>
-              </w:rPr>
-              <w:t xml:space="preserve"/>
-            </w:r>
-          </w:p>
-        </w:tc>
-        <w:tc>
-          <w:tcPr>
-            <w:tcW w:type="dxa" w:w="5300"/>
-            <w:tcBorders>
-              <w:top w:val="single" w:color="B9C6E8" w:sz="6"/>
-              <w:left w:val="single" w:color="B9C6E8" w:sz="6"/>
-              <w:bottom w:val="single" w:color="B9C6E8" w:sz="6"/>
-              <w:right w:val="single" w:color="B9C6E8" w:sz="6"/>
-            </w:tcBorders>
-            <w:tcMar>
-              <w:top w:type="dxa" w:w="50"/>
-              <w:left w:type="dxa" w:w="80"/>
-              <w:bottom w:type="dxa" w:w="50"/>
-              <w:right w:type="dxa" w:w="100"/>
-            </w:tcMar>
-            <w:vAlign w:val="top"/>
-          </w:tcPr>
-          <w:p>
-            <w:pPr>
-              <w:spacing w:after="0" w:before="0"/>
-            </w:pPr>
-            <w:r>
-              <w:rPr>
-                <w:rFonts w:ascii="Calibri" w:cs="Calibri" w:eastAsia="Calibri" w:hAnsi="Calibri"/>
-                <w:color w:val="000000"/>
-                <w:sz w:val="19"/>
-                <w:szCs w:val="19"/>
-              </w:rPr>
-              <w:t xml:space="preserve">Reserve für Verschiebungen (z. B. KA 1).</w:t>
-            </w:r>
-          </w:p>
-        </w:tc>
-        <w:tc>
-          <w:tcPr>
-            <w:tcW w:type="dxa" w:w="1238"/>
-            <w:tcBorders>
-              <w:top w:val="single" w:color="B9C6E8" w:sz="6"/>
-              <w:left w:val="single" w:color="B9C6E8" w:sz="6"/>
-              <w:bottom w:val="single" w:color="B9C6E8" w:sz="6"/>
-              <w:right w:val="single" w:color="B9C6E8" w:sz="6"/>
-            </w:tcBorders>
-            <w:tcMar>
-              <w:top w:type="dxa" w:w="50"/>
-              <w:left w:type="dxa" w:w="80"/>
-              <w:bottom w:type="dxa" w:w="50"/>
-              <w:right w:type="dxa" w:w="100"/>
-            </w:tcMar>
-            <w:vAlign w:val="top"/>
-          </w:tcPr>
-          <w:p>
-            <w:pPr>
-              <w:spacing w:after="0" w:before="0"/>
-            </w:pPr>
-            <w:r>
-              <w:rPr>
-                <w:rFonts w:ascii="Calibri" w:cs="Calibri" w:eastAsia="Calibri" w:hAnsi="Calibri"/>
-                <w:color w:val="5B6B8C"/>
-                <w:sz w:val="17"/>
-                <w:szCs w:val="17"/>
-              </w:rPr>
-              <w:t xml:space="preserve"/>
+              <w:t xml:space="preserve">2.7 D · 2.8 D</w:t>
             </w:r>
           </w:p>
         </w:tc>

</xml_diff>

<commit_message>
Grobplanung Balladen: Stundenplan (Mo ES, Mi DS, Do ES, Fr ES), Woche 9 nur Mo 21.12.
Co-Authored-By: Claude Opus 5.5 <noreply@anthropic.com>
Claude-Session: https://claude.ai/code/session_01KXvLXHMYPnCyEbMRgNaaYs
</commit_message>
<xml_diff>
--- a/Deutsch_7A/Balladen/Grobplanung_Balladen.docx
+++ b/Deutsch_7A/Balladen/Grobplanung_Balladen.docx
@@ -15,7 +15,7 @@
           <w:sz w:val="18"/>
           <w:szCs w:val="18"/>
         </w:rPr>
-        <w:t xml:space="preserve">GROBPLANUNG · DEUTSCH · KLASSE 7A · CA. 9 UNTERRICHTSWOCHEN · 5 STUNDEN PRO WOCHE · 39 STUNDEN BALLADEN</w:t>
+        <w:t xml:space="preserve">GROBPLANUNG · DEUTSCH · KLASSE 7A · CA. 9 UNTERRICHTSWOCHEN · 5 STUNDEN PRO WOCHE · 38 STUNDEN BALLADEN</w:t>
       </w:r>
     </w:p>
     <w:p>
@@ -189,7 +189,7 @@
                 <w:sz w:val="19"/>
                 <w:szCs w:val="19"/>
               </w:rPr>
-              <w:t xml:space="preserve">Bewertung 1: Analyse der Merkmale (Std. 19, Woche 5) · Bewertung 2: Textüberarbeitung aus der Figurenperspektive (Std. 25, Woche 6) · Bewertung 3: Rezitation einer selbst gewählten Ballade (Std. 36–38, Woche 8–9, vor den Weihnachtsferien)</w:t>
+              <w:t xml:space="preserve">Bewertung 1: Analyse der Merkmale (Std. 19, Woche 5) · Bewertung 2: Textüberarbeitung aus der Figurenperspektive (Std. 25, Woche 6) · Bewertung 3: Rezitation einer selbst gewählten Ballade (Std. 36–38, 17.–21.12., vor den Weihnachtsferien)</w:t>
             </w:r>
           </w:p>
         </w:tc>
@@ -333,7 +333,7 @@
                 <w:sz w:val="19"/>
                 <w:szCs w:val="19"/>
               </w:rPr>
-              <w:t xml:space="preserve">KA 1 (Verben) am Do 15.10. · Mitarbeit: Selbsteinschätzung Di 13.10. (20 Min.), Rückgabe mit Note Fr 16.10. · Herbstferien 17.10.–2.11. · Weihnachtsferien ab 23.12. · Woche 2: 4 Std. (2.11. frei), Woche 9: 21.–22.12. (Stundenzahl prüfen) · Kein eigener Puffer mehr: Std. 39 und die mit * markierten Teile können entfallen.</w:t>
+              <w:t xml:space="preserve">Stundenplan: Mo ES, Mi DS, Do ES, Fr ES · KA 1 (Verben) am Do 15.10. · Mitarbeit: Selbsteinschätzung Mi 14.10. (20 Min.), Rückgabe mit Note Fr 16.10. · Herbstferien 17.10.–2.11. · Weihnachtsferien ab 23.12. (letzte Stunde Mo 21.12.) · Kein eigener Puffer: mit * markierte Teile können entfallen.</w:t>
             </w:r>
           </w:p>
         </w:tc>
@@ -630,7 +630,7 @@
                 <w:sz w:val="21"/>
                 <w:szCs w:val="21"/>
               </w:rPr>
-              <w:t xml:space="preserve">Woche 1 · 13.–16.10. · Was ist eine Ballade? – Lesetechniken</w:t>
+              <w:t xml:space="preserve">Woche 1 · 14.–16.10. · Was ist eine Ballade? – Lesetechniken</w:t>
             </w:r>
             <w:r>
               <w:rPr>
@@ -713,7 +713,7 @@
                 <w:sz w:val="19"/>
                 <w:szCs w:val="19"/>
               </w:rPr>
-              <w:t xml:space="preserve">Mitarbeit einschätzen (20′) · Eine Ballade hören (25′)</w:t>
+              <w:t xml:space="preserve">Mi 14.10. (DS) · Mitarbeit einschätzen (20′) · Eine Ballade hören (25′)</w:t>
             </w:r>
           </w:p>
         </w:tc>
@@ -919,7 +919,7 @@
                 <w:sz w:val="19"/>
                 <w:szCs w:val="19"/>
               </w:rPr>
-              <w:t xml:space="preserve">Lesetechniken</w:t>
+              <w:t xml:space="preserve">Mi 14.10. (DS) · Lesetechniken</w:t>
             </w:r>
           </w:p>
         </w:tc>
@@ -1125,7 +1125,7 @@
                 <w:sz w:val="19"/>
                 <w:szCs w:val="19"/>
               </w:rPr>
-              <w:t xml:space="preserve">KA 1: Verben und Zeitformen (Do 15.10.)</w:t>
+              <w:t xml:space="preserve">Do 15.10. · KA 1: Verben und Zeitformen</w:t>
             </w:r>
           </w:p>
         </w:tc>
@@ -1331,7 +1331,7 @@
                 <w:sz w:val="19"/>
                 <w:szCs w:val="19"/>
               </w:rPr>
-              <w:t xml:space="preserve">Rückgabe Mitarbeit (10′) · Eine Ballade gliedern (35′)</w:t>
+              <w:t xml:space="preserve">Fr 16.10. · Rückgabe Mitarbeit (10′) · Eine Ballade gliedern (35′)</w:t>
             </w:r>
           </w:p>
         </w:tc>
@@ -1554,7 +1554,7 @@
                 <w:sz w:val="21"/>
                 <w:szCs w:val="21"/>
               </w:rPr>
-              <w:t xml:space="preserve">Woche 2 · 3.–6.11. · Eine Ballade erschließen</w:t>
+              <w:t xml:space="preserve">Woche 2 · 4.–6.11. · Eine Ballade erschließen</w:t>
             </w:r>
             <w:r>
               <w:rPr>
@@ -1563,7 +1563,7 @@
                 <w:sz w:val="18"/>
                 <w:szCs w:val="18"/>
               </w:rPr>
-              <w:t xml:space="preserve">   4 Stunden · John Maynard</w:t>
+              <w:t xml:space="preserve">   4 Stunden (Mo 2.11. frei) · John Maynard</w:t>
             </w:r>
           </w:p>
         </w:tc>
@@ -8908,7 +8908,7 @@
                 <w:sz w:val="21"/>
                 <w:szCs w:val="21"/>
               </w:rPr>
-              <w:t xml:space="preserve">Woche 9 · 21.–22.12. · Abschluss vor den Weihnachtsferien</w:t>
+              <w:t xml:space="preserve">Woche 9 · Mo 21.12. · Abschluss vor den Weihnachtsferien</w:t>
             </w:r>
             <w:r>
               <w:rPr>
@@ -8917,7 +8917,7 @@
                 <w:sz w:val="18"/>
                 <w:szCs w:val="18"/>
               </w:rPr>
-              <w:t xml:space="preserve">   Stundenzahl prüfen (angenommen: 2)</w:t>
+              <w:t xml:space="preserve">   1 Stunde</w:t>
             </w:r>
           </w:p>
         </w:tc>
@@ -8991,7 +8991,7 @@
                 <w:sz w:val="19"/>
                 <w:szCs w:val="19"/>
               </w:rPr>
-              <w:t xml:space="preserve">Rezitation III</w:t>
+              <w:t xml:space="preserve">Rezitation III · * Rückblick</w:t>
             </w:r>
           </w:p>
         </w:tc>
@@ -9057,7 +9057,7 @@
                 <w:sz w:val="19"/>
                 <w:szCs w:val="19"/>
               </w:rPr>
-              <w:t xml:space="preserve">Restliche Vorträge (ggf. im geschützten Raum).</w:t>
+              <w:t xml:space="preserve">Restliche Vorträge (ggf. im geschützten Raum). * Falls Zeit bleibt: Rückblick „Welche Ballade hat mich am meisten überzeugt – und warum?“</w:t>
             </w:r>
           </w:p>
         </w:tc>
@@ -9089,7 +9089,7 @@
                 <w:sz w:val="17"/>
                 <w:szCs w:val="17"/>
               </w:rPr>
-              <w:t xml:space="preserve">2.7</w:t>
+              <w:t xml:space="preserve">2.7 · 2.8 D</w:t>
             </w:r>
           </w:p>
         </w:tc>
@@ -9124,212 +9124,6 @@
                 <w:szCs w:val="19"/>
               </w:rPr>
               <w:t xml:space="preserve">Bewertung 3: Rezitation</w:t>
-            </w:r>
-          </w:p>
-        </w:tc>
-      </w:tr>
-      <w:tr>
-        <w:trPr>
-          <w:cantSplit/>
-        </w:trPr>
-        <w:tc>
-          <w:tcPr>
-            <w:tcW w:type="dxa" w:w="700"/>
-            <w:tcBorders>
-              <w:top w:val="single" w:color="B9C6E8" w:sz="6"/>
-              <w:left w:val="single" w:color="B9C6E8" w:sz="6"/>
-              <w:bottom w:val="single" w:color="B9C6E8" w:sz="6"/>
-              <w:right w:val="single" w:color="B9C6E8" w:sz="6"/>
-            </w:tcBorders>
-            <w:shd w:fill="F4F7FD" w:color="auto" w:val="clear"/>
-            <w:tcMar>
-              <w:top w:type="dxa" w:w="50"/>
-              <w:left w:type="dxa" w:w="80"/>
-              <w:bottom w:type="dxa" w:w="50"/>
-              <w:right w:type="dxa" w:w="100"/>
-            </w:tcMar>
-            <w:vAlign w:val="top"/>
-          </w:tcPr>
-          <w:p>
-            <w:pPr>
-              <w:spacing w:after="0" w:before="0"/>
-            </w:pPr>
-            <w:r>
-              <w:rPr>
-                <w:rFonts w:ascii="Calibri" w:cs="Calibri" w:eastAsia="Calibri" w:hAnsi="Calibri"/>
-                <w:b/>
-                <w:bCs/>
-                <w:color w:val="D9534F"/>
-                <w:sz w:val="19"/>
-                <w:szCs w:val="19"/>
-              </w:rPr>
-              <w:t xml:space="preserve">39</w:t>
-            </w:r>
-          </w:p>
-        </w:tc>
-        <w:tc>
-          <w:tcPr>
-            <w:tcW w:type="dxa" w:w="2700"/>
-            <w:tcBorders>
-              <w:top w:val="single" w:color="B9C6E8" w:sz="6"/>
-              <w:left w:val="single" w:color="B9C6E8" w:sz="6"/>
-              <w:bottom w:val="single" w:color="B9C6E8" w:sz="6"/>
-              <w:right w:val="single" w:color="B9C6E8" w:sz="6"/>
-            </w:tcBorders>
-            <w:tcMar>
-              <w:top w:type="dxa" w:w="50"/>
-              <w:left w:type="dxa" w:w="80"/>
-              <w:bottom w:type="dxa" w:w="50"/>
-              <w:right w:type="dxa" w:w="100"/>
-            </w:tcMar>
-            <w:vAlign w:val="top"/>
-          </w:tcPr>
-          <w:p>
-            <w:pPr>
-              <w:spacing w:after="0" w:before="0"/>
-            </w:pPr>
-            <w:r>
-              <w:rPr>
-                <w:rFonts w:ascii="Calibri" w:cs="Calibri" w:eastAsia="Calibri" w:hAnsi="Calibri"/>
-                <w:b/>
-                <w:bCs/>
-                <w:color w:val="1E2761"/>
-                <w:sz w:val="19"/>
-                <w:szCs w:val="19"/>
-              </w:rPr>
-              <w:t xml:space="preserve">* Rückblick: meine Ballade</w:t>
-            </w:r>
-          </w:p>
-        </w:tc>
-        <w:tc>
-          <w:tcPr>
-            <w:tcW w:type="dxa" w:w="3600"/>
-            <w:tcBorders>
-              <w:top w:val="single" w:color="B9C6E8" w:sz="6"/>
-              <w:left w:val="single" w:color="B9C6E8" w:sz="6"/>
-              <w:bottom w:val="single" w:color="B9C6E8" w:sz="6"/>
-              <w:right w:val="single" w:color="B9C6E8" w:sz="6"/>
-            </w:tcBorders>
-            <w:tcMar>
-              <w:top w:type="dxa" w:w="50"/>
-              <w:left w:type="dxa" w:w="80"/>
-              <w:bottom w:type="dxa" w:w="50"/>
-              <w:right w:type="dxa" w:w="100"/>
-            </w:tcMar>
-            <w:vAlign w:val="top"/>
-          </w:tcPr>
-          <w:p>
-            <w:pPr>
-              <w:spacing w:after="0" w:before="0"/>
-            </w:pPr>
-            <w:r>
-              <w:rPr>
-                <w:rFonts w:ascii="Calibri" w:cs="Calibri" w:eastAsia="Calibri" w:hAnsi="Calibri"/>
-                <w:i/>
-                <w:iCs/>
-                <w:color w:val="000000"/>
-                <w:sz w:val="19"/>
-                <w:szCs w:val="19"/>
-              </w:rPr>
-              <w:t xml:space="preserve">… meinen Lernstand einschätzen und begründen, welche Ballade mich am meisten überzeugt.</w:t>
-            </w:r>
-          </w:p>
-        </w:tc>
-        <w:tc>
-          <w:tcPr>
-            <w:tcW w:type="dxa" w:w="5300"/>
-            <w:tcBorders>
-              <w:top w:val="single" w:color="B9C6E8" w:sz="6"/>
-              <w:left w:val="single" w:color="B9C6E8" w:sz="6"/>
-              <w:bottom w:val="single" w:color="B9C6E8" w:sz="6"/>
-              <w:right w:val="single" w:color="B9C6E8" w:sz="6"/>
-            </w:tcBorders>
-            <w:tcMar>
-              <w:top w:type="dxa" w:w="50"/>
-              <w:left w:type="dxa" w:w="80"/>
-              <w:bottom w:type="dxa" w:w="50"/>
-              <w:right w:type="dxa" w:w="100"/>
-            </w:tcMar>
-            <w:vAlign w:val="top"/>
-          </w:tcPr>
-          <w:p>
-            <w:pPr>
-              <w:spacing w:after="0" w:before="0"/>
-            </w:pPr>
-            <w:r>
-              <w:rPr>
-                <w:rFonts w:ascii="Calibri" w:cs="Calibri" w:eastAsia="Calibri" w:hAnsi="Calibri"/>
-                <w:color w:val="000000"/>
-                <w:sz w:val="19"/>
-                <w:szCs w:val="19"/>
-              </w:rPr>
-              <w:t xml:space="preserve">Selbsteinschätzung; kurze begründete Stellungnahme. Dient zugleich als Puffer, falls Rezitationen länger dauern.</w:t>
-            </w:r>
-          </w:p>
-        </w:tc>
-        <w:tc>
-          <w:tcPr>
-            <w:tcW w:type="dxa" w:w="1238"/>
-            <w:tcBorders>
-              <w:top w:val="single" w:color="B9C6E8" w:sz="6"/>
-              <w:left w:val="single" w:color="B9C6E8" w:sz="6"/>
-              <w:bottom w:val="single" w:color="B9C6E8" w:sz="6"/>
-              <w:right w:val="single" w:color="B9C6E8" w:sz="6"/>
-            </w:tcBorders>
-            <w:tcMar>
-              <w:top w:type="dxa" w:w="50"/>
-              <w:left w:type="dxa" w:w="80"/>
-              <w:bottom w:type="dxa" w:w="50"/>
-              <w:right w:type="dxa" w:w="100"/>
-            </w:tcMar>
-            <w:vAlign w:val="top"/>
-          </w:tcPr>
-          <w:p>
-            <w:pPr>
-              <w:spacing w:after="0" w:before="0"/>
-            </w:pPr>
-            <w:r>
-              <w:rPr>
-                <w:rFonts w:ascii="Calibri" w:cs="Calibri" w:eastAsia="Calibri" w:hAnsi="Calibri"/>
-                <w:color w:val="5B6B8C"/>
-                <w:sz w:val="17"/>
-                <w:szCs w:val="17"/>
-              </w:rPr>
-              <w:t xml:space="preserve">2.7 D · 2.8 D</w:t>
-            </w:r>
-          </w:p>
-        </w:tc>
-        <w:tc>
-          <w:tcPr>
-            <w:tcW w:type="dxa" w:w="1900"/>
-            <w:tcBorders>
-              <w:top w:val="single" w:color="B9C6E8" w:sz="6"/>
-              <w:left w:val="single" w:color="B9C6E8" w:sz="6"/>
-              <w:bottom w:val="single" w:color="B9C6E8" w:sz="6"/>
-              <w:right w:val="single" w:color="B9C6E8" w:sz="6"/>
-            </w:tcBorders>
-            <w:tcMar>
-              <w:top w:type="dxa" w:w="50"/>
-              <w:left w:type="dxa" w:w="80"/>
-              <w:bottom w:type="dxa" w:w="50"/>
-              <w:right w:type="dxa" w:w="100"/>
-            </w:tcMar>
-            <w:vAlign w:val="top"/>
-          </w:tcPr>
-          <w:p>
-            <w:pPr>
-              <w:spacing w:after="0" w:before="0"/>
-            </w:pPr>
-            <w:r>
-              <w:rPr>
-                <w:rFonts w:ascii="Calibri" w:cs="Calibri" w:eastAsia="Calibri" w:hAnsi="Calibri"/>
-                <w:b/>
-                <w:bCs/>
-                <w:color w:val="C0392B"/>
-                <w:sz w:val="19"/>
-                <w:szCs w:val="19"/>
-              </w:rPr>
-              <w:t xml:space="preserve"/>
             </w:r>
           </w:p>
         </w:tc>

</xml_diff>

<commit_message>
Methodenkarten Lesetraining eingebunden: Woche 1 (Schattenlesen, Tandemlesen), Grobplanung, CLAUDE.md
Co-Authored-By: Claude Opus 5.5 <noreply@anthropic.com>
Claude-Session: https://claude.ai/code/session_01KXvLXHMYPnCyEbMRgNaaYs
</commit_message>
<xml_diff>
--- a/Deutsch_7A/Balladen/Grobplanung_Balladen.docx
+++ b/Deutsch_7A/Balladen/Grobplanung_Balladen.docx
@@ -261,7 +261,7 @@
                 <w:sz w:val="19"/>
                 <w:szCs w:val="19"/>
               </w:rPr>
-              <w:t xml:space="preserve">Jede Stunde nach AVIVA · Lernziel als „Ich kann …“ und Ablauf an der Tafel (Streichbares mit *) · alle Schüler in jeder Phase aktiv: erst allein oder zu zweit, dann Vergleich an der Tafel · am Ende „Heute habe ich gelernt, …“ · Bezüge zum Leistungssport nur dort, wo sie sich anbieten</w:t>
+              <w:t xml:space="preserve">Jede Stunde nach AVIVA · Lernziel als „Ich kann …“ und Ablauf an der Tafel (Streichbares mit *) · alle Schüler in jeder Phase aktiv: erst allein oder zu zweit, dann Vergleich an der Tafel · am Ende „Heute habe ich gelernt, …“ · Lesetraining nach den Methodenkarten der Schule (Tandemlesen, chorisches Lesen, Ich-Du-Wir-Würfeln, Blitzlesen, Lautlesetraining mit Hörbuch) regelmäßig eingebaut · Bezüge zum Leistungssport nur dort, wo sie sich anbieten</w:t>
             </w:r>
           </w:p>
         </w:tc>
@@ -779,7 +779,7 @@
                 <w:sz w:val="19"/>
                 <w:szCs w:val="19"/>
               </w:rPr>
-              <w:t xml:space="preserve">Selbsteinschätzungsbogen Mitarbeit ausfüllen, Lehrkraft sammelt ein. Danach Hörfassung „John Maynard“ (z. B. Achim Reichel) mit Notizraster wer – wo – was passiert – wie endet es; Abgleich zu zweit.</w:t>
+              <w:t xml:space="preserve">Selbsteinschätzungsbogen Mitarbeit ausfüllen, Lehrkraft sammelt ein. Danach Hörfassung „John Maynard“ (z. B. Achim Reichel) mit Notizraster wer – wo – was passiert – wie endet es; Abgleich zu zweit. Lesetraining: Schattenlesen mit dem Hörbuch, Nachlesen im Tandem.</w:t>
             </w:r>
           </w:p>
         </w:tc>
@@ -1397,7 +1397,7 @@
                 <w:sz w:val="19"/>
                 <w:szCs w:val="19"/>
               </w:rPr>
-              <w:t xml:space="preserve">Bögen mit Einschätzung und Note der Lehrkraft zurück, kurze Einzelgespräche während der Arbeitsphase. Genaues Lesen anwenden: in PA Abschnitte markieren und Zwischenüberschriften notieren; Vergleich an der Tafel.</w:t>
+              <w:t xml:space="preserve">Bögen mit Einschätzung und Note der Lehrkraft zurück, kurze Einzelgespräche während der Arbeitsphase. Lesetraining: Tandemlesen. Dann in PA Abschnitte festlegen und Zwischenüberschriften notieren; Vergleich in der Kreide-Kette.</w:t>
             </w:r>
           </w:p>
         </w:tc>
@@ -2989,7 +2989,7 @@
                 <w:sz w:val="19"/>
                 <w:szCs w:val="19"/>
               </w:rPr>
-              <w:t xml:space="preserve">Bürgschaft Strophen 1–7 lesen bzw. hören; Konflikt Möros – Dionys; Vermutungen schriftlich, dann Weiterlesen.</w:t>
+              <w:t xml:space="preserve">Bürgschaft Strophen 1–7 in Gruppen mit Ich-Du-Wir-Würfeln lesen; Konflikt Möros – Dionys; Vermutungen schriftlich, dann Weiterlesen.</w:t>
             </w:r>
           </w:p>
         </w:tc>
@@ -4069,7 +4069,7 @@
                 <w:sz w:val="19"/>
                 <w:szCs w:val="19"/>
               </w:rPr>
-              <w:t xml:space="preserve">Lesen mit gestuften Hilfen (Worterklärungen, Leitfragen); Gliederung mit Zwischenüberschriften.</w:t>
+              <w:t xml:space="preserve">Blitzlesen schwieriger Wörter (z. B. Altan, Leu, Zwinger); Lesen mit gestuften Hilfen (Worterklärungen, Leitfragen); Gliederung mit Zwischenüberschriften.</w:t>
             </w:r>
           </w:p>
         </w:tc>
@@ -6435,7 +6435,7 @@
                 <w:sz w:val="19"/>
                 <w:szCs w:val="19"/>
               </w:rPr>
-              <w:t xml:space="preserve">Sprecher farbig markieren (Erzähler, Vater, Sohn, Erlkönig); mit verteilten Rollen lesen.</w:t>
+              <w:t xml:space="preserve">Sprecher farbig markieren (Erzähler, Vater, Sohn, Erlkönig); Rollenlesen, Erzählerstrophen chorisch.</w:t>
             </w:r>
           </w:p>
         </w:tc>
@@ -7721,7 +7721,7 @@
                 <w:sz w:val="19"/>
                 <w:szCs w:val="19"/>
               </w:rPr>
-              <w:t xml:space="preserve">Vortragszeichen an einer Strophe, dann an der eigenen Ballade. Hausaufgabe: auswendig lernen.</w:t>
+              <w:t xml:space="preserve">Vortragszeichen an einer Strophe; die Strophe chorisch mit festgelegten Pausen und Tempo lesen; dann Vortragszeichen an der eigenen Ballade. Hausaufgabe: auswendig lernen.</w:t>
             </w:r>
           </w:p>
         </w:tc>

</xml_diff>

<commit_message>
Balladen Woche 1: Paddy Fingal ohne Schnipsel (Lehrbuch + Heft), Gliedern/Nacherzählen statt John Maynard, Grobplanung angepasst
Co-Authored-By: Claude Opus 5.5 <noreply@anthropic.com>
Claude-Session: https://claude.ai/code/session_01KXvLXHMYPnCyEbMRgNaaYs
</commit_message>
<xml_diff>
--- a/Deutsch_7A/Balladen/Grobplanung_Balladen.docx
+++ b/Deutsch_7A/Balladen/Grobplanung_Balladen.docx
@@ -333,7 +333,7 @@
                 <w:sz w:val="19"/>
                 <w:szCs w:val="19"/>
               </w:rPr>
-              <w:t xml:space="preserve">Stundenplan: Mo ES, Mi DS, Do ES, Fr ES · KA 1 (Verben) am Do 15.10. · Mitarbeit: Selbsteinschätzung Mi 14.10. (20 Min.), Rückgabe mit Note Fr 16.10. · Herbstferien 17.10.–2.11. · Weihnachtsferien ab 23.12. (letzte Stunde Mo 21.12.) · Kein eigener Puffer: mit * markierte Teile können entfallen.</w:t>
+              <w:t xml:space="preserve">Stundenplan: Mo ES, Mi DS, Do ES, Fr ES · Leistungskontrolle Verben (30 Min.) am Mi 14.10. · Mitarbeitsnoten: Kriterien am Mi erklären, Noten in den Arbeitsphasen einzeln mitteilen (keine Selbsteinschätzung) · Herbstferien 17.10.–2.11. · Weihnachtsferien ab 23.12. (letzte Stunde Mo 21.12.) · Gearbeitet wird mit dem Lehrbuch und im Heft, ohne Schnipsel · Kein eigener Puffer: mit * markierte Teile können entfallen.</w:t>
             </w:r>
           </w:p>
         </w:tc>
@@ -639,7 +639,7 @@
                 <w:sz w:val="18"/>
                 <w:szCs w:val="18"/>
               </w:rPr>
-              <w:t xml:space="preserve">   4 Stunden · John Maynard (Fontane) · KA 1 · Mitarbeit</w:t>
+              <w:t xml:space="preserve">   Paddy Fingal (Wilhelm Brandes, LB S. 136 f.) · Leistungskontrolle · Mitarbeitsnoten</w:t>
             </w:r>
           </w:p>
         </w:tc>
@@ -679,7 +679,7 @@
                 <w:sz w:val="19"/>
                 <w:szCs w:val="19"/>
               </w:rPr>
-              <w:t xml:space="preserve">1</w:t>
+              <w:t xml:space="preserve">LK</w:t>
             </w:r>
           </w:p>
         </w:tc>
@@ -713,7 +713,7 @@
                 <w:sz w:val="19"/>
                 <w:szCs w:val="19"/>
               </w:rPr>
-              <w:t xml:space="preserve">Mi 14.10. (DS) · Mitarbeit einschätzen (20′) · Eine Ballade hören (25′)</w:t>
+              <w:t xml:space="preserve">Mi 14.10. (DS) · Leistungskontrolle Verben (30′) · Mitarbeitsnoten: Kriterien (ca. 15′)</w:t>
             </w:r>
           </w:p>
         </w:tc>
@@ -747,7 +747,7 @@
                 <w:sz w:val="19"/>
                 <w:szCs w:val="19"/>
               </w:rPr>
-              <w:t xml:space="preserve">… meine Mitarbeit nach Kriterien einschätzen. / … beim Zuhören Notizen zu Figuren, Ort und Handlung machen.</w:t>
+              <w:t xml:space="preserve"/>
             </w:r>
           </w:p>
         </w:tc>
@@ -779,7 +779,7 @@
                 <w:sz w:val="19"/>
                 <w:szCs w:val="19"/>
               </w:rPr>
-              <w:t xml:space="preserve">Selbsteinschätzungsbogen Mitarbeit ausfüllen, Lehrkraft sammelt ein. Danach Hörfassung „John Maynard“ (z. B. Achim Reichel) mit Notizraster wer – wo – was passiert – wie endet es; Abgleich zu zweit. Lesetraining: Schattenlesen mit dem Hörbuch, Nachlesen im Tandem.</w:t>
+              <w:t xml:space="preserve">Leistungskontrolle; Präsentation zu den Kriterien der mündlichen Note und zu Unterrichtsstörungen.</w:t>
             </w:r>
           </w:p>
         </w:tc>
@@ -811,7 +811,7 @@
                 <w:sz w:val="17"/>
                 <w:szCs w:val="17"/>
               </w:rPr>
-              <w:t xml:space="preserve">2.3 D · 2.11 D</w:t>
+              <w:t xml:space="preserve"/>
             </w:r>
           </w:p>
         </w:tc>
@@ -845,7 +845,7 @@
                 <w:sz w:val="19"/>
                 <w:szCs w:val="19"/>
               </w:rPr>
-              <w:t xml:space="preserve"/>
+              <w:t xml:space="preserve">Leistungskontrolle</w:t>
             </w:r>
           </w:p>
         </w:tc>
@@ -885,7 +885,7 @@
                 <w:sz w:val="19"/>
                 <w:szCs w:val="19"/>
               </w:rPr>
-              <w:t xml:space="preserve">2</w:t>
+              <w:t xml:space="preserve">1</w:t>
             </w:r>
           </w:p>
         </w:tc>
@@ -919,7 +919,7 @@
                 <w:sz w:val="19"/>
                 <w:szCs w:val="19"/>
               </w:rPr>
-              <w:t xml:space="preserve">Mi 14.10. (DS) · Lesetechniken</w:t>
+              <w:t xml:space="preserve">Mi 14.10. (DS) · Paddy Fingal – Lesetechniken</w:t>
             </w:r>
           </w:p>
         </w:tc>
@@ -953,7 +953,7 @@
                 <w:sz w:val="19"/>
                 <w:szCs w:val="19"/>
               </w:rPr>
-              <w:t xml:space="preserve">… überfliegend, orientierend und genau lesen und die passende Technik zum Leseziel wählen.</w:t>
+              <w:t xml:space="preserve">… je nach Leseziel überfliegend, orientierend oder genau lesen und meinen ersten Eindruck begründen.</w:t>
             </w:r>
           </w:p>
         </w:tc>
@@ -985,7 +985,7 @@
                 <w:sz w:val="19"/>
                 <w:szCs w:val="19"/>
               </w:rPr>
-              <w:t xml:space="preserve">Merksatz Lesetechniken (Wofür? Test). Drei Aufträge am Text, alle arbeiten allein mit Zeitvorgabe: überfliegen (Worum geht es? 1 Min.), orientieren (Wo steht …?), genau lesen mit Randnotizen; unbekannte Wörter aus dem Kontext erschließen. Vergleich in PA.</w:t>
+              <w:t xml:space="preserve">Präsentation; Merksatz 1 Lesetechniken; Ü1 im Heft: 1 Min. überfliegen, Vorlesen mit Kehrreim im Chor (chorisches Lesen), erster Eindruck, orientierend suchen, Str. 7–9 genau lesen (Schayas List). * LB-Aufgabe 1.</w:t>
             </w:r>
           </w:p>
         </w:tc>
@@ -1091,7 +1091,7 @@
                 <w:sz w:val="19"/>
                 <w:szCs w:val="19"/>
               </w:rPr>
-              <w:t xml:space="preserve">KA</w:t>
+              <w:t xml:space="preserve">2</w:t>
             </w:r>
           </w:p>
         </w:tc>
@@ -1125,7 +1125,7 @@
                 <w:sz w:val="19"/>
                 <w:szCs w:val="19"/>
               </w:rPr>
-              <w:t xml:space="preserve">Do 15.10. · KA 1: Verben und Zeitformen</w:t>
+              <w:t xml:space="preserve">Do 15.10. · Paddy Fingal gliedern und nacherzählen</w:t>
             </w:r>
           </w:p>
         </w:tc>
@@ -1159,7 +1159,7 @@
                 <w:sz w:val="19"/>
                 <w:szCs w:val="19"/>
               </w:rPr>
-              <w:t xml:space="preserve"/>
+              <w:t xml:space="preserve">… eine Ballade gliedern, Zwischenüberschriften formulieren und sie damit nacherzählen.</w:t>
             </w:r>
           </w:p>
         </w:tc>
@@ -1191,7 +1191,7 @@
                 <w:sz w:val="19"/>
                 <w:szCs w:val="19"/>
               </w:rPr>
-              <w:t xml:space="preserve">Klassenarbeit.</w:t>
+              <w:t xml:space="preserve">Merksatz 2; Tandemlesen; Gliederung im Heft, Vergleich in der Kreide-Kette; LB-Aufgabe 1 b mündlich nacherzählen. Mitarbeitsnoten einzeln mitteilen.</w:t>
             </w:r>
           </w:p>
         </w:tc>
@@ -1223,41 +1223,41 @@
                 <w:sz w:val="17"/>
                 <w:szCs w:val="17"/>
               </w:rPr>
+              <w:t xml:space="preserve">2.8 D · 2.1</w:t>
+            </w:r>
+          </w:p>
+        </w:tc>
+        <w:tc>
+          <w:tcPr>
+            <w:tcW w:type="dxa" w:w="1900"/>
+            <w:tcBorders>
+              <w:top w:val="single" w:color="B9C6E8" w:sz="6"/>
+              <w:left w:val="single" w:color="B9C6E8" w:sz="6"/>
+              <w:bottom w:val="single" w:color="B9C6E8" w:sz="6"/>
+              <w:right w:val="single" w:color="B9C6E8" w:sz="6"/>
+            </w:tcBorders>
+            <w:tcMar>
+              <w:top w:type="dxa" w:w="50"/>
+              <w:left w:type="dxa" w:w="80"/>
+              <w:bottom w:type="dxa" w:w="50"/>
+              <w:right w:type="dxa" w:w="100"/>
+            </w:tcMar>
+            <w:vAlign w:val="top"/>
+          </w:tcPr>
+          <w:p>
+            <w:pPr>
+              <w:spacing w:after="0" w:before="0"/>
+            </w:pPr>
+            <w:r>
+              <w:rPr>
+                <w:rFonts w:ascii="Calibri" w:cs="Calibri" w:eastAsia="Calibri" w:hAnsi="Calibri"/>
+                <w:b/>
+                <w:bCs/>
+                <w:color w:val="C0392B"/>
+                <w:sz w:val="19"/>
+                <w:szCs w:val="19"/>
+              </w:rPr>
               <w:t xml:space="preserve"/>
-            </w:r>
-          </w:p>
-        </w:tc>
-        <w:tc>
-          <w:tcPr>
-            <w:tcW w:type="dxa" w:w="1900"/>
-            <w:tcBorders>
-              <w:top w:val="single" w:color="B9C6E8" w:sz="6"/>
-              <w:left w:val="single" w:color="B9C6E8" w:sz="6"/>
-              <w:bottom w:val="single" w:color="B9C6E8" w:sz="6"/>
-              <w:right w:val="single" w:color="B9C6E8" w:sz="6"/>
-            </w:tcBorders>
-            <w:tcMar>
-              <w:top w:type="dxa" w:w="50"/>
-              <w:left w:type="dxa" w:w="80"/>
-              <w:bottom w:type="dxa" w:w="50"/>
-              <w:right w:type="dxa" w:w="100"/>
-            </w:tcMar>
-            <w:vAlign w:val="top"/>
-          </w:tcPr>
-          <w:p>
-            <w:pPr>
-              <w:spacing w:after="0" w:before="0"/>
-            </w:pPr>
-            <w:r>
-              <w:rPr>
-                <w:rFonts w:ascii="Calibri" w:cs="Calibri" w:eastAsia="Calibri" w:hAnsi="Calibri"/>
-                <w:b/>
-                <w:bCs/>
-                <w:color w:val="C0392B"/>
-                <w:sz w:val="19"/>
-                <w:szCs w:val="19"/>
-              </w:rPr>
-              <w:t xml:space="preserve">KA 1</w:t>
             </w:r>
           </w:p>
         </w:tc>
@@ -1331,7 +1331,7 @@
                 <w:sz w:val="19"/>
                 <w:szCs w:val="19"/>
               </w:rPr>
-              <w:t xml:space="preserve">Fr 16.10. · Rückgabe Mitarbeit (10′) · Eine Ballade gliedern (35′)</w:t>
+              <w:t xml:space="preserve">Fr 16.10. · Das „Ur-Ei“: episch, lyrisch, dramatisch</w:t>
             </w:r>
           </w:p>
         </w:tc>
@@ -1365,7 +1365,7 @@
                 <w:sz w:val="19"/>
                 <w:szCs w:val="19"/>
               </w:rPr>
-              <w:t xml:space="preserve">… eine Ballade in Abschnitte gliedern und Zwischenüberschriften formulieren.</w:t>
+              <w:t xml:space="preserve">… an einer Ballade erzählende, lyrische und dramatische Elemente nachweisen.</w:t>
             </w:r>
           </w:p>
         </w:tc>
@@ -1397,7 +1397,7 @@
                 <w:sz w:val="19"/>
                 <w:szCs w:val="19"/>
               </w:rPr>
-              <w:t xml:space="preserve">Bögen mit Einschätzung und Note der Lehrkraft zurück, kurze Einzelgespräche während der Arbeitsphase. Lesetraining: Tandemlesen. Dann in PA Abschnitte festlegen und Zwischenüberschriften notieren; Vergleich in der Kreide-Kette.</w:t>
+              <w:t xml:space="preserve">Merksatz Ballade (Goethe: „Ur-Ei“); an Paddy Fingal Belegstellen im Heft sammeln: Erzähler, Reim und Kehrreim, wörtliche Rede (Schaya, Schotte); Vergleich in PA.</w:t>
             </w:r>
           </w:p>
         </w:tc>
@@ -1429,7 +1429,7 @@
                 <w:sz w:val="17"/>
                 <w:szCs w:val="17"/>
               </w:rPr>
-              <w:t xml:space="preserve">2.8 D</w:t>
+              <w:t xml:space="preserve">2.9 D</w:t>
             </w:r>
           </w:p>
         </w:tc>
@@ -1637,7 +1637,7 @@
                 <w:sz w:val="19"/>
                 <w:szCs w:val="19"/>
               </w:rPr>
-              <w:t xml:space="preserve">Das „Ur-Ei“: episch, lyrisch, dramatisch</w:t>
+              <w:t xml:space="preserve">John Maynard hören und mitlesen</w:t>
             </w:r>
           </w:p>
         </w:tc>
@@ -1671,7 +1671,7 @@
                 <w:sz w:val="19"/>
                 <w:szCs w:val="19"/>
               </w:rPr>
-              <w:t xml:space="preserve">… an einer Ballade erzählende, lyrische und dramatische Elemente nachweisen.</w:t>
+              <w:t xml:space="preserve">… beim Zuhören Notizen machen und meinen Eindruck mit dem von Paddy Fingal vergleichen.</w:t>
             </w:r>
           </w:p>
         </w:tc>
@@ -1703,7 +1703,7 @@
                 <w:sz w:val="19"/>
                 <w:szCs w:val="19"/>
               </w:rPr>
-              <w:t xml:space="preserve">Einstieg nach den Ferien: Lesetechniken und Gliederung wiederholen. Merksatz Ballade (Goethe: „Ur-Ei“); Belegstellen in drei Farben markieren (allein), dann PA.</w:t>
+              <w:t xml:space="preserve">Einstieg nach den Ferien: Lesetechniken und Ur-Ei wiederholen. Hörfassung (z. B. Achim Reichel): Notizen im Heft (wer – wo – was – Ende), Schattenlesen mit dem Hörbuch, Nachlesen im Tandem; Vergleich: lustige und ernste Ballade.</w:t>
             </w:r>
           </w:p>
         </w:tc>
@@ -1735,7 +1735,7 @@
                 <w:sz w:val="17"/>
                 <w:szCs w:val="17"/>
               </w:rPr>
-              <w:t xml:space="preserve">2.9 D</w:t>
+              <w:t xml:space="preserve">2.3 D · 2.11 D</w:t>
             </w:r>
           </w:p>
         </w:tc>
@@ -1909,7 +1909,7 @@
                 <w:sz w:val="19"/>
                 <w:szCs w:val="19"/>
               </w:rPr>
-              <w:t xml:space="preserve">Merksatz Reimformen; Reimschema an Strophen bestimmen (Schnipsel); Speed-Duell zu Reimformen.</w:t>
+              <w:t xml:space="preserve">Merksatz Reimformen; Reimschema an Strophen im Lehrbuch bestimmen, im Heft notieren; Speed-Duell zu Reimformen.</w:t>
             </w:r>
           </w:p>
         </w:tc>

</xml_diff>